<commit_message>
word mejorado by maria
</commit_message>
<xml_diff>
--- a/recursos/words/semiPlantillaFinalInformeV2NUEVO.docx
+++ b/recursos/words/semiPlantillaFinalInformeV2NUEVO.docx
@@ -1,6 +1,6 @@
 
 <file path=word/document.xml><?xml version="1.0" encoding="utf-8"?>
-<w:document xmlns:wpc="http://schemas.microsoft.com/office/word/2010/wordprocessingCanvas" xmlns:cx="http://schemas.microsoft.com/office/drawing/2014/chartex" xmlns:cx1="http://schemas.microsoft.com/office/drawing/2015/9/8/chartex" xmlns:cx2="http://schemas.microsoft.com/office/drawing/2015/10/21/chartex" xmlns:cx3="http://schemas.microsoft.com/office/drawing/2016/5/9/chartex" xmlns:cx4="http://schemas.microsoft.com/office/drawing/2016/5/10/chartex" xmlns:cx5="http://schemas.microsoft.com/office/drawing/2016/5/11/chartex" xmlns:cx6="http://schemas.microsoft.com/office/drawing/2016/5/12/chartex" xmlns:cx7="http://schemas.microsoft.com/office/drawing/2016/5/13/chartex" xmlns:cx8="http://schemas.microsoft.com/office/drawing/2016/5/14/chartex" xmlns:mc="http://schemas.openxmlformats.org/markup-compatibility/2006" xmlns:aink="http://schemas.microsoft.com/office/drawing/2016/ink" xmlns:am3d="http://schemas.microsoft.com/office/drawing/2017/model3d" xmlns:o="urn:schemas-microsoft-com:office:office" xmlns:oel="http://schemas.microsoft.com/office/2019/extlst" xmlns:r="http://schemas.openxmlformats.org/officeDocument/2006/relationships" xmlns:m="http://schemas.openxmlformats.org/officeDocument/2006/math" xmlns:v="urn:schemas-microsoft-com:vml" xmlns:wp14="http://schemas.microsoft.com/office/word/2010/wordprocessingDrawing" xmlns:wp="http://schemas.openxmlformats.org/drawingml/2006/wordprocessingDrawing" xmlns:w10="urn:schemas-microsoft-com:office:word" xmlns:w="http://schemas.openxmlformats.org/wordprocessingml/2006/main" xmlns:w14="http://schemas.microsoft.com/office/word/2010/wordml" xmlns:w15="http://schemas.microsoft.com/office/word/2012/wordml" xmlns:w16cex="http://schemas.microsoft.com/office/word/2018/wordml/cex" xmlns:w16cid="http://schemas.microsoft.com/office/word/2016/wordml/cid" xmlns:w16="http://schemas.microsoft.com/office/word/2018/wordml" xmlns:w16sdtdh="http://schemas.microsoft.com/office/word/2020/wordml/sdtdatahash" xmlns:w16se="http://schemas.microsoft.com/office/word/2015/wordml/symex" xmlns:wpg="http://schemas.microsoft.com/office/word/2010/wordprocessingGroup" xmlns:wpi="http://schemas.microsoft.com/office/word/2010/wordprocessingInk" xmlns:wne="http://schemas.microsoft.com/office/word/2006/wordml" xmlns:wps="http://schemas.microsoft.com/office/word/2010/wordprocessingShape" mc:Ignorable="w14 w15 w16se w16cid w16 w16cex w16sdtdh wp14">
+<w:document xmlns:wpc="http://schemas.microsoft.com/office/word/2010/wordprocessingCanvas" xmlns:cx="http://schemas.microsoft.com/office/drawing/2014/chartex" xmlns:cx1="http://schemas.microsoft.com/office/drawing/2015/9/8/chartex" xmlns:cx2="http://schemas.microsoft.com/office/drawing/2015/10/21/chartex" xmlns:cx3="http://schemas.microsoft.com/office/drawing/2016/5/9/chartex" xmlns:cx4="http://schemas.microsoft.com/office/drawing/2016/5/10/chartex" xmlns:cx5="http://schemas.microsoft.com/office/drawing/2016/5/11/chartex" xmlns:cx6="http://schemas.microsoft.com/office/drawing/2016/5/12/chartex" xmlns:cx7="http://schemas.microsoft.com/office/drawing/2016/5/13/chartex" xmlns:cx8="http://schemas.microsoft.com/office/drawing/2016/5/14/chartex" xmlns:mc="http://schemas.openxmlformats.org/markup-compatibility/2006" xmlns:aink="http://schemas.microsoft.com/office/drawing/2016/ink" xmlns:am3d="http://schemas.microsoft.com/office/drawing/2017/model3d" xmlns:o="urn:schemas-microsoft-com:office:office" xmlns:oel="http://schemas.microsoft.com/office/2019/extlst" xmlns:r="http://schemas.openxmlformats.org/officeDocument/2006/relationships" xmlns:m="http://schemas.openxmlformats.org/officeDocument/2006/math" xmlns:v="urn:schemas-microsoft-com:vml" xmlns:wp14="http://schemas.microsoft.com/office/word/2010/wordprocessingDrawing" xmlns:wp="http://schemas.openxmlformats.org/drawingml/2006/wordprocessingDrawing" xmlns:w10="urn:schemas-microsoft-com:office:word" xmlns:w="http://schemas.openxmlformats.org/wordprocessingml/2006/main" xmlns:w14="http://schemas.microsoft.com/office/word/2010/wordml" xmlns:w15="http://schemas.microsoft.com/office/word/2012/wordml" xmlns:w16cex="http://schemas.microsoft.com/office/word/2018/wordml/cex" xmlns:w16cid="http://schemas.microsoft.com/office/word/2016/wordml/cid" xmlns:w16="http://schemas.microsoft.com/office/word/2018/wordml" xmlns:w16du="http://schemas.microsoft.com/office/word/2023/wordml/word16du" xmlns:w16sdtdh="http://schemas.microsoft.com/office/word/2020/wordml/sdtdatahash" xmlns:w16se="http://schemas.microsoft.com/office/word/2015/wordml/symex" xmlns:wpg="http://schemas.microsoft.com/office/word/2010/wordprocessingGroup" xmlns:wpi="http://schemas.microsoft.com/office/word/2010/wordprocessingInk" xmlns:wne="http://schemas.microsoft.com/office/word/2006/wordml" xmlns:wps="http://schemas.microsoft.com/office/word/2010/wordprocessingShape" mc:Ignorable="w14 w15 w16se w16cid w16 w16cex w16sdtdh w16du wp14">
   <w:body>
     <w:p>
       <w:pPr>
@@ -587,7 +587,25 @@
           <w:szCs w:val="22"/>
           <w:shd w:val="clear" w:color="auto" w:fill="FAF9F8"/>
         </w:rPr>
-        <w:t>n°</w:t>
+        <w:t>n</w:t>
+      </w:r>
+      <w:r>
+        <w:rPr>
+          <w:rFonts w:ascii="Arial" w:hAnsi="Arial" w:cs="Arial"/>
+          <w:sz w:val="22"/>
+          <w:szCs w:val="22"/>
+          <w:shd w:val="clear" w:color="auto" w:fill="FAF9F8"/>
+        </w:rPr>
+        <w:t>.</w:t>
+      </w:r>
+      <w:r>
+        <w:rPr>
+          <w:rFonts w:ascii="Arial" w:hAnsi="Arial" w:cs="Arial"/>
+          <w:sz w:val="22"/>
+          <w:szCs w:val="22"/>
+          <w:shd w:val="clear" w:color="auto" w:fill="FAF9F8"/>
+        </w:rPr>
+        <w:t>°</w:t>
       </w:r>
       <w:r>
         <w:rPr>
@@ -634,7 +652,25 @@
           <w:szCs w:val="22"/>
           <w:shd w:val="clear" w:color="auto" w:fill="FAF9F8"/>
         </w:rPr>
-        <w:t>n°</w:t>
+        <w:t>n</w:t>
+      </w:r>
+      <w:r>
+        <w:rPr>
+          <w:rFonts w:ascii="Arial" w:hAnsi="Arial" w:cs="Arial"/>
+          <w:sz w:val="22"/>
+          <w:szCs w:val="22"/>
+          <w:shd w:val="clear" w:color="auto" w:fill="FAF9F8"/>
+        </w:rPr>
+        <w:t>.</w:t>
+      </w:r>
+      <w:r>
+        <w:rPr>
+          <w:rFonts w:ascii="Arial" w:hAnsi="Arial" w:cs="Arial"/>
+          <w:sz w:val="22"/>
+          <w:szCs w:val="22"/>
+          <w:shd w:val="clear" w:color="auto" w:fill="FAF9F8"/>
+        </w:rPr>
+        <w:t>°</w:t>
       </w:r>
       <w:r>
         <w:rPr>
@@ -735,7 +771,25 @@
           <w:szCs w:val="22"/>
           <w:shd w:val="clear" w:color="auto" w:fill="FAF9F8"/>
         </w:rPr>
-        <w:t>n°</w:t>
+        <w:t>n</w:t>
+      </w:r>
+      <w:r>
+        <w:rPr>
+          <w:rFonts w:ascii="Arial" w:hAnsi="Arial" w:cs="Arial"/>
+          <w:sz w:val="22"/>
+          <w:szCs w:val="22"/>
+          <w:shd w:val="clear" w:color="auto" w:fill="FAF9F8"/>
+        </w:rPr>
+        <w:t>.</w:t>
+      </w:r>
+      <w:r>
+        <w:rPr>
+          <w:rFonts w:ascii="Arial" w:hAnsi="Arial" w:cs="Arial"/>
+          <w:sz w:val="22"/>
+          <w:szCs w:val="22"/>
+          <w:shd w:val="clear" w:color="auto" w:fill="FAF9F8"/>
+        </w:rPr>
+        <w:t>°</w:t>
       </w:r>
       <w:r>
         <w:rPr>
@@ -782,7 +836,25 @@
           <w:szCs w:val="22"/>
           <w:shd w:val="clear" w:color="auto" w:fill="FAF9F8"/>
         </w:rPr>
-        <w:t>n°</w:t>
+        <w:t>n</w:t>
+      </w:r>
+      <w:r>
+        <w:rPr>
+          <w:rFonts w:ascii="Arial" w:hAnsi="Arial" w:cs="Arial"/>
+          <w:sz w:val="22"/>
+          <w:szCs w:val="22"/>
+          <w:shd w:val="clear" w:color="auto" w:fill="FAF9F8"/>
+        </w:rPr>
+        <w:t>.</w:t>
+      </w:r>
+      <w:r>
+        <w:rPr>
+          <w:rFonts w:ascii="Arial" w:hAnsi="Arial" w:cs="Arial"/>
+          <w:sz w:val="22"/>
+          <w:szCs w:val="22"/>
+          <w:shd w:val="clear" w:color="auto" w:fill="FAF9F8"/>
+        </w:rPr>
+        <w:t>°</w:t>
       </w:r>
       <w:r>
         <w:rPr>
@@ -829,7 +901,25 @@
           <w:szCs w:val="22"/>
           <w:shd w:val="clear" w:color="auto" w:fill="FAF9F8"/>
         </w:rPr>
-        <w:t>n°</w:t>
+        <w:t>n</w:t>
+      </w:r>
+      <w:r>
+        <w:rPr>
+          <w:rFonts w:ascii="Arial" w:hAnsi="Arial" w:cs="Arial"/>
+          <w:sz w:val="22"/>
+          <w:szCs w:val="22"/>
+          <w:shd w:val="clear" w:color="auto" w:fill="FAF9F8"/>
+        </w:rPr>
+        <w:t>.</w:t>
+      </w:r>
+      <w:r>
+        <w:rPr>
+          <w:rFonts w:ascii="Arial" w:hAnsi="Arial" w:cs="Arial"/>
+          <w:sz w:val="22"/>
+          <w:szCs w:val="22"/>
+          <w:shd w:val="clear" w:color="auto" w:fill="FAF9F8"/>
+        </w:rPr>
+        <w:t>°</w:t>
       </w:r>
       <w:r>
         <w:rPr>
@@ -847,7 +937,25 @@
           <w:szCs w:val="22"/>
           <w:shd w:val="clear" w:color="auto" w:fill="FAF9F8"/>
         </w:rPr>
-        <w:t>n°</w:t>
+        <w:t>n</w:t>
+      </w:r>
+      <w:r>
+        <w:rPr>
+          <w:rFonts w:ascii="Arial" w:hAnsi="Arial" w:cs="Arial"/>
+          <w:sz w:val="22"/>
+          <w:szCs w:val="22"/>
+          <w:shd w:val="clear" w:color="auto" w:fill="FAF9F8"/>
+        </w:rPr>
+        <w:t>.</w:t>
+      </w:r>
+      <w:r>
+        <w:rPr>
+          <w:rFonts w:ascii="Arial" w:hAnsi="Arial" w:cs="Arial"/>
+          <w:sz w:val="22"/>
+          <w:szCs w:val="22"/>
+          <w:shd w:val="clear" w:color="auto" w:fill="FAF9F8"/>
+        </w:rPr>
+        <w:t>°</w:t>
       </w:r>
       <w:r>
         <w:rPr>
@@ -975,7 +1083,25 @@
           <w:szCs w:val="22"/>
           <w:shd w:val="clear" w:color="auto" w:fill="FAF9F8"/>
         </w:rPr>
-        <w:t>n°</w:t>
+        <w:t>n</w:t>
+      </w:r>
+      <w:r>
+        <w:rPr>
+          <w:rFonts w:ascii="Arial" w:hAnsi="Arial" w:cs="Arial"/>
+          <w:sz w:val="22"/>
+          <w:szCs w:val="22"/>
+          <w:shd w:val="clear" w:color="auto" w:fill="FAF9F8"/>
+        </w:rPr>
+        <w:t>.</w:t>
+      </w:r>
+      <w:r>
+        <w:rPr>
+          <w:rFonts w:ascii="Arial" w:hAnsi="Arial" w:cs="Arial"/>
+          <w:sz w:val="22"/>
+          <w:szCs w:val="22"/>
+          <w:shd w:val="clear" w:color="auto" w:fill="FAF9F8"/>
+        </w:rPr>
+        <w:t>°</w:t>
       </w:r>
       <w:r>
         <w:rPr>
@@ -1022,7 +1148,25 @@
           <w:szCs w:val="22"/>
           <w:shd w:val="clear" w:color="auto" w:fill="FAF9F8"/>
         </w:rPr>
-        <w:t>n°</w:t>
+        <w:t>n</w:t>
+      </w:r>
+      <w:r>
+        <w:rPr>
+          <w:rFonts w:ascii="Arial" w:hAnsi="Arial" w:cs="Arial"/>
+          <w:sz w:val="22"/>
+          <w:szCs w:val="22"/>
+          <w:shd w:val="clear" w:color="auto" w:fill="FAF9F8"/>
+        </w:rPr>
+        <w:t>.</w:t>
+      </w:r>
+      <w:r>
+        <w:rPr>
+          <w:rFonts w:ascii="Arial" w:hAnsi="Arial" w:cs="Arial"/>
+          <w:sz w:val="22"/>
+          <w:szCs w:val="22"/>
+          <w:shd w:val="clear" w:color="auto" w:fill="FAF9F8"/>
+        </w:rPr>
+        <w:t>°</w:t>
       </w:r>
       <w:r>
         <w:rPr>
@@ -1114,7 +1258,25 @@
           <w:szCs w:val="22"/>
           <w:shd w:val="clear" w:color="auto" w:fill="FAF9F8"/>
         </w:rPr>
-        <w:t>n°</w:t>
+        <w:t>n</w:t>
+      </w:r>
+      <w:r>
+        <w:rPr>
+          <w:rFonts w:ascii="Arial" w:hAnsi="Arial" w:cs="Arial"/>
+          <w:sz w:val="22"/>
+          <w:szCs w:val="22"/>
+          <w:shd w:val="clear" w:color="auto" w:fill="FAF9F8"/>
+        </w:rPr>
+        <w:t>.</w:t>
+      </w:r>
+      <w:r>
+        <w:rPr>
+          <w:rFonts w:ascii="Arial" w:hAnsi="Arial" w:cs="Arial"/>
+          <w:sz w:val="22"/>
+          <w:szCs w:val="22"/>
+          <w:shd w:val="clear" w:color="auto" w:fill="FAF9F8"/>
+        </w:rPr>
+        <w:t>°</w:t>
       </w:r>
       <w:r>
         <w:rPr>
@@ -1256,7 +1418,25 @@
           <w:szCs w:val="22"/>
           <w:shd w:val="clear" w:color="auto" w:fill="FAF9F8"/>
         </w:rPr>
-        <w:t>n°</w:t>
+        <w:t>n</w:t>
+      </w:r>
+      <w:r>
+        <w:rPr>
+          <w:rFonts w:ascii="Arial" w:hAnsi="Arial" w:cs="Arial"/>
+          <w:sz w:val="22"/>
+          <w:szCs w:val="22"/>
+          <w:shd w:val="clear" w:color="auto" w:fill="FAF9F8"/>
+        </w:rPr>
+        <w:t>.</w:t>
+      </w:r>
+      <w:r>
+        <w:rPr>
+          <w:rFonts w:ascii="Arial" w:hAnsi="Arial" w:cs="Arial"/>
+          <w:sz w:val="22"/>
+          <w:szCs w:val="22"/>
+          <w:shd w:val="clear" w:color="auto" w:fill="FAF9F8"/>
+        </w:rPr>
+        <w:t>°</w:t>
       </w:r>
       <w:r>
         <w:rPr>
@@ -1303,7 +1483,25 @@
           <w:szCs w:val="22"/>
           <w:shd w:val="clear" w:color="auto" w:fill="FAF9F8"/>
         </w:rPr>
-        <w:t>n°</w:t>
+        <w:t>n</w:t>
+      </w:r>
+      <w:r>
+        <w:rPr>
+          <w:rFonts w:ascii="Arial" w:hAnsi="Arial" w:cs="Arial"/>
+          <w:sz w:val="22"/>
+          <w:szCs w:val="22"/>
+          <w:shd w:val="clear" w:color="auto" w:fill="FAF9F8"/>
+        </w:rPr>
+        <w:t>.</w:t>
+      </w:r>
+      <w:r>
+        <w:rPr>
+          <w:rFonts w:ascii="Arial" w:hAnsi="Arial" w:cs="Arial"/>
+          <w:sz w:val="22"/>
+          <w:szCs w:val="22"/>
+          <w:shd w:val="clear" w:color="auto" w:fill="FAF9F8"/>
+        </w:rPr>
+        <w:t>°</w:t>
       </w:r>
       <w:r>
         <w:rPr>
@@ -1321,7 +1519,25 @@
           <w:szCs w:val="22"/>
           <w:shd w:val="clear" w:color="auto" w:fill="FAF9F8"/>
         </w:rPr>
-        <w:t>n°</w:t>
+        <w:t>n</w:t>
+      </w:r>
+      <w:r>
+        <w:rPr>
+          <w:rFonts w:ascii="Arial" w:hAnsi="Arial" w:cs="Arial"/>
+          <w:sz w:val="22"/>
+          <w:szCs w:val="22"/>
+          <w:shd w:val="clear" w:color="auto" w:fill="FAF9F8"/>
+        </w:rPr>
+        <w:t>.</w:t>
+      </w:r>
+      <w:r>
+        <w:rPr>
+          <w:rFonts w:ascii="Arial" w:hAnsi="Arial" w:cs="Arial"/>
+          <w:sz w:val="22"/>
+          <w:szCs w:val="22"/>
+          <w:shd w:val="clear" w:color="auto" w:fill="FAF9F8"/>
+        </w:rPr>
+        <w:t>°</w:t>
       </w:r>
       <w:r>
         <w:rPr>
@@ -1368,7 +1584,25 @@
           <w:szCs w:val="22"/>
           <w:shd w:val="clear" w:color="auto" w:fill="FAF9F8"/>
         </w:rPr>
-        <w:t>n°</w:t>
+        <w:t>n</w:t>
+      </w:r>
+      <w:r>
+        <w:rPr>
+          <w:rFonts w:ascii="Arial" w:hAnsi="Arial" w:cs="Arial"/>
+          <w:sz w:val="22"/>
+          <w:szCs w:val="22"/>
+          <w:shd w:val="clear" w:color="auto" w:fill="FAF9F8"/>
+        </w:rPr>
+        <w:t>.</w:t>
+      </w:r>
+      <w:r>
+        <w:rPr>
+          <w:rFonts w:ascii="Arial" w:hAnsi="Arial" w:cs="Arial"/>
+          <w:sz w:val="22"/>
+          <w:szCs w:val="22"/>
+          <w:shd w:val="clear" w:color="auto" w:fill="FAF9F8"/>
+        </w:rPr>
+        <w:t>°</w:t>
       </w:r>
       <w:r>
         <w:rPr>
@@ -1498,7 +1732,25 @@
           <w:szCs w:val="22"/>
           <w:shd w:val="clear" w:color="auto" w:fill="FAF9F8"/>
         </w:rPr>
-        <w:t>n°</w:t>
+        <w:t>n</w:t>
+      </w:r>
+      <w:r>
+        <w:rPr>
+          <w:rFonts w:ascii="Arial" w:hAnsi="Arial" w:cs="Arial"/>
+          <w:sz w:val="22"/>
+          <w:szCs w:val="22"/>
+          <w:shd w:val="clear" w:color="auto" w:fill="FAF9F8"/>
+        </w:rPr>
+        <w:t>.</w:t>
+      </w:r>
+      <w:r>
+        <w:rPr>
+          <w:rFonts w:ascii="Arial" w:hAnsi="Arial" w:cs="Arial"/>
+          <w:sz w:val="22"/>
+          <w:szCs w:val="22"/>
+          <w:shd w:val="clear" w:color="auto" w:fill="FAF9F8"/>
+        </w:rPr>
+        <w:t>°</w:t>
       </w:r>
       <w:r>
         <w:rPr>
@@ -1693,7 +1945,25 @@
           <w:szCs w:val="22"/>
           <w:shd w:val="clear" w:color="auto" w:fill="FAF9F8"/>
         </w:rPr>
-        <w:t>n°</w:t>
+        <w:t>n</w:t>
+      </w:r>
+      <w:r>
+        <w:rPr>
+          <w:rFonts w:ascii="Arial" w:hAnsi="Arial" w:cs="Arial"/>
+          <w:sz w:val="22"/>
+          <w:szCs w:val="22"/>
+          <w:shd w:val="clear" w:color="auto" w:fill="FAF9F8"/>
+        </w:rPr>
+        <w:t>.</w:t>
+      </w:r>
+      <w:r>
+        <w:rPr>
+          <w:rFonts w:ascii="Arial" w:hAnsi="Arial" w:cs="Arial"/>
+          <w:sz w:val="22"/>
+          <w:szCs w:val="22"/>
+          <w:shd w:val="clear" w:color="auto" w:fill="FAF9F8"/>
+        </w:rPr>
+        <w:t>°</w:t>
       </w:r>
       <w:r>
         <w:rPr>
@@ -1740,7 +2010,25 @@
           <w:szCs w:val="22"/>
           <w:shd w:val="clear" w:color="auto" w:fill="FAF9F8"/>
         </w:rPr>
-        <w:t>n°</w:t>
+        <w:t>n</w:t>
+      </w:r>
+      <w:r>
+        <w:rPr>
+          <w:rFonts w:ascii="Arial" w:hAnsi="Arial" w:cs="Arial"/>
+          <w:sz w:val="22"/>
+          <w:szCs w:val="22"/>
+          <w:shd w:val="clear" w:color="auto" w:fill="FAF9F8"/>
+        </w:rPr>
+        <w:t>.</w:t>
+      </w:r>
+      <w:r>
+        <w:rPr>
+          <w:rFonts w:ascii="Arial" w:hAnsi="Arial" w:cs="Arial"/>
+          <w:sz w:val="22"/>
+          <w:szCs w:val="22"/>
+          <w:shd w:val="clear" w:color="auto" w:fill="FAF9F8"/>
+        </w:rPr>
+        <w:t>°</w:t>
       </w:r>
       <w:r>
         <w:rPr>
@@ -2503,7 +2791,23 @@
           <w:sz w:val="22"/>
           <w:szCs w:val="22"/>
         </w:rPr>
-        <w:t xml:space="preserve">.º27037” el importe de S/ </w:t>
+        <w:t>.º</w:t>
+      </w:r>
+      <w:r>
+        <w:rPr>
+          <w:rFonts w:ascii="Arial" w:hAnsi="Arial" w:cs="Arial"/>
+          <w:sz w:val="22"/>
+          <w:szCs w:val="22"/>
+        </w:rPr>
+        <w:t xml:space="preserve"> </w:t>
+      </w:r>
+      <w:r>
+        <w:rPr>
+          <w:rFonts w:ascii="Arial" w:hAnsi="Arial" w:cs="Arial"/>
+          <w:sz w:val="22"/>
+          <w:szCs w:val="22"/>
+        </w:rPr>
+        <w:t xml:space="preserve">27037” el importe de S/ </w:t>
       </w:r>
       <w:r>
         <w:rPr>
@@ -2535,7 +2839,23 @@
           <w:sz w:val="22"/>
           <w:szCs w:val="22"/>
         </w:rPr>
-        <w:t>.º245-99-EF/15</w:t>
+        <w:t>.º</w:t>
+      </w:r>
+      <w:r>
+        <w:rPr>
+          <w:rFonts w:ascii="Arial" w:hAnsi="Arial" w:cs="Arial"/>
+          <w:sz w:val="22"/>
+          <w:szCs w:val="22"/>
+        </w:rPr>
+        <w:t xml:space="preserve"> </w:t>
+      </w:r>
+      <w:r>
+        <w:rPr>
+          <w:rFonts w:ascii="Arial" w:hAnsi="Arial" w:cs="Arial"/>
+          <w:sz w:val="22"/>
+          <w:szCs w:val="22"/>
+        </w:rPr>
+        <w:t>245-99-EF/15</w:t>
       </w:r>
       <w:r>
         <w:rPr>
@@ -2858,7 +3178,23 @@
           <w:sz w:val="22"/>
           <w:szCs w:val="22"/>
         </w:rPr>
-        <w:t>.º245-99-EF/15;</w:t>
+        <w:t>.º</w:t>
+      </w:r>
+      <w:r>
+        <w:rPr>
+          <w:rFonts w:ascii="Arial" w:hAnsi="Arial" w:cs="Arial"/>
+          <w:sz w:val="22"/>
+          <w:szCs w:val="22"/>
+        </w:rPr>
+        <w:t xml:space="preserve"> </w:t>
+      </w:r>
+      <w:r>
+        <w:rPr>
+          <w:rFonts w:ascii="Arial" w:hAnsi="Arial" w:cs="Arial"/>
+          <w:sz w:val="22"/>
+          <w:szCs w:val="22"/>
+        </w:rPr>
+        <w:t>245-99-EF/15;</w:t>
       </w:r>
     </w:p>
     <w:p>
@@ -3013,7 +3349,23 @@
           <w:sz w:val="22"/>
           <w:szCs w:val="22"/>
         </w:rPr>
-        <w:t>, correspondientes a la importación señalada en el considerando anterior, siendo abonados a la “Sub-Cuenta Especial Tesoro Público – D.S. n.º 015-94-EF” el importe de S/ {textoTotReguPECO} en cumplimiento de la Resolución Ministerial n.º107-94-EF/10.</w:t>
+        <w:t>, correspondientes a la importación señalada en el considerando anterior, siendo abonados a la “Sub-Cuenta Especial Tesoro Público – D.S. n.º 015-94-EF” el importe de S/ {textoTotReguPECO} en cumplimiento de la Resolución Ministerial n.º</w:t>
+      </w:r>
+      <w:r>
+        <w:rPr>
+          <w:rFonts w:ascii="Arial" w:hAnsi="Arial" w:cs="Arial"/>
+          <w:sz w:val="22"/>
+          <w:szCs w:val="22"/>
+        </w:rPr>
+        <w:t xml:space="preserve"> </w:t>
+      </w:r>
+      <w:r>
+        <w:rPr>
+          <w:rFonts w:ascii="Arial" w:hAnsi="Arial" w:cs="Arial"/>
+          <w:sz w:val="22"/>
+          <w:szCs w:val="22"/>
+        </w:rPr>
+        <w:t>107-94-EF/10.</w:t>
       </w:r>
     </w:p>
     <w:p>
@@ -3695,7 +4047,25 @@
           <w:sz w:val="22"/>
           <w:szCs w:val="22"/>
         </w:rPr>
-        <w:t xml:space="preserve">Supremo n.º015-94-EF, en el artículo 1° dispone lo siguiente: “El pago de los impuestos que se haya efectuado en la importación de mercancías cuyo destino final sea la zona de selva comprendida en el Convenio de Cooperación Aduanera Peruano - Colombiano, será considerado como un pago a cuenta sujeto a </w:t>
+        <w:t>Supremo n.º</w:t>
+      </w:r>
+      <w:r>
+        <w:rPr>
+          <w:rFonts w:ascii="Arial" w:hAnsi="Arial" w:cs="Arial"/>
+          <w:color w:val="000000" w:themeColor="text1"/>
+          <w:sz w:val="22"/>
+          <w:szCs w:val="22"/>
+        </w:rPr>
+        <w:t xml:space="preserve"> </w:t>
+      </w:r>
+      <w:r>
+        <w:rPr>
+          <w:rFonts w:ascii="Arial" w:hAnsi="Arial" w:cs="Arial"/>
+          <w:color w:val="000000" w:themeColor="text1"/>
+          <w:sz w:val="22"/>
+          <w:szCs w:val="22"/>
+        </w:rPr>
+        <w:t xml:space="preserve">015-94-EF, en el artículo 1° dispone lo siguiente: “El pago de los impuestos que se haya efectuado en la importación de mercancías cuyo destino final sea la zona de selva comprendida en el Convenio de Cooperación Aduanera Peruano - Colombiano, será considerado como un pago a cuenta sujeto a </w:t>
       </w:r>
       <w:r>
         <w:rPr>
@@ -3813,7 +4183,7 @@
           <w:sz w:val="22"/>
           <w:szCs w:val="22"/>
         </w:rPr>
-        <w:t xml:space="preserve">Respecto a la Regularización/ Reconocimiento Físico al amparo de las exoneraciones establecidas mediante Decreto Supremo nº 015-94-EF se verifica que la mercancía de las series {fromDam-rangoSeriesAcogidaSoloPeco} declaradas con TPI 35 en el casillero 7.23 de la DAM, tienen un Ad-valoren de 0%, por lo que no se reporta montó abonado a la Subcuenta Especial del Tesoro Público Decreto Supremo </w:t>
+        <w:t>Respecto a la Regularización/ Reconocimiento Físico al amparo de las exoneraciones establecidas mediante Decreto Supremo n</w:t>
       </w:r>
       <w:r>
         <w:rPr>
@@ -3822,7 +4192,43 @@
           <w:sz w:val="22"/>
           <w:szCs w:val="22"/>
         </w:rPr>
-        <w:t>n°</w:t>
+        <w:t>.</w:t>
+      </w:r>
+      <w:r>
+        <w:rPr>
+          <w:rFonts w:ascii="Arial" w:hAnsi="Arial" w:cs="Arial"/>
+          <w:color w:val="000000" w:themeColor="text1"/>
+          <w:sz w:val="22"/>
+          <w:szCs w:val="22"/>
+        </w:rPr>
+        <w:t xml:space="preserve">º 015-94-EF se verifica que la mercancía de las series {fromDam-rangoSeriesAcogidaSoloPeco} declaradas con TPI 35 en el casillero 7.23 de la DAM, tienen un Ad-valoren de 0%, por lo que no se reporta montó abonado a la Subcuenta Especial del Tesoro Público Decreto Supremo </w:t>
+      </w:r>
+      <w:r>
+        <w:rPr>
+          <w:rFonts w:ascii="Arial" w:hAnsi="Arial" w:cs="Arial"/>
+          <w:color w:val="000000" w:themeColor="text1"/>
+          <w:sz w:val="22"/>
+          <w:szCs w:val="22"/>
+        </w:rPr>
+        <w:t>n</w:t>
+      </w:r>
+      <w:r>
+        <w:rPr>
+          <w:rFonts w:ascii="Arial" w:hAnsi="Arial" w:cs="Arial"/>
+          <w:color w:val="000000" w:themeColor="text1"/>
+          <w:sz w:val="22"/>
+          <w:szCs w:val="22"/>
+        </w:rPr>
+        <w:t>.</w:t>
+      </w:r>
+      <w:r>
+        <w:rPr>
+          <w:rFonts w:ascii="Arial" w:hAnsi="Arial" w:cs="Arial"/>
+          <w:color w:val="000000" w:themeColor="text1"/>
+          <w:sz w:val="22"/>
+          <w:szCs w:val="22"/>
+        </w:rPr>
+        <w:t>°</w:t>
       </w:r>
       <w:r>
         <w:rPr>
@@ -4448,7 +4854,25 @@
           <w:sz w:val="22"/>
           <w:szCs w:val="22"/>
         </w:rPr>
-        <w:t>en virtud de las solicitudes de regularización y confirmación de llegada de mercancías anteriormente indicadas, declara que cumple con los requisitos dispuestos en el artículo 2° del Decreto Supremo n.º103-99-EF – “Reglamento de las Disposiciones Tributarias contenidas en la Ley de Promoción de la Inversión en la Amazonía", tal como se puede evidenciar de la información contenida en el Informe n.º</w:t>
+        <w:t>en virtud de las solicitudes de regularización y confirmación de llegada de mercancías anteriormente indicadas, declara que cumple con los requisitos dispuestos en el artículo 2° del Decreto Supremo n.º</w:t>
+      </w:r>
+      <w:r>
+        <w:rPr>
+          <w:rFonts w:ascii="Arial" w:hAnsi="Arial" w:cs="Arial"/>
+          <w:color w:val="000000" w:themeColor="text1"/>
+          <w:sz w:val="22"/>
+          <w:szCs w:val="22"/>
+        </w:rPr>
+        <w:t xml:space="preserve"> </w:t>
+      </w:r>
+      <w:r>
+        <w:rPr>
+          <w:rFonts w:ascii="Arial" w:hAnsi="Arial" w:cs="Arial"/>
+          <w:color w:val="000000" w:themeColor="text1"/>
+          <w:sz w:val="22"/>
+          <w:szCs w:val="22"/>
+        </w:rPr>
+        <w:t>103-99-EF – “Reglamento de las Disposiciones Tributarias contenidas en la Ley de Promoción de la Inversión en la Amazonía", tal como se puede evidenciar de la información contenida en el Informe n.º</w:t>
       </w:r>
       <w:r>
         <w:rPr>
@@ -5503,7 +5927,25 @@
                 <w:bCs/>
                 <w:color w:val="000000"/>
               </w:rPr>
-              <w:t xml:space="preserve">Empresa de Transportes </w:t>
+              <w:t xml:space="preserve">Empresa de </w:t>
+            </w:r>
+            <w:r>
+              <w:rPr>
+                <w:rFonts w:ascii="Arial" w:eastAsia="Arial" w:hAnsi="Arial" w:cs="Arial"/>
+                <w:b/>
+                <w:bCs/>
+                <w:color w:val="000000"/>
+              </w:rPr>
+              <w:t>t</w:t>
+            </w:r>
+            <w:r>
+              <w:rPr>
+                <w:rFonts w:ascii="Arial" w:eastAsia="Arial" w:hAnsi="Arial" w:cs="Arial"/>
+                <w:b/>
+                <w:bCs/>
+                <w:color w:val="000000"/>
+              </w:rPr>
+              <w:t xml:space="preserve">ransportes </w:t>
             </w:r>
           </w:p>
         </w:tc>
@@ -5689,7 +6131,27 @@
           <w:szCs w:val="20"/>
           <w:lang w:val="es-ES" w:eastAsia="es-ES"/>
         </w:rPr>
-        <w:t>Liquidación de Tributos a devolver:</w:t>
+        <w:t xml:space="preserve">Liquidación de </w:t>
+      </w:r>
+      <w:r>
+        <w:rPr>
+          <w:rFonts w:ascii="Arial" w:eastAsia="Times New Roman" w:hAnsi="Arial" w:cs="Arial"/>
+          <w:b/>
+          <w:sz w:val="20"/>
+          <w:szCs w:val="20"/>
+          <w:lang w:val="es-ES" w:eastAsia="es-ES"/>
+        </w:rPr>
+        <w:t>t</w:t>
+      </w:r>
+      <w:r>
+        <w:rPr>
+          <w:rFonts w:ascii="Arial" w:eastAsia="Times New Roman" w:hAnsi="Arial" w:cs="Arial"/>
+          <w:b/>
+          <w:sz w:val="20"/>
+          <w:szCs w:val="20"/>
+          <w:lang w:val="es-ES" w:eastAsia="es-ES"/>
+        </w:rPr>
+        <w:t>ributos a devolver:</w:t>
       </w:r>
     </w:p>
     <w:p>
@@ -5753,7 +6215,39 @@
           <w:sz w:val="20"/>
           <w:szCs w:val="20"/>
         </w:rPr>
-        <w:t>Se verificó que la mercancía declarada en la DAM y presentada a regularización, se encuentra negociada en el Arancel Común Anexo al Protocolo Modificatorio del Convenio de Cooperación Aduanero Peruano Colombiano con una tasa Libre, por tanto, corresponde su acogimiento a las exoneraciones tributarias previstas en la Tercera Disposición Complementaria de la Ley n. º27037, conforme a lo siguiente:</w:t>
+        <w:t xml:space="preserve">Se verificó que la mercancía declarada en la DAM y presentada a regularización, se encuentra negociada en el Arancel Común Anexo al Protocolo Modificatorio del Convenio de Cooperación Aduanero Peruano Colombiano con una tasa </w:t>
+      </w:r>
+      <w:r>
+        <w:rPr>
+          <w:rFonts w:ascii="Arial" w:hAnsi="Arial" w:cs="Arial"/>
+          <w:sz w:val="20"/>
+          <w:szCs w:val="20"/>
+        </w:rPr>
+        <w:t>l</w:t>
+      </w:r>
+      <w:r>
+        <w:rPr>
+          <w:rFonts w:ascii="Arial" w:hAnsi="Arial" w:cs="Arial"/>
+          <w:sz w:val="20"/>
+          <w:szCs w:val="20"/>
+        </w:rPr>
+        <w:t>ibre, por tanto, corresponde su acogimiento a las exoneraciones tributarias previstas en la Tercera Disposición Complementaria de la Ley n.º</w:t>
+      </w:r>
+      <w:r>
+        <w:rPr>
+          <w:rFonts w:ascii="Arial" w:hAnsi="Arial" w:cs="Arial"/>
+          <w:sz w:val="20"/>
+          <w:szCs w:val="20"/>
+        </w:rPr>
+        <w:t xml:space="preserve"> </w:t>
+      </w:r>
+      <w:r>
+        <w:rPr>
+          <w:rFonts w:ascii="Arial" w:hAnsi="Arial" w:cs="Arial"/>
+          <w:sz w:val="20"/>
+          <w:szCs w:val="20"/>
+        </w:rPr>
+        <w:t>27037, conforme a lo siguiente:</w:t>
       </w:r>
     </w:p>
     <w:p>
@@ -5845,7 +6339,27 @@
           <w:szCs w:val="20"/>
           <w:lang w:val="es-ES" w:eastAsia="es-ES"/>
         </w:rPr>
-        <w:t>Se verificó que lo solicitado a regularización se encuentra negociado en el Arancel Común Anexo al Protocolo Modificatorio del Convenio de Cooperación Aduanero Peruano Colombiano con una tasa Ad/Valorem – Libre:</w:t>
+        <w:t xml:space="preserve">Se verificó que lo solicitado a regularización se encuentra negociado en el Arancel Común Anexo al Protocolo Modificatorio del Convenio de Cooperación Aduanero Peruano Colombiano con una tasa Ad/Valorem – </w:t>
+      </w:r>
+      <w:r>
+        <w:rPr>
+          <w:rFonts w:ascii="Arial" w:eastAsia="Times New Roman" w:hAnsi="Arial" w:cs="Arial"/>
+          <w:color w:val="000000"/>
+          <w:sz w:val="20"/>
+          <w:szCs w:val="20"/>
+          <w:lang w:val="es-ES" w:eastAsia="es-ES"/>
+        </w:rPr>
+        <w:t>l</w:t>
+      </w:r>
+      <w:r>
+        <w:rPr>
+          <w:rFonts w:ascii="Arial" w:eastAsia="Times New Roman" w:hAnsi="Arial" w:cs="Arial"/>
+          <w:color w:val="000000"/>
+          <w:sz w:val="20"/>
+          <w:szCs w:val="20"/>
+          <w:lang w:val="es-ES" w:eastAsia="es-ES"/>
+        </w:rPr>
+        <w:t>ibre:</w:t>
       </w:r>
     </w:p>
     <w:p>
@@ -6234,7 +6748,27 @@
                 <w:sz w:val="22"/>
                 <w:szCs w:val="22"/>
               </w:rPr>
-              <w:t>.º27037</w:t>
+              <w:t>.º</w:t>
+            </w:r>
+            <w:r>
+              <w:rPr>
+                <w:rFonts w:ascii="Arial" w:hAnsi="Arial" w:cs="Arial"/>
+                <w:b/>
+                <w:bCs/>
+                <w:sz w:val="22"/>
+                <w:szCs w:val="22"/>
+              </w:rPr>
+              <w:t xml:space="preserve"> </w:t>
+            </w:r>
+            <w:r>
+              <w:rPr>
+                <w:rFonts w:ascii="Arial" w:hAnsi="Arial" w:cs="Arial"/>
+                <w:b/>
+                <w:bCs/>
+                <w:sz w:val="22"/>
+                <w:szCs w:val="22"/>
+              </w:rPr>
+              <w:t>27037</w:t>
             </w:r>
           </w:p>
         </w:tc>
@@ -8658,7 +9192,63 @@
           <w:rFonts w:ascii="Arial" w:hAnsi="Arial" w:cs="Arial"/>
           <w:color w:val="000000" w:themeColor="text1"/>
         </w:rPr>
-        <w:t>, se establece que la mercancía materia de regularización ha sido objeto de reconocimiento físico dentro del plazo previsto en el artículo 2º de la Resolución Ministerial n.º107-94-EF/10; por lo tanto, corresponde atender las series de la referida DAM solicitadas a regularización toda vez que se  encuentran  negociadas  en  el  Arancel  Común  del Convenio Peruano - Colombiano con una tasa Ad/Valorem – Libre; determinándose que el monto a regularizar en el marco de la Ley N.º27037 es de S/ {textoTotRegu27}.</w:t>
+        <w:t>, se establece que la mercancía materia de regularización ha sido objeto de reconocimiento físico dentro del plazo previsto en el artículo 2º de la Resolución Ministerial n.º</w:t>
+      </w:r>
+      <w:r>
+        <w:rPr>
+          <w:rFonts w:ascii="Arial" w:hAnsi="Arial" w:cs="Arial"/>
+          <w:color w:val="000000" w:themeColor="text1"/>
+        </w:rPr>
+        <w:t xml:space="preserve"> </w:t>
+      </w:r>
+      <w:r>
+        <w:rPr>
+          <w:rFonts w:ascii="Arial" w:hAnsi="Arial" w:cs="Arial"/>
+          <w:color w:val="000000" w:themeColor="text1"/>
+        </w:rPr>
+        <w:t xml:space="preserve">107-94-EF/10; por lo tanto, corresponde atender las series de la referida DAM solicitadas a regularización toda vez que se  encuentran  negociadas  en  el  Arancel  Común  del Convenio Peruano - Colombiano con una tasa Ad/Valorem – </w:t>
+      </w:r>
+      <w:r>
+        <w:rPr>
+          <w:rFonts w:ascii="Arial" w:hAnsi="Arial" w:cs="Arial"/>
+          <w:color w:val="000000" w:themeColor="text1"/>
+        </w:rPr>
+        <w:t>l</w:t>
+      </w:r>
+      <w:r>
+        <w:rPr>
+          <w:rFonts w:ascii="Arial" w:hAnsi="Arial" w:cs="Arial"/>
+          <w:color w:val="000000" w:themeColor="text1"/>
+        </w:rPr>
+        <w:t xml:space="preserve">ibre; determinándose que el monto a regularizar en el marco de la Ley </w:t>
+      </w:r>
+      <w:r>
+        <w:rPr>
+          <w:rFonts w:ascii="Arial" w:hAnsi="Arial" w:cs="Arial"/>
+          <w:color w:val="000000" w:themeColor="text1"/>
+        </w:rPr>
+        <w:t>n</w:t>
+      </w:r>
+      <w:r>
+        <w:rPr>
+          <w:rFonts w:ascii="Arial" w:hAnsi="Arial" w:cs="Arial"/>
+          <w:color w:val="000000" w:themeColor="text1"/>
+        </w:rPr>
+        <w:t>.º</w:t>
+      </w:r>
+      <w:r>
+        <w:rPr>
+          <w:rFonts w:ascii="Arial" w:hAnsi="Arial" w:cs="Arial"/>
+          <w:color w:val="000000" w:themeColor="text1"/>
+        </w:rPr>
+        <w:t xml:space="preserve"> </w:t>
+      </w:r>
+      <w:r>
+        <w:rPr>
+          <w:rFonts w:ascii="Arial" w:hAnsi="Arial" w:cs="Arial"/>
+          <w:color w:val="000000" w:themeColor="text1"/>
+        </w:rPr>
+        <w:t>27037 es de S/ {textoTotRegu27}.</w:t>
       </w:r>
     </w:p>
     <w:p/>
@@ -8855,7 +9445,21 @@
           <w:rFonts w:ascii="Arial" w:hAnsi="Arial" w:cs="Arial"/>
           <w:color w:val="000000" w:themeColor="text1"/>
         </w:rPr>
-        <w:t>, se establece que la mercancía materia de regularización ha sido objeto de reconocimiento físico dentro del plazo previsto en el artículo 2º de la Resolución Ministerial n.º107-94-EF/10; por lo tanto, corresponde atender las series de la referida DAM solicitadas a regularización toda vez que se encuentran negociadas en el Arancel Común del Convenio Peruano - Colombiano con una tasa Ad/Valorem – Libre; asimismo, se debe tener en cuenta lo opinado en el informe n.º 50-2008-SUNAT/2B4000, ratificado mediante Informe n.º 11-2017-SUNAT/340000, donde dice que: “la devolución de los tributos pagados a cuenta, como regularización del despacho de mercancía acogidas estrictamente a los beneficios arancelarios otorgados por el PECO, comprende únicamente los derechos Ad/Valorem cancelados de las mercancías liberadas total o parcialmente por acogimiento del PECO; determinándose que el monto a regularizar en el marco del Decreto Supremo n.º 015-94-EF es de S/ {textoTotReguPECO} y en el marco de la Ley n.º 2703</w:t>
+        <w:t>, se establece que la mercancía materia de regularización ha sido objeto de reconocimiento físico dentro del plazo previsto en el artículo 2º de la Resolución Ministerial n.º</w:t>
+      </w:r>
+      <w:r>
+        <w:rPr>
+          <w:rFonts w:ascii="Arial" w:hAnsi="Arial" w:cs="Arial"/>
+          <w:color w:val="000000" w:themeColor="text1"/>
+        </w:rPr>
+        <w:t xml:space="preserve"> </w:t>
+      </w:r>
+      <w:r>
+        <w:rPr>
+          <w:rFonts w:ascii="Arial" w:hAnsi="Arial" w:cs="Arial"/>
+          <w:color w:val="000000" w:themeColor="text1"/>
+        </w:rPr>
+        <w:t>107-94-EF/10; por lo tanto, corresponde atender las series de la referida DAM solicitadas a regularización toda vez que se encuentran negociadas en el Arancel Común del Convenio Peruano - Colombiano con una tasa Ad/Valorem – Libre; asimismo, se debe tener en cuenta lo opinado en el informe n.º 50-2008-SUNAT/2B4000, ratificado mediante Informe n.º 11-2017-SUNAT/340000, donde dice que: “la devolución de los tributos pagados a cuenta, como regularización del despacho de mercancía acogidas estrictamente a los beneficios arancelarios otorgados por el PECO, comprende únicamente los derechos Ad/Valorem cancelados de las mercancías liberadas total o parcialmente por acogimiento del PECO; determinándose que el monto a regularizar en el marco del Decreto Supremo n.º 015-94-EF es de S/ {textoTotReguPECO} y en el marco de la Ley n.º 2703</w:t>
       </w:r>
       <w:r>
         <w:rPr>
@@ -9005,7 +9609,25 @@
           <w:sz w:val="22"/>
           <w:szCs w:val="22"/>
         </w:rPr>
-        <w:t>, se establece que la mercancía materia de regularización ha sido objeto de reconocimiento físico dentro del plazo previsto en el artículo 2º de la Resolución Ministerial n.º107-94-EF/10; por lo tanto, corresponde atender las series de la referida DAM solicitadas a regularización toda vez que se encuentran negociadas en el Arancel Común del Convenio Peruano - Colombiano con una tasa Ad/Valorem – Libre; asimismo, se debe tener en cuenta lo opinado en el informe n.º 50-2008-SUNAT/2B4000, ratificado mediante Informe n.º 11-2017-SUNAT/340000, donde dice que: “la devolución de los tributos pagados a cuenta, como regularización del despacho de mercancía acogidas estrictamente a los beneficios arancelarios otorgados por el PECO, comprende únicamente los derechos Ad/Valorem cancelados de las mercancías liberadas total o parcialmente por acogimiento del PECO; determinándose que el monto a regularizar en el marco del Decreto Supremo n.º 015-94-EF es de S/ {textoTotReguPECO}</w:t>
+        <w:t>, se establece que la mercancía materia de regularización ha sido objeto de reconocimiento físico dentro del plazo previsto en el artículo 2º de la Resolución Ministerial n.º</w:t>
+      </w:r>
+      <w:r>
+        <w:rPr>
+          <w:rFonts w:ascii="Arial" w:hAnsi="Arial" w:cs="Arial"/>
+          <w:color w:val="000000" w:themeColor="text1"/>
+          <w:sz w:val="22"/>
+          <w:szCs w:val="22"/>
+        </w:rPr>
+        <w:t xml:space="preserve"> </w:t>
+      </w:r>
+      <w:r>
+        <w:rPr>
+          <w:rFonts w:ascii="Arial" w:hAnsi="Arial" w:cs="Arial"/>
+          <w:color w:val="000000" w:themeColor="text1"/>
+          <w:sz w:val="22"/>
+          <w:szCs w:val="22"/>
+        </w:rPr>
+        <w:t>107-94-EF/10; por lo tanto, corresponde atender las series de la referida DAM solicitadas a regularización toda vez que se encuentran negociadas en el Arancel Común del Convenio Peruano - Colombiano con una tasa Ad/Valorem – Libre; asimismo, se debe tener en cuenta lo opinado en el informe n.º 50-2008-SUNAT/2B4000, ratificado mediante Informe n.º 11-2017-SUNAT/340000, donde dice que: “la devolución de los tributos pagados a cuenta, como regularización del despacho de mercancía acogidas estrictamente a los beneficios arancelarios otorgados por el PECO, comprende únicamente los derechos Ad/Valorem cancelados de las mercancías liberadas total o parcialmente por acogimiento del PECO; determinándose que el monto a regularizar en el marco del Decreto Supremo n.º 015-94-EF es de S/ {textoTotReguPECO}</w:t>
       </w:r>
       <w:r>
         <w:rPr>
@@ -9931,7 +10553,23 @@
           <w:sz w:val="22"/>
           <w:szCs w:val="22"/>
         </w:rPr>
-        <w:t xml:space="preserve"> la regularización la DAM n.º {fromDam-numeroDam}, solicitada al amparo del Decreto Supremo N.º 015-94-EF, por los fundamentos expuestos en la presente</w:t>
+        <w:t xml:space="preserve"> la regularización la DAM n.º {fromDam-numeroDam}, solicitada al amparo del Decreto Supremo </w:t>
+      </w:r>
+      <w:r>
+        <w:rPr>
+          <w:rFonts w:ascii="Arial" w:hAnsi="Arial" w:cs="Arial"/>
+          <w:sz w:val="22"/>
+          <w:szCs w:val="22"/>
+        </w:rPr>
+        <w:t>n</w:t>
+      </w:r>
+      <w:r>
+        <w:rPr>
+          <w:rFonts w:ascii="Arial" w:hAnsi="Arial" w:cs="Arial"/>
+          <w:sz w:val="22"/>
+          <w:szCs w:val="22"/>
+        </w:rPr>
+        <w:t>.º 015-94-EF, por los fundamentos expuestos en la presente</w:t>
       </w:r>
       <w:r>
         <w:rPr>
@@ -10708,7 +11346,7 @@
 </file>
 
 <file path=word/numbering.xml><?xml version="1.0" encoding="utf-8"?>
-<w:numbering xmlns:wpc="http://schemas.microsoft.com/office/word/2010/wordprocessingCanvas" xmlns:cx="http://schemas.microsoft.com/office/drawing/2014/chartex" xmlns:cx1="http://schemas.microsoft.com/office/drawing/2015/9/8/chartex" xmlns:cx2="http://schemas.microsoft.com/office/drawing/2015/10/21/chartex" xmlns:cx3="http://schemas.microsoft.com/office/drawing/2016/5/9/chartex" xmlns:cx4="http://schemas.microsoft.com/office/drawing/2016/5/10/chartex" xmlns:cx5="http://schemas.microsoft.com/office/drawing/2016/5/11/chartex" xmlns:cx6="http://schemas.microsoft.com/office/drawing/2016/5/12/chartex" xmlns:cx7="http://schemas.microsoft.com/office/drawing/2016/5/13/chartex" xmlns:cx8="http://schemas.microsoft.com/office/drawing/2016/5/14/chartex" xmlns:mc="http://schemas.openxmlformats.org/markup-compatibility/2006" xmlns:aink="http://schemas.microsoft.com/office/drawing/2016/ink" xmlns:am3d="http://schemas.microsoft.com/office/drawing/2017/model3d" xmlns:o="urn:schemas-microsoft-com:office:office" xmlns:oel="http://schemas.microsoft.com/office/2019/extlst" xmlns:r="http://schemas.openxmlformats.org/officeDocument/2006/relationships" xmlns:m="http://schemas.openxmlformats.org/officeDocument/2006/math" xmlns:v="urn:schemas-microsoft-com:vml" xmlns:wp14="http://schemas.microsoft.com/office/word/2010/wordprocessingDrawing" xmlns:wp="http://schemas.openxmlformats.org/drawingml/2006/wordprocessingDrawing" xmlns:w10="urn:schemas-microsoft-com:office:word" xmlns:w="http://schemas.openxmlformats.org/wordprocessingml/2006/main" xmlns:w14="http://schemas.microsoft.com/office/word/2010/wordml" xmlns:w15="http://schemas.microsoft.com/office/word/2012/wordml" xmlns:w16cex="http://schemas.microsoft.com/office/word/2018/wordml/cex" xmlns:w16cid="http://schemas.microsoft.com/office/word/2016/wordml/cid" xmlns:w16="http://schemas.microsoft.com/office/word/2018/wordml" xmlns:w16sdtdh="http://schemas.microsoft.com/office/word/2020/wordml/sdtdatahash" xmlns:w16se="http://schemas.microsoft.com/office/word/2015/wordml/symex" xmlns:wpg="http://schemas.microsoft.com/office/word/2010/wordprocessingGroup" xmlns:wpi="http://schemas.microsoft.com/office/word/2010/wordprocessingInk" xmlns:wne="http://schemas.microsoft.com/office/word/2006/wordml" xmlns:wps="http://schemas.microsoft.com/office/word/2010/wordprocessingShape" mc:Ignorable="w14 w15 w16se w16cid w16 w16cex w16sdtdh wp14">
+<w:numbering xmlns:wpc="http://schemas.microsoft.com/office/word/2010/wordprocessingCanvas" xmlns:cx="http://schemas.microsoft.com/office/drawing/2014/chartex" xmlns:cx1="http://schemas.microsoft.com/office/drawing/2015/9/8/chartex" xmlns:cx2="http://schemas.microsoft.com/office/drawing/2015/10/21/chartex" xmlns:cx3="http://schemas.microsoft.com/office/drawing/2016/5/9/chartex" xmlns:cx4="http://schemas.microsoft.com/office/drawing/2016/5/10/chartex" xmlns:cx5="http://schemas.microsoft.com/office/drawing/2016/5/11/chartex" xmlns:cx6="http://schemas.microsoft.com/office/drawing/2016/5/12/chartex" xmlns:cx7="http://schemas.microsoft.com/office/drawing/2016/5/13/chartex" xmlns:cx8="http://schemas.microsoft.com/office/drawing/2016/5/14/chartex" xmlns:mc="http://schemas.openxmlformats.org/markup-compatibility/2006" xmlns:aink="http://schemas.microsoft.com/office/drawing/2016/ink" xmlns:am3d="http://schemas.microsoft.com/office/drawing/2017/model3d" xmlns:o="urn:schemas-microsoft-com:office:office" xmlns:oel="http://schemas.microsoft.com/office/2019/extlst" xmlns:r="http://schemas.openxmlformats.org/officeDocument/2006/relationships" xmlns:m="http://schemas.openxmlformats.org/officeDocument/2006/math" xmlns:v="urn:schemas-microsoft-com:vml" xmlns:wp14="http://schemas.microsoft.com/office/word/2010/wordprocessingDrawing" xmlns:wp="http://schemas.openxmlformats.org/drawingml/2006/wordprocessingDrawing" xmlns:w10="urn:schemas-microsoft-com:office:word" xmlns:w="http://schemas.openxmlformats.org/wordprocessingml/2006/main" xmlns:w14="http://schemas.microsoft.com/office/word/2010/wordml" xmlns:w15="http://schemas.microsoft.com/office/word/2012/wordml" xmlns:w16cex="http://schemas.microsoft.com/office/word/2018/wordml/cex" xmlns:w16cid="http://schemas.microsoft.com/office/word/2016/wordml/cid" xmlns:w16="http://schemas.microsoft.com/office/word/2018/wordml" xmlns:w16du="http://schemas.microsoft.com/office/word/2023/wordml/word16du" xmlns:w16sdtdh="http://schemas.microsoft.com/office/word/2020/wordml/sdtdatahash" xmlns:w16se="http://schemas.microsoft.com/office/word/2015/wordml/symex" xmlns:wpg="http://schemas.microsoft.com/office/word/2010/wordprocessingGroup" xmlns:wpi="http://schemas.microsoft.com/office/word/2010/wordprocessingInk" xmlns:wne="http://schemas.microsoft.com/office/word/2006/wordml" xmlns:wps="http://schemas.microsoft.com/office/word/2010/wordprocessingShape" mc:Ignorable="w14 w15 w16se w16cid w16 w16cex w16sdtdh w16du wp14">
   <w:abstractNum w:abstractNumId="0" w15:restartNumberingAfterBreak="0">
     <w:nsid w:val="0F643300"/>
     <w:multiLevelType w:val="hybridMultilevel"/>
@@ -12959,7 +13597,7 @@
 </file>
 
 <file path=word/styles.xml><?xml version="1.0" encoding="utf-8"?>
-<w:styles xmlns:mc="http://schemas.openxmlformats.org/markup-compatibility/2006" xmlns:r="http://schemas.openxmlformats.org/officeDocument/2006/relationships" xmlns:w="http://schemas.openxmlformats.org/wordprocessingml/2006/main" xmlns:w14="http://schemas.microsoft.com/office/word/2010/wordml" xmlns:w15="http://schemas.microsoft.com/office/word/2012/wordml" xmlns:w16cex="http://schemas.microsoft.com/office/word/2018/wordml/cex" xmlns:w16cid="http://schemas.microsoft.com/office/word/2016/wordml/cid" xmlns:w16="http://schemas.microsoft.com/office/word/2018/wordml" xmlns:w16sdtdh="http://schemas.microsoft.com/office/word/2020/wordml/sdtdatahash" xmlns:w16se="http://schemas.microsoft.com/office/word/2015/wordml/symex" mc:Ignorable="w14 w15 w16se w16cid w16 w16cex w16sdtdh">
+<w:styles xmlns:mc="http://schemas.openxmlformats.org/markup-compatibility/2006" xmlns:r="http://schemas.openxmlformats.org/officeDocument/2006/relationships" xmlns:w="http://schemas.openxmlformats.org/wordprocessingml/2006/main" xmlns:w14="http://schemas.microsoft.com/office/word/2010/wordml" xmlns:w15="http://schemas.microsoft.com/office/word/2012/wordml" xmlns:w16cex="http://schemas.microsoft.com/office/word/2018/wordml/cex" xmlns:w16cid="http://schemas.microsoft.com/office/word/2016/wordml/cid" xmlns:w16="http://schemas.microsoft.com/office/word/2018/wordml" xmlns:w16du="http://schemas.microsoft.com/office/word/2023/wordml/word16du" xmlns:w16sdtdh="http://schemas.microsoft.com/office/word/2020/wordml/sdtdatahash" xmlns:w16se="http://schemas.microsoft.com/office/word/2015/wordml/symex" mc:Ignorable="w14 w15 w16se w16cid w16 w16cex w16sdtdh w16du">
   <w:docDefaults>
     <w:rPrDefault>
       <w:rPr>

</xml_diff>

<commit_message>
se agrego nuevos words
</commit_message>
<xml_diff>
--- a/recursos/words/semiPlantillaFinalInformeV2NUEVO.docx
+++ b/recursos/words/semiPlantillaFinalInformeV2NUEVO.docx
@@ -1,6 +1,6 @@
 
 <file path=word/document.xml><?xml version="1.0" encoding="utf-8"?>
-<w:document xmlns:wpc="http://schemas.microsoft.com/office/word/2010/wordprocessingCanvas" xmlns:cx="http://schemas.microsoft.com/office/drawing/2014/chartex" xmlns:cx1="http://schemas.microsoft.com/office/drawing/2015/9/8/chartex" xmlns:cx2="http://schemas.microsoft.com/office/drawing/2015/10/21/chartex" xmlns:cx3="http://schemas.microsoft.com/office/drawing/2016/5/9/chartex" xmlns:cx4="http://schemas.microsoft.com/office/drawing/2016/5/10/chartex" xmlns:cx5="http://schemas.microsoft.com/office/drawing/2016/5/11/chartex" xmlns:cx6="http://schemas.microsoft.com/office/drawing/2016/5/12/chartex" xmlns:cx7="http://schemas.microsoft.com/office/drawing/2016/5/13/chartex" xmlns:cx8="http://schemas.microsoft.com/office/drawing/2016/5/14/chartex" xmlns:mc="http://schemas.openxmlformats.org/markup-compatibility/2006" xmlns:aink="http://schemas.microsoft.com/office/drawing/2016/ink" xmlns:am3d="http://schemas.microsoft.com/office/drawing/2017/model3d" xmlns:o="urn:schemas-microsoft-com:office:office" xmlns:oel="http://schemas.microsoft.com/office/2019/extlst" xmlns:r="http://schemas.openxmlformats.org/officeDocument/2006/relationships" xmlns:m="http://schemas.openxmlformats.org/officeDocument/2006/math" xmlns:v="urn:schemas-microsoft-com:vml" xmlns:wp14="http://schemas.microsoft.com/office/word/2010/wordprocessingDrawing" xmlns:wp="http://schemas.openxmlformats.org/drawingml/2006/wordprocessingDrawing" xmlns:w10="urn:schemas-microsoft-com:office:word" xmlns:w="http://schemas.openxmlformats.org/wordprocessingml/2006/main" xmlns:w14="http://schemas.microsoft.com/office/word/2010/wordml" xmlns:w15="http://schemas.microsoft.com/office/word/2012/wordml" xmlns:w16cex="http://schemas.microsoft.com/office/word/2018/wordml/cex" xmlns:w16cid="http://schemas.microsoft.com/office/word/2016/wordml/cid" xmlns:w16="http://schemas.microsoft.com/office/word/2018/wordml" xmlns:w16sdtdh="http://schemas.microsoft.com/office/word/2020/wordml/sdtdatahash" xmlns:w16se="http://schemas.microsoft.com/office/word/2015/wordml/symex" xmlns:wpg="http://schemas.microsoft.com/office/word/2010/wordprocessingGroup" xmlns:wpi="http://schemas.microsoft.com/office/word/2010/wordprocessingInk" xmlns:wne="http://schemas.microsoft.com/office/word/2006/wordml" xmlns:wps="http://schemas.microsoft.com/office/word/2010/wordprocessingShape" mc:Ignorable="w14 w15 w16se w16cid w16 w16cex w16sdtdh wp14">
+<w:document xmlns:wpc="http://schemas.microsoft.com/office/word/2010/wordprocessingCanvas" xmlns:cx="http://schemas.microsoft.com/office/drawing/2014/chartex" xmlns:cx1="http://schemas.microsoft.com/office/drawing/2015/9/8/chartex" xmlns:cx2="http://schemas.microsoft.com/office/drawing/2015/10/21/chartex" xmlns:cx3="http://schemas.microsoft.com/office/drawing/2016/5/9/chartex" xmlns:cx4="http://schemas.microsoft.com/office/drawing/2016/5/10/chartex" xmlns:cx5="http://schemas.microsoft.com/office/drawing/2016/5/11/chartex" xmlns:cx6="http://schemas.microsoft.com/office/drawing/2016/5/12/chartex" xmlns:cx7="http://schemas.microsoft.com/office/drawing/2016/5/13/chartex" xmlns:cx8="http://schemas.microsoft.com/office/drawing/2016/5/14/chartex" xmlns:mc="http://schemas.openxmlformats.org/markup-compatibility/2006" xmlns:aink="http://schemas.microsoft.com/office/drawing/2016/ink" xmlns:am3d="http://schemas.microsoft.com/office/drawing/2017/model3d" xmlns:o="urn:schemas-microsoft-com:office:office" xmlns:oel="http://schemas.microsoft.com/office/2019/extlst" xmlns:r="http://schemas.openxmlformats.org/officeDocument/2006/relationships" xmlns:m="http://schemas.openxmlformats.org/officeDocument/2006/math" xmlns:v="urn:schemas-microsoft-com:vml" xmlns:wp14="http://schemas.microsoft.com/office/word/2010/wordprocessingDrawing" xmlns:wp="http://schemas.openxmlformats.org/drawingml/2006/wordprocessingDrawing" xmlns:w10="urn:schemas-microsoft-com:office:word" xmlns:w="http://schemas.openxmlformats.org/wordprocessingml/2006/main" xmlns:w14="http://schemas.microsoft.com/office/word/2010/wordml" xmlns:w15="http://schemas.microsoft.com/office/word/2012/wordml" xmlns:w16cex="http://schemas.microsoft.com/office/word/2018/wordml/cex" xmlns:w16cid="http://schemas.microsoft.com/office/word/2016/wordml/cid" xmlns:w16="http://schemas.microsoft.com/office/word/2018/wordml" xmlns:w16du="http://schemas.microsoft.com/office/word/2023/wordml/word16du" xmlns:w16sdtdh="http://schemas.microsoft.com/office/word/2020/wordml/sdtdatahash" xmlns:w16se="http://schemas.microsoft.com/office/word/2015/wordml/symex" xmlns:wpg="http://schemas.microsoft.com/office/word/2010/wordprocessingGroup" xmlns:wpi="http://schemas.microsoft.com/office/word/2010/wordprocessingInk" xmlns:wne="http://schemas.microsoft.com/office/word/2006/wordml" xmlns:wps="http://schemas.microsoft.com/office/word/2010/wordprocessingShape" mc:Ignorable="w14 w15 w16se w16cid w16 w16cex w16sdtdh w16du wp14">
   <w:body>
     <w:p>
       <w:pPr>
@@ -434,7 +434,16 @@
           <w:sz w:val="22"/>
           <w:szCs w:val="22"/>
         </w:rPr>
-        <w:t>fromDam-numeroDam</w:t>
+        <w:t>fromDam-</w:t>
+      </w:r>
+      <w:proofErr w:type="gramStart"/>
+      <w:r>
+        <w:rPr>
+          <w:rFonts w:ascii="Arial" w:hAnsi="Arial" w:cs="Arial"/>
+          <w:sz w:val="22"/>
+          <w:szCs w:val="22"/>
+        </w:rPr>
+        <w:t>numeroDam</w:t>
       </w:r>
       <w:proofErr w:type="spellEnd"/>
       <w:r>
@@ -457,6 +466,7 @@
         <w:t>{</w:t>
       </w:r>
       <w:proofErr w:type="spellStart"/>
+      <w:proofErr w:type="gramEnd"/>
       <w:r>
         <w:rPr>
           <w:rFonts w:ascii="Arial" w:hAnsi="Arial" w:cs="Arial"/>
@@ -895,7 +905,27 @@
           <w:szCs w:val="22"/>
           <w:shd w:val="clear" w:color="auto" w:fill="FAF9F8"/>
         </w:rPr>
-        <w:t>Arancel Común Anexo al Protocolo Modificatorio del Convenio de Cooperación Aduanera Peruano-Colombiano de 1938, puesto en vigencia por el Decreto Supremo </w:t>
+        <w:t>Arancel Común Anexo al Protocolo Modificatorio del Convenio de Cooperación Aduanera Peruano-</w:t>
+      </w:r>
+      <w:proofErr w:type="gramStart"/>
+      <w:r>
+        <w:rPr>
+          <w:rFonts w:ascii="Arial" w:hAnsi="Arial" w:cs="Arial"/>
+          <w:sz w:val="22"/>
+          <w:szCs w:val="22"/>
+          <w:shd w:val="clear" w:color="auto" w:fill="FAF9F8"/>
+        </w:rPr>
+        <w:t>Colombiano</w:t>
+      </w:r>
+      <w:proofErr w:type="gramEnd"/>
+      <w:r>
+        <w:rPr>
+          <w:rFonts w:ascii="Arial" w:hAnsi="Arial" w:cs="Arial"/>
+          <w:sz w:val="22"/>
+          <w:szCs w:val="22"/>
+          <w:shd w:val="clear" w:color="auto" w:fill="FAF9F8"/>
+        </w:rPr>
+        <w:t> de 1938, puesto en vigencia por el Decreto Supremo </w:t>
       </w:r>
       <w:proofErr w:type="spellStart"/>
       <w:r>
@@ -1397,7 +1427,27 @@
           <w:shd w:val="clear" w:color="auto" w:fill="FAF9F8"/>
         </w:rPr>
         <w:lastRenderedPageBreak/>
-        <w:t>Convenio de Cooperación Aduanera Peruano-Colombiano de 1938 y su Protocolo Modificatorio, aprobado por Resolución Legislativa </w:t>
+        <w:t>Convenio de Cooperación Aduanera Peruano-</w:t>
+      </w:r>
+      <w:proofErr w:type="gramStart"/>
+      <w:r>
+        <w:rPr>
+          <w:rFonts w:ascii="Arial" w:hAnsi="Arial" w:cs="Arial"/>
+          <w:sz w:val="22"/>
+          <w:szCs w:val="22"/>
+          <w:shd w:val="clear" w:color="auto" w:fill="FAF9F8"/>
+        </w:rPr>
+        <w:t>Colombiano</w:t>
+      </w:r>
+      <w:proofErr w:type="gramEnd"/>
+      <w:r>
+        <w:rPr>
+          <w:rFonts w:ascii="Arial" w:hAnsi="Arial" w:cs="Arial"/>
+          <w:sz w:val="22"/>
+          <w:szCs w:val="22"/>
+          <w:shd w:val="clear" w:color="auto" w:fill="FAF9F8"/>
+        </w:rPr>
+        <w:t> de 1938 y su Protocolo Modificatorio, aprobado por Resolución Legislativa </w:t>
       </w:r>
       <w:proofErr w:type="spellStart"/>
       <w:r>
@@ -1513,7 +1563,27 @@
           <w:szCs w:val="22"/>
           <w:shd w:val="clear" w:color="auto" w:fill="FAF9F8"/>
         </w:rPr>
-        <w:t>Arancel Común Anexo al Protocolo Modificatorio del Convenio de Cooperación Aduanera Peruano-Colombiano de 1938, puesto en vigencia por el Decreto Supremo </w:t>
+        <w:t>Arancel Común Anexo al Protocolo Modificatorio del Convenio de Cooperación Aduanera Peruano-</w:t>
+      </w:r>
+      <w:proofErr w:type="gramStart"/>
+      <w:r>
+        <w:rPr>
+          <w:rFonts w:ascii="Arial" w:hAnsi="Arial" w:cs="Arial"/>
+          <w:sz w:val="22"/>
+          <w:szCs w:val="22"/>
+          <w:shd w:val="clear" w:color="auto" w:fill="FAF9F8"/>
+        </w:rPr>
+        <w:t>Colombiano</w:t>
+      </w:r>
+      <w:proofErr w:type="gramEnd"/>
+      <w:r>
+        <w:rPr>
+          <w:rFonts w:ascii="Arial" w:hAnsi="Arial" w:cs="Arial"/>
+          <w:sz w:val="22"/>
+          <w:szCs w:val="22"/>
+          <w:shd w:val="clear" w:color="auto" w:fill="FAF9F8"/>
+        </w:rPr>
+        <w:t> de 1938, puesto en vigencia por el Decreto Supremo </w:t>
       </w:r>
       <w:proofErr w:type="spellStart"/>
       <w:r>
@@ -1723,7 +1793,27 @@
           <w:szCs w:val="22"/>
           <w:shd w:val="clear" w:color="auto" w:fill="FAF9F8"/>
         </w:rPr>
-        <w:t> 248-2025/SUNAT - Procedimiento Especifico DESPA-PE.01.13 (versión 3) Importación De Mercancías Sujetas Al Protocolo Modificatorio Del Convenio De Cooperación Aduanera Peruano-Colombiano. </w:t>
+        <w:t> 248-2025/SUNAT - Procedimiento Especifico DESPA-PE.01.13 (versión 3) Importación De Mercancías Sujetas Al Protocolo Modificatorio Del Convenio De Cooperación Aduanera Peruano-</w:t>
+      </w:r>
+      <w:proofErr w:type="gramStart"/>
+      <w:r>
+        <w:rPr>
+          <w:rFonts w:ascii="Arial" w:hAnsi="Arial" w:cs="Arial"/>
+          <w:sz w:val="22"/>
+          <w:szCs w:val="22"/>
+          <w:shd w:val="clear" w:color="auto" w:fill="FAF9F8"/>
+        </w:rPr>
+        <w:t>Colombiano</w:t>
+      </w:r>
+      <w:proofErr w:type="gramEnd"/>
+      <w:r>
+        <w:rPr>
+          <w:rFonts w:ascii="Arial" w:hAnsi="Arial" w:cs="Arial"/>
+          <w:sz w:val="22"/>
+          <w:szCs w:val="22"/>
+          <w:shd w:val="clear" w:color="auto" w:fill="FAF9F8"/>
+        </w:rPr>
+        <w:t>. </w:t>
       </w:r>
     </w:p>
     <w:p>
@@ -1922,7 +2012,27 @@
           <w:szCs w:val="22"/>
           <w:shd w:val="clear" w:color="auto" w:fill="FAF9F8"/>
         </w:rPr>
-        <w:t xml:space="preserve">de Cooperación Aduanera Peruano-Colombiano de 1938 y su Protocolo Modificatorio, aprobado por Resolución Legislativa </w:t>
+        <w:t>de Cooperación Aduanera Peruano-</w:t>
+      </w:r>
+      <w:proofErr w:type="gramStart"/>
+      <w:r>
+        <w:rPr>
+          <w:rFonts w:ascii="Arial" w:hAnsi="Arial" w:cs="Arial"/>
+          <w:sz w:val="22"/>
+          <w:szCs w:val="22"/>
+          <w:shd w:val="clear" w:color="auto" w:fill="FAF9F8"/>
+        </w:rPr>
+        <w:t>Colombiano</w:t>
+      </w:r>
+      <w:proofErr w:type="gramEnd"/>
+      <w:r>
+        <w:rPr>
+          <w:rFonts w:ascii="Arial" w:hAnsi="Arial" w:cs="Arial"/>
+          <w:sz w:val="22"/>
+          <w:szCs w:val="22"/>
+          <w:shd w:val="clear" w:color="auto" w:fill="FAF9F8"/>
+        </w:rPr>
+        <w:t xml:space="preserve"> de 1938 y su Protocolo Modificatorio, aprobado por Resolución Legislativa </w:t>
       </w:r>
       <w:proofErr w:type="spellStart"/>
       <w:r>
@@ -2074,7 +2184,27 @@
           <w:szCs w:val="22"/>
           <w:shd w:val="clear" w:color="auto" w:fill="FAF9F8"/>
         </w:rPr>
-        <w:t xml:space="preserve">Común Anexo al Protocolo Modificatorio del Convenio de Cooperación Aduanera Peruano-Colombiano de 1938, puesto en vigencia por el Decreto Supremo </w:t>
+        <w:t>Común Anexo al Protocolo Modificatorio del Convenio de Cooperación Aduanera Peruano-</w:t>
+      </w:r>
+      <w:proofErr w:type="gramStart"/>
+      <w:r>
+        <w:rPr>
+          <w:rFonts w:ascii="Arial" w:hAnsi="Arial" w:cs="Arial"/>
+          <w:sz w:val="22"/>
+          <w:szCs w:val="22"/>
+          <w:shd w:val="clear" w:color="auto" w:fill="FAF9F8"/>
+        </w:rPr>
+        <w:t>Colombiano</w:t>
+      </w:r>
+      <w:proofErr w:type="gramEnd"/>
+      <w:r>
+        <w:rPr>
+          <w:rFonts w:ascii="Arial" w:hAnsi="Arial" w:cs="Arial"/>
+          <w:sz w:val="22"/>
+          <w:szCs w:val="22"/>
+          <w:shd w:val="clear" w:color="auto" w:fill="FAF9F8"/>
+        </w:rPr>
+        <w:t xml:space="preserve"> de 1938, puesto en vigencia por el Decreto Supremo </w:t>
       </w:r>
       <w:proofErr w:type="spellStart"/>
       <w:r>
@@ -2179,8 +2309,19 @@
           <w:szCs w:val="22"/>
           <w:shd w:val="clear" w:color="auto" w:fill="FAF9F8"/>
         </w:rPr>
-        <w:t xml:space="preserve"> 248-2025/SUNAT - Procedimiento Especifico DESPA-PE.01.13 (versión 3) Importación De Mercancías Sujetas Al Protocolo Modificatorio Del Convenio De Cooperación Aduanera Peruano-Colombiano</w:t>
-      </w:r>
+        <w:t xml:space="preserve"> 248-2025/SUNAT - Procedimiento Especifico DESPA-PE.01.13 (versión 3) Importación De Mercancías Sujetas Al Protocolo Modificatorio Del Convenio De Cooperación Aduanera Peruano-</w:t>
+      </w:r>
+      <w:proofErr w:type="gramStart"/>
+      <w:r>
+        <w:rPr>
+          <w:rFonts w:ascii="Arial" w:hAnsi="Arial" w:cs="Arial"/>
+          <w:sz w:val="22"/>
+          <w:szCs w:val="22"/>
+          <w:shd w:val="clear" w:color="auto" w:fill="FAF9F8"/>
+        </w:rPr>
+        <w:t>Colombiano</w:t>
+      </w:r>
+      <w:proofErr w:type="gramEnd"/>
     </w:p>
     <w:p>
       <w:pPr>
@@ -3160,7 +3301,16 @@
           <w:sz w:val="22"/>
           <w:szCs w:val="22"/>
         </w:rPr>
-        <w:t>fromDam-fechaCancelacionTributos</w:t>
+        <w:t>fromDam-</w:t>
+      </w:r>
+      <w:proofErr w:type="gramStart"/>
+      <w:r>
+        <w:rPr>
+          <w:rFonts w:ascii="Arial" w:hAnsi="Arial" w:cs="Arial"/>
+          <w:sz w:val="22"/>
+          <w:szCs w:val="22"/>
+        </w:rPr>
+        <w:t>fechaCancelacionTributos</w:t>
       </w:r>
       <w:r>
         <w:rPr>
@@ -3179,7 +3329,19 @@
           <w:sz w:val="22"/>
           <w:szCs w:val="22"/>
         </w:rPr>
-        <w:t>{fromDam-fechaCancelacionTributosRRR}</w:t>
+        <w:t>{</w:t>
+      </w:r>
+      <w:proofErr w:type="gramEnd"/>
+      <w:r>
+        <w:rPr>
+          <w:rFonts w:ascii="Arial" w:hAnsi="Arial" w:cs="Arial"/>
+          <w:b/>
+          <w:bCs/>
+          <w:color w:val="FF0000"/>
+          <w:sz w:val="22"/>
+          <w:szCs w:val="22"/>
+        </w:rPr>
+        <w:t>fromDam-fechaCancelacionTributosRRR}</w:t>
       </w:r>
       <w:r>
         <w:rPr>
@@ -3456,7 +3618,16 @@
           <w:sz w:val="22"/>
           <w:szCs w:val="22"/>
         </w:rPr>
-        <w:t>fromDam-fechaCancelacionTributos</w:t>
+        <w:t>fromDam-</w:t>
+      </w:r>
+      <w:proofErr w:type="gramStart"/>
+      <w:r>
+        <w:rPr>
+          <w:rFonts w:ascii="Arial" w:hAnsi="Arial" w:cs="Arial"/>
+          <w:sz w:val="22"/>
+          <w:szCs w:val="22"/>
+        </w:rPr>
+        <w:t>fechaCancelacionTributos</w:t>
       </w:r>
       <w:r>
         <w:rPr>
@@ -3475,7 +3646,19 @@
           <w:sz w:val="22"/>
           <w:szCs w:val="22"/>
         </w:rPr>
-        <w:t>{fromDam-fechaCancelacionTributosRRR}</w:t>
+        <w:t>{</w:t>
+      </w:r>
+      <w:proofErr w:type="gramEnd"/>
+      <w:r>
+        <w:rPr>
+          <w:rFonts w:ascii="Arial" w:hAnsi="Arial" w:cs="Arial"/>
+          <w:b/>
+          <w:bCs/>
+          <w:color w:val="FF0000"/>
+          <w:sz w:val="22"/>
+          <w:szCs w:val="22"/>
+        </w:rPr>
+        <w:t>fromDam-fechaCancelacionTributosRRR}</w:t>
       </w:r>
       <w:r>
         <w:rPr>
@@ -3655,7 +3838,15 @@
           <w:sz w:val="22"/>
           <w:szCs w:val="22"/>
         </w:rPr>
-        <w:t>245-99-EF/15;</w:t>
+        <w:t>245-99-EF/15</w:t>
+      </w:r>
+      <w:r>
+        <w:rPr>
+          <w:rFonts w:ascii="Arial" w:hAnsi="Arial" w:cs="Arial"/>
+          <w:sz w:val="22"/>
+          <w:szCs w:val="22"/>
+        </w:rPr>
+        <w:t>.</w:t>
       </w:r>
     </w:p>
     <w:p>
@@ -3769,7 +3960,16 @@
           <w:sz w:val="22"/>
           <w:szCs w:val="22"/>
         </w:rPr>
-        <w:t xml:space="preserve"> {fromDam-fechaCancelacionTributos}</w:t>
+        <w:t xml:space="preserve"> {fromDam-</w:t>
+      </w:r>
+      <w:proofErr w:type="gramStart"/>
+      <w:r>
+        <w:rPr>
+          <w:rFonts w:ascii="Arial" w:hAnsi="Arial" w:cs="Arial"/>
+          <w:sz w:val="22"/>
+          <w:szCs w:val="22"/>
+        </w:rPr>
+        <w:t>fechaCancelacionTributos}</w:t>
       </w:r>
       <w:r>
         <w:rPr>
@@ -3780,7 +3980,19 @@
           <w:sz w:val="22"/>
           <w:szCs w:val="22"/>
         </w:rPr>
-        <w:t>{fromDam-fechaCancelacionTributosRRR}</w:t>
+        <w:t>{</w:t>
+      </w:r>
+      <w:proofErr w:type="gramEnd"/>
+      <w:r>
+        <w:rPr>
+          <w:rFonts w:ascii="Arial" w:hAnsi="Arial" w:cs="Arial"/>
+          <w:b/>
+          <w:bCs/>
+          <w:color w:val="FF0000"/>
+          <w:sz w:val="22"/>
+          <w:szCs w:val="22"/>
+        </w:rPr>
+        <w:t>fromDam-fechaCancelacionTributosRRR}</w:t>
       </w:r>
       <w:r>
         <w:rPr>
@@ -4421,9 +4633,9 @@
           <w:sz w:val="22"/>
           <w:szCs w:val="22"/>
         </w:rPr>
-        <w:t>fromInputs-fechaCorreoCecaRRR</w:t>
-      </w:r>
-      <w:proofErr w:type="spellEnd"/>
+        <w:t>fromInputs-</w:t>
+      </w:r>
+      <w:proofErr w:type="gramStart"/>
       <w:r>
         <w:rPr>
           <w:rFonts w:ascii="Arial" w:hAnsi="Arial" w:cs="Arial"/>
@@ -4433,6 +4645,18 @@
           <w:sz w:val="22"/>
           <w:szCs w:val="22"/>
         </w:rPr>
+        <w:t>fechaCorreoCecaRRR</w:t>
+      </w:r>
+      <w:proofErr w:type="spellEnd"/>
+      <w:r>
+        <w:rPr>
+          <w:rFonts w:ascii="Arial" w:hAnsi="Arial" w:cs="Arial"/>
+          <w:b/>
+          <w:bCs/>
+          <w:color w:val="FF0000"/>
+          <w:sz w:val="22"/>
+          <w:szCs w:val="22"/>
+        </w:rPr>
         <w:t>}</w:t>
       </w:r>
       <w:r>
@@ -4444,6 +4668,7 @@
         <w:t>{</w:t>
       </w:r>
       <w:proofErr w:type="spellStart"/>
+      <w:proofErr w:type="gramEnd"/>
       <w:r>
         <w:rPr>
           <w:rFonts w:ascii="Arial" w:hAnsi="Arial" w:cs="Arial"/>
@@ -4578,7 +4803,31 @@
           <w:sz w:val="22"/>
           <w:szCs w:val="22"/>
         </w:rPr>
-        <w:t xml:space="preserve">De acuerdo a </w:t>
+        <w:t xml:space="preserve">De acuerdo </w:t>
+      </w:r>
+      <w:r>
+        <w:rPr>
+          <w:rFonts w:ascii="Arial" w:hAnsi="Arial" w:cs="Arial"/>
+          <w:sz w:val="22"/>
+          <w:szCs w:val="22"/>
+        </w:rPr>
+        <w:t>con</w:t>
+      </w:r>
+      <w:r>
+        <w:rPr>
+          <w:rFonts w:ascii="Arial" w:hAnsi="Arial" w:cs="Arial"/>
+          <w:sz w:val="22"/>
+          <w:szCs w:val="22"/>
+        </w:rPr>
+        <w:t xml:space="preserve"> la</w:t>
+      </w:r>
+      <w:r>
+        <w:rPr>
+          <w:rFonts w:ascii="Arial" w:hAnsi="Arial" w:cs="Arial"/>
+          <w:sz w:val="22"/>
+          <w:szCs w:val="22"/>
+        </w:rPr>
+        <w:t xml:space="preserve"> </w:t>
       </w:r>
       <w:r>
         <w:rPr>
@@ -4610,9 +4859,9 @@
           <w:sz w:val="22"/>
           <w:szCs w:val="22"/>
         </w:rPr>
-        <w:t>fromInputs-fechaAforoRRR</w:t>
-      </w:r>
-      <w:proofErr w:type="spellEnd"/>
+        <w:t>fromInputs-</w:t>
+      </w:r>
+      <w:proofErr w:type="gramStart"/>
       <w:r>
         <w:rPr>
           <w:rFonts w:ascii="Arial" w:hAnsi="Arial" w:cs="Arial"/>
@@ -4622,6 +4871,18 @@
           <w:sz w:val="22"/>
           <w:szCs w:val="22"/>
         </w:rPr>
+        <w:t>fechaAforoRRR</w:t>
+      </w:r>
+      <w:proofErr w:type="spellEnd"/>
+      <w:r>
+        <w:rPr>
+          <w:rFonts w:ascii="Arial" w:hAnsi="Arial" w:cs="Arial"/>
+          <w:b/>
+          <w:bCs/>
+          <w:color w:val="FF0000"/>
+          <w:sz w:val="22"/>
+          <w:szCs w:val="22"/>
+        </w:rPr>
         <w:t>}</w:t>
       </w:r>
       <w:r>
@@ -4634,6 +4895,7 @@
         <w:t>{</w:t>
       </w:r>
       <w:proofErr w:type="spellStart"/>
+      <w:proofErr w:type="gramEnd"/>
       <w:r>
         <w:rPr>
           <w:rFonts w:ascii="Arial" w:hAnsi="Arial" w:cs="Arial"/>
@@ -4802,7 +5064,7 @@
           <w:szCs w:val="22"/>
         </w:rPr>
         <w:lastRenderedPageBreak/>
-        <w:t>regularización en las Aduanas de destino”, asimismo señal a que: “La regularización procederá luego de realizado el reconocimiento físico de las mercancías por la aduana de destino en la zona de selva. De ser el caso, y con sujeción a lo dispuesto en el Convenio de Cooperación Aduanera Peruano Colombiano, el monto pagado en exceso será devuelto"</w:t>
+        <w:t>regularización en las Aduanas de destino”, asimismo señala que: “La regularización procederá luego de realizado el reconocimiento físico de las mercancías por la aduana de destino en la zona de selva. De ser el caso, y con sujeción a lo dispuesto en el Convenio de Cooperación Aduanera Peruano Colombiano, el monto pagado en exceso será devuelto"</w:t>
       </w:r>
       <w:r>
         <w:rPr>
@@ -4950,7 +5212,61 @@
           <w:sz w:val="22"/>
           <w:szCs w:val="22"/>
         </w:rPr>
-        <w:t xml:space="preserve">} declaradas con TPI 35 en el casillero 7.23 de la DAM, tienen un Ad-valoren de 0%, por lo que no se reporta montó abonado a la Subcuenta Especial del Tesoro Público Decreto Supremo </w:t>
+        <w:t>} declaradas con TPI 35 en el casillero 7.23 de la DAM, tienen un Ad-</w:t>
+      </w:r>
+      <w:r>
+        <w:rPr>
+          <w:rFonts w:ascii="Arial" w:hAnsi="Arial" w:cs="Arial"/>
+          <w:color w:val="000000" w:themeColor="text1"/>
+          <w:sz w:val="22"/>
+          <w:szCs w:val="22"/>
+        </w:rPr>
+        <w:t>V</w:t>
+      </w:r>
+      <w:r>
+        <w:rPr>
+          <w:rFonts w:ascii="Arial" w:hAnsi="Arial" w:cs="Arial"/>
+          <w:color w:val="000000" w:themeColor="text1"/>
+          <w:sz w:val="22"/>
+          <w:szCs w:val="22"/>
+        </w:rPr>
+        <w:t>alore</w:t>
+      </w:r>
+      <w:r>
+        <w:rPr>
+          <w:rFonts w:ascii="Arial" w:hAnsi="Arial" w:cs="Arial"/>
+          <w:color w:val="000000" w:themeColor="text1"/>
+          <w:sz w:val="22"/>
+          <w:szCs w:val="22"/>
+        </w:rPr>
+        <w:t>m</w:t>
+      </w:r>
+      <w:r>
+        <w:rPr>
+          <w:rFonts w:ascii="Arial" w:hAnsi="Arial" w:cs="Arial"/>
+          <w:color w:val="000000" w:themeColor="text1"/>
+          <w:sz w:val="22"/>
+          <w:szCs w:val="22"/>
+        </w:rPr>
+        <w:t xml:space="preserve"> de 0%, por lo que no se reporta mont</w:t>
+      </w:r>
+      <w:r>
+        <w:rPr>
+          <w:rFonts w:ascii="Arial" w:hAnsi="Arial" w:cs="Arial"/>
+          <w:color w:val="000000" w:themeColor="text1"/>
+          <w:sz w:val="22"/>
+          <w:szCs w:val="22"/>
+        </w:rPr>
+        <w:t>o</w:t>
+      </w:r>
+      <w:r>
+        <w:rPr>
+          <w:rFonts w:ascii="Arial" w:hAnsi="Arial" w:cs="Arial"/>
+          <w:color w:val="000000" w:themeColor="text1"/>
+          <w:sz w:val="22"/>
+          <w:szCs w:val="22"/>
+        </w:rPr>
+        <w:t xml:space="preserve"> abonado a la Subcuenta Especial del Tesoro Público Decreto Supremo </w:t>
       </w:r>
       <w:proofErr w:type="spellStart"/>
       <w:r>
@@ -5689,7 +6005,25 @@
           <w:sz w:val="22"/>
           <w:szCs w:val="22"/>
         </w:rPr>
-        <w:t>103-99-EF – “Reglamento de las Disposiciones Tributarias contenidas en la Ley de Promoción de la Inversión en la Amazonía", tal como se puede evidenciar de la información contenida en el Informe n.º</w:t>
+        <w:t xml:space="preserve">103-99-EF – “Reglamento de las Disposiciones Tributarias contenidas en la Ley de Promoción de la Inversión en la Amazonía", tal como se puede evidenciar de la información contenida en el </w:t>
+      </w:r>
+      <w:r>
+        <w:rPr>
+          <w:rFonts w:ascii="Arial" w:hAnsi="Arial" w:cs="Arial"/>
+          <w:color w:val="000000" w:themeColor="text1"/>
+          <w:sz w:val="22"/>
+          <w:szCs w:val="22"/>
+        </w:rPr>
+        <w:t>i</w:t>
+      </w:r>
+      <w:r>
+        <w:rPr>
+          <w:rFonts w:ascii="Arial" w:hAnsi="Arial" w:cs="Arial"/>
+          <w:color w:val="000000" w:themeColor="text1"/>
+          <w:sz w:val="22"/>
+          <w:szCs w:val="22"/>
+        </w:rPr>
+        <w:t>nforme n.º</w:t>
       </w:r>
       <w:r>
         <w:rPr>
@@ -5804,6 +6138,7 @@
           <w:szCs w:val="22"/>
         </w:rPr>
       </w:pPr>
+      <w:proofErr w:type="gramStart"/>
       <w:r>
         <w:rPr>
           <w:rFonts w:ascii="Arial" w:hAnsi="Arial" w:cs="Arial"/>
@@ -5811,7 +6146,16 @@
           <w:szCs w:val="22"/>
         </w:rPr>
         <w:lastRenderedPageBreak/>
-        <w:t>De acuerdo a lo requerido por la empresa importadora, se determina lo siguiente:</w:t>
+        <w:t>De acuerdo a</w:t>
+      </w:r>
+      <w:proofErr w:type="gramEnd"/>
+      <w:r>
+        <w:rPr>
+          <w:rFonts w:ascii="Arial" w:hAnsi="Arial" w:cs="Arial"/>
+          <w:sz w:val="22"/>
+          <w:szCs w:val="22"/>
+        </w:rPr>
+        <w:t xml:space="preserve"> lo requerido por la empresa importadora, se determina lo siguiente:</w:t>
       </w:r>
     </w:p>
     <w:p>
@@ -6224,7 +6568,16 @@
                 <w:sz w:val="20"/>
                 <w:szCs w:val="20"/>
               </w:rPr>
-              <w:t>fromDam-descripcionMerca</w:t>
+              <w:t>fromDam-</w:t>
+            </w:r>
+            <w:proofErr w:type="gramStart"/>
+            <w:r>
+              <w:rPr>
+                <w:rFonts w:ascii="Arial" w:hAnsi="Arial" w:cs="Arial"/>
+                <w:sz w:val="20"/>
+                <w:szCs w:val="20"/>
+              </w:rPr>
+              <w:t>descripcionMerca</w:t>
             </w:r>
             <w:proofErr w:type="spellEnd"/>
             <w:r>
@@ -6247,6 +6600,7 @@
               <w:t>{</w:t>
             </w:r>
             <w:proofErr w:type="spellStart"/>
+            <w:proofErr w:type="gramEnd"/>
             <w:r>
               <w:rPr>
                 <w:rFonts w:ascii="Arial" w:hAnsi="Arial" w:cs="Arial"/>
@@ -6543,7 +6897,16 @@
           <w:sz w:val="20"/>
           <w:szCs w:val="20"/>
         </w:rPr>
-        <w:t>fromDam-bultosReconocidos</w:t>
+        <w:t>fromDam-</w:t>
+      </w:r>
+      <w:proofErr w:type="gramStart"/>
+      <w:r>
+        <w:rPr>
+          <w:rFonts w:ascii="Arial" w:hAnsi="Arial" w:cs="Arial"/>
+          <w:sz w:val="20"/>
+          <w:szCs w:val="20"/>
+        </w:rPr>
+        <w:t>bultosReconocidos</w:t>
       </w:r>
       <w:proofErr w:type="spellEnd"/>
       <w:r>
@@ -6566,6 +6929,7 @@
         <w:t>{</w:t>
       </w:r>
       <w:proofErr w:type="spellStart"/>
+      <w:proofErr w:type="gramEnd"/>
       <w:r>
         <w:rPr>
           <w:rFonts w:ascii="Arial" w:hAnsi="Arial" w:cs="Arial"/>
@@ -6725,9 +7089,9 @@
           <w:sz w:val="20"/>
           <w:szCs w:val="20"/>
         </w:rPr>
-        <w:t>fromInputs-lugarAforoRRR</w:t>
-      </w:r>
-      <w:proofErr w:type="spellEnd"/>
+        <w:t>fromInputs-</w:t>
+      </w:r>
+      <w:proofErr w:type="gramStart"/>
       <w:r>
         <w:rPr>
           <w:rFonts w:ascii="Arial" w:hAnsi="Arial" w:cs="Arial"/>
@@ -6737,17 +7101,30 @@
           <w:sz w:val="20"/>
           <w:szCs w:val="20"/>
         </w:rPr>
-        <w:t>}</w:t>
-      </w:r>
-      <w:r>
-        <w:rPr>
-          <w:rFonts w:ascii="Arial" w:hAnsi="Arial" w:cs="Arial"/>
+        <w:t>lugarAforoRRR</w:t>
+      </w:r>
+      <w:proofErr w:type="spellEnd"/>
+      <w:r>
+        <w:rPr>
+          <w:rFonts w:ascii="Arial" w:hAnsi="Arial" w:cs="Arial"/>
+          <w:b/>
+          <w:bCs/>
+          <w:color w:val="FF0000"/>
           <w:sz w:val="20"/>
           <w:szCs w:val="20"/>
         </w:rPr>
+        <w:t>}</w:t>
+      </w:r>
+      <w:r>
+        <w:rPr>
+          <w:rFonts w:ascii="Arial" w:hAnsi="Arial" w:cs="Arial"/>
+          <w:sz w:val="20"/>
+          <w:szCs w:val="20"/>
+        </w:rPr>
         <w:t>{</w:t>
       </w:r>
       <w:proofErr w:type="spellStart"/>
+      <w:proofErr w:type="gramEnd"/>
       <w:r>
         <w:rPr>
           <w:rFonts w:ascii="Arial" w:hAnsi="Arial" w:cs="Arial"/>
@@ -7075,6 +7452,7 @@
               </w:rPr>
               <w:t>{#</w:t>
             </w:r>
+            <w:proofErr w:type="gramStart"/>
             <w:r>
               <w:rPr>
                 <w:rFonts w:ascii="Arial" w:hAnsi="Arial" w:cs="Arial"/>
@@ -7086,7 +7464,15 @@
                 <w:rFonts w:ascii="Arial" w:eastAsiaTheme="minorHAnsi" w:hAnsi="Arial" w:cs="Arial"/>
                 <w:lang w:eastAsia="en-US"/>
               </w:rPr>
-              <w:t>}{numeroGuia}</w:t>
+              <w:t>}{</w:t>
+            </w:r>
+            <w:proofErr w:type="gramEnd"/>
+            <w:r>
+              <w:rPr>
+                <w:rFonts w:ascii="Arial" w:eastAsiaTheme="minorHAnsi" w:hAnsi="Arial" w:cs="Arial"/>
+                <w:lang w:eastAsia="en-US"/>
+              </w:rPr>
+              <w:t>numeroGuia}</w:t>
             </w:r>
           </w:p>
         </w:tc>
@@ -7173,12 +7559,21 @@
               </w:rPr>
               <w:t>ruc</w:t>
             </w:r>
+            <w:proofErr w:type="gramStart"/>
             <w:r>
               <w:rPr>
                 <w:rFonts w:ascii="Arial" w:eastAsiaTheme="minorHAnsi" w:hAnsi="Arial" w:cs="Arial"/>
                 <w:lang w:eastAsia="en-US"/>
               </w:rPr>
-              <w:t>}{/}</w:t>
+              <w:t>}{</w:t>
+            </w:r>
+            <w:proofErr w:type="gramEnd"/>
+            <w:r>
+              <w:rPr>
+                <w:rFonts w:ascii="Arial" w:eastAsiaTheme="minorHAnsi" w:hAnsi="Arial" w:cs="Arial"/>
+                <w:lang w:eastAsia="en-US"/>
+              </w:rPr>
+              <w:t>/}</w:t>
             </w:r>
           </w:p>
         </w:tc>
@@ -7418,7 +7813,27 @@
           <w:szCs w:val="20"/>
           <w:lang w:val="es-ES" w:eastAsia="es-ES"/>
         </w:rPr>
-        <w:t xml:space="preserve">Se verificó que lo solicitado a regularización se encuentra negociado en el Arancel Común Anexo al Protocolo Modificatorio del Convenio de Cooperación Aduanero Peruano Colombiano con una tasa Ad/Valorem – </w:t>
+        <w:t>Se verificó que lo solicitado a regularización se encuentra negociado en el Arancel Común Anexo al Protocolo Modificatorio del Convenio de Cooperación Aduanero Peruano Colombiano con una tasa Ad/</w:t>
+      </w:r>
+      <w:r>
+        <w:rPr>
+          <w:rFonts w:ascii="Arial" w:eastAsia="Times New Roman" w:hAnsi="Arial" w:cs="Arial"/>
+          <w:color w:val="000000"/>
+          <w:sz w:val="20"/>
+          <w:szCs w:val="20"/>
+          <w:lang w:val="es-ES" w:eastAsia="es-ES"/>
+        </w:rPr>
+        <w:t>V</w:t>
+      </w:r>
+      <w:r>
+        <w:rPr>
+          <w:rFonts w:ascii="Arial" w:eastAsia="Times New Roman" w:hAnsi="Arial" w:cs="Arial"/>
+          <w:color w:val="000000"/>
+          <w:sz w:val="20"/>
+          <w:szCs w:val="20"/>
+          <w:lang w:val="es-ES" w:eastAsia="es-ES"/>
+        </w:rPr>
+        <w:t xml:space="preserve">alorem – </w:t>
       </w:r>
       <w:r>
         <w:rPr>
@@ -7767,7 +8182,47 @@
                 <w:sz w:val="22"/>
                 <w:szCs w:val="22"/>
               </w:rPr>
-              <w:t>Liquidación Arancel Nacional</w:t>
+              <w:t xml:space="preserve">Liquidación </w:t>
+            </w:r>
+            <w:r>
+              <w:rPr>
+                <w:rFonts w:ascii="Arial" w:hAnsi="Arial" w:cs="Arial"/>
+                <w:b/>
+                <w:bCs/>
+                <w:sz w:val="22"/>
+                <w:szCs w:val="22"/>
+              </w:rPr>
+              <w:t>a</w:t>
+            </w:r>
+            <w:r>
+              <w:rPr>
+                <w:rFonts w:ascii="Arial" w:hAnsi="Arial" w:cs="Arial"/>
+                <w:b/>
+                <w:bCs/>
+                <w:sz w:val="22"/>
+                <w:szCs w:val="22"/>
+              </w:rPr>
+              <w:t xml:space="preserve">rancel </w:t>
+            </w:r>
+            <w:r>
+              <w:rPr>
+                <w:rFonts w:ascii="Arial" w:hAnsi="Arial" w:cs="Arial"/>
+                <w:b/>
+                <w:bCs/>
+                <w:sz w:val="22"/>
+                <w:szCs w:val="22"/>
+              </w:rPr>
+              <w:t>n</w:t>
+            </w:r>
+            <w:r>
+              <w:rPr>
+                <w:rFonts w:ascii="Arial" w:hAnsi="Arial" w:cs="Arial"/>
+                <w:b/>
+                <w:bCs/>
+                <w:sz w:val="22"/>
+                <w:szCs w:val="22"/>
+              </w:rPr>
+              <w:t>acional</w:t>
             </w:r>
           </w:p>
         </w:tc>
@@ -7798,7 +8253,47 @@
                 <w:sz w:val="22"/>
                 <w:szCs w:val="22"/>
               </w:rPr>
-              <w:t>Tributos No Regularizados</w:t>
+              <w:t xml:space="preserve">Tributos </w:t>
+            </w:r>
+            <w:r>
+              <w:rPr>
+                <w:rFonts w:ascii="Arial" w:hAnsi="Arial" w:cs="Arial"/>
+                <w:b/>
+                <w:bCs/>
+                <w:sz w:val="22"/>
+                <w:szCs w:val="22"/>
+              </w:rPr>
+              <w:t>n</w:t>
+            </w:r>
+            <w:r>
+              <w:rPr>
+                <w:rFonts w:ascii="Arial" w:hAnsi="Arial" w:cs="Arial"/>
+                <w:b/>
+                <w:bCs/>
+                <w:sz w:val="22"/>
+                <w:szCs w:val="22"/>
+              </w:rPr>
+              <w:t xml:space="preserve">o </w:t>
+            </w:r>
+            <w:r>
+              <w:rPr>
+                <w:rFonts w:ascii="Arial" w:hAnsi="Arial" w:cs="Arial"/>
+                <w:b/>
+                <w:bCs/>
+                <w:sz w:val="22"/>
+                <w:szCs w:val="22"/>
+              </w:rPr>
+              <w:t>r</w:t>
+            </w:r>
+            <w:r>
+              <w:rPr>
+                <w:rFonts w:ascii="Arial" w:hAnsi="Arial" w:cs="Arial"/>
+                <w:b/>
+                <w:bCs/>
+                <w:sz w:val="22"/>
+                <w:szCs w:val="22"/>
+              </w:rPr>
+              <w:t>egularizados</w:t>
             </w:r>
           </w:p>
         </w:tc>
@@ -7929,14 +8424,13 @@
               </w:rPr>
               <w:t>Ad/</w:t>
             </w:r>
-            <w:proofErr w:type="spellStart"/>
             <w:r>
               <w:rPr>
                 <w:rFonts w:ascii="Arial" w:hAnsi="Arial" w:cs="Arial"/>
                 <w:sz w:val="22"/>
                 <w:szCs w:val="22"/>
               </w:rPr>
-              <w:t>v</w:t>
+              <w:t>V</w:t>
             </w:r>
             <w:r>
               <w:rPr>
@@ -7946,7 +8440,6 @@
               </w:rPr>
               <w:t>alorem</w:t>
             </w:r>
-            <w:proofErr w:type="spellEnd"/>
           </w:p>
         </w:tc>
         <w:tc>
@@ -8654,7 +9147,47 @@
                 <w:sz w:val="18"/>
                 <w:szCs w:val="18"/>
               </w:rPr>
-              <w:t>Liquidación Arancel Nacional</w:t>
+              <w:t xml:space="preserve">Liquidación </w:t>
+            </w:r>
+            <w:r>
+              <w:rPr>
+                <w:rFonts w:ascii="Arial" w:hAnsi="Arial" w:cs="Arial"/>
+                <w:b/>
+                <w:bCs/>
+                <w:sz w:val="18"/>
+                <w:szCs w:val="18"/>
+              </w:rPr>
+              <w:t>a</w:t>
+            </w:r>
+            <w:r>
+              <w:rPr>
+                <w:rFonts w:ascii="Arial" w:hAnsi="Arial" w:cs="Arial"/>
+                <w:b/>
+                <w:bCs/>
+                <w:sz w:val="18"/>
+                <w:szCs w:val="18"/>
+              </w:rPr>
+              <w:t xml:space="preserve">rancel </w:t>
+            </w:r>
+            <w:r>
+              <w:rPr>
+                <w:rFonts w:ascii="Arial" w:hAnsi="Arial" w:cs="Arial"/>
+                <w:b/>
+                <w:bCs/>
+                <w:sz w:val="18"/>
+                <w:szCs w:val="18"/>
+              </w:rPr>
+              <w:t>n</w:t>
+            </w:r>
+            <w:r>
+              <w:rPr>
+                <w:rFonts w:ascii="Arial" w:hAnsi="Arial" w:cs="Arial"/>
+                <w:b/>
+                <w:bCs/>
+                <w:sz w:val="18"/>
+                <w:szCs w:val="18"/>
+              </w:rPr>
+              <w:t>acional</w:t>
             </w:r>
           </w:p>
         </w:tc>
@@ -8685,7 +9218,47 @@
                 <w:sz w:val="18"/>
                 <w:szCs w:val="18"/>
               </w:rPr>
-              <w:t>Tributos No Regularizados</w:t>
+              <w:t xml:space="preserve">Tributos </w:t>
+            </w:r>
+            <w:r>
+              <w:rPr>
+                <w:rFonts w:ascii="Arial" w:hAnsi="Arial" w:cs="Arial"/>
+                <w:b/>
+                <w:bCs/>
+                <w:sz w:val="18"/>
+                <w:szCs w:val="18"/>
+              </w:rPr>
+              <w:t>n</w:t>
+            </w:r>
+            <w:r>
+              <w:rPr>
+                <w:rFonts w:ascii="Arial" w:hAnsi="Arial" w:cs="Arial"/>
+                <w:b/>
+                <w:bCs/>
+                <w:sz w:val="18"/>
+                <w:szCs w:val="18"/>
+              </w:rPr>
+              <w:t xml:space="preserve">o </w:t>
+            </w:r>
+            <w:r>
+              <w:rPr>
+                <w:rFonts w:ascii="Arial" w:hAnsi="Arial" w:cs="Arial"/>
+                <w:b/>
+                <w:bCs/>
+                <w:sz w:val="18"/>
+                <w:szCs w:val="18"/>
+              </w:rPr>
+              <w:t>r</w:t>
+            </w:r>
+            <w:r>
+              <w:rPr>
+                <w:rFonts w:ascii="Arial" w:hAnsi="Arial" w:cs="Arial"/>
+                <w:b/>
+                <w:bCs/>
+                <w:sz w:val="18"/>
+                <w:szCs w:val="18"/>
+              </w:rPr>
+              <w:t>egularizados</w:t>
             </w:r>
           </w:p>
         </w:tc>
@@ -8805,6 +9378,7 @@
               </w:rPr>
               <w:t xml:space="preserve">Ley </w:t>
             </w:r>
+            <w:proofErr w:type="gramStart"/>
             <w:r>
               <w:rPr>
                 <w:rFonts w:ascii="Arial" w:hAnsi="Arial" w:cs="Arial"/>
@@ -8823,7 +9397,18 @@
                 <w:sz w:val="20"/>
                 <w:szCs w:val="20"/>
               </w:rPr>
-              <w:t>.º27037</w:t>
+              <w:t>.º</w:t>
+            </w:r>
+            <w:proofErr w:type="gramEnd"/>
+            <w:r>
+              <w:rPr>
+                <w:rFonts w:ascii="Arial" w:hAnsi="Arial" w:cs="Arial"/>
+                <w:b/>
+                <w:bCs/>
+                <w:sz w:val="20"/>
+                <w:szCs w:val="20"/>
+              </w:rPr>
+              <w:t>27037</w:t>
             </w:r>
           </w:p>
         </w:tc>
@@ -8853,14 +9438,13 @@
               </w:rPr>
               <w:t>Ad/</w:t>
             </w:r>
-            <w:proofErr w:type="spellStart"/>
             <w:r>
               <w:rPr>
                 <w:rFonts w:ascii="Arial" w:hAnsi="Arial" w:cs="Arial"/>
                 <w:sz w:val="20"/>
                 <w:szCs w:val="20"/>
               </w:rPr>
-              <w:t>v</w:t>
+              <w:t>V</w:t>
             </w:r>
             <w:r>
               <w:rPr>
@@ -8870,7 +9454,6 @@
               </w:rPr>
               <w:t>alorem</w:t>
             </w:r>
-            <w:proofErr w:type="spellEnd"/>
           </w:p>
         </w:tc>
         <w:tc>
@@ -9797,7 +10380,47 @@
                 <w:sz w:val="18"/>
                 <w:szCs w:val="18"/>
               </w:rPr>
-              <w:t>Liquidación Arancel Nacional</w:t>
+              <w:t xml:space="preserve">Liquidación </w:t>
+            </w:r>
+            <w:r>
+              <w:rPr>
+                <w:rFonts w:ascii="Arial" w:hAnsi="Arial" w:cs="Arial"/>
+                <w:b/>
+                <w:bCs/>
+                <w:sz w:val="18"/>
+                <w:szCs w:val="18"/>
+              </w:rPr>
+              <w:t>a</w:t>
+            </w:r>
+            <w:r>
+              <w:rPr>
+                <w:rFonts w:ascii="Arial" w:hAnsi="Arial" w:cs="Arial"/>
+                <w:b/>
+                <w:bCs/>
+                <w:sz w:val="18"/>
+                <w:szCs w:val="18"/>
+              </w:rPr>
+              <w:t xml:space="preserve">rancel </w:t>
+            </w:r>
+            <w:r>
+              <w:rPr>
+                <w:rFonts w:ascii="Arial" w:hAnsi="Arial" w:cs="Arial"/>
+                <w:b/>
+                <w:bCs/>
+                <w:sz w:val="18"/>
+                <w:szCs w:val="18"/>
+              </w:rPr>
+              <w:t>n</w:t>
+            </w:r>
+            <w:r>
+              <w:rPr>
+                <w:rFonts w:ascii="Arial" w:hAnsi="Arial" w:cs="Arial"/>
+                <w:b/>
+                <w:bCs/>
+                <w:sz w:val="18"/>
+                <w:szCs w:val="18"/>
+              </w:rPr>
+              <w:t>acional</w:t>
             </w:r>
           </w:p>
         </w:tc>
@@ -9828,7 +10451,47 @@
                 <w:sz w:val="18"/>
                 <w:szCs w:val="18"/>
               </w:rPr>
-              <w:t>Tributos No Regularizados</w:t>
+              <w:t xml:space="preserve">Tributos </w:t>
+            </w:r>
+            <w:r>
+              <w:rPr>
+                <w:rFonts w:ascii="Arial" w:hAnsi="Arial" w:cs="Arial"/>
+                <w:b/>
+                <w:bCs/>
+                <w:sz w:val="18"/>
+                <w:szCs w:val="18"/>
+              </w:rPr>
+              <w:t>n</w:t>
+            </w:r>
+            <w:r>
+              <w:rPr>
+                <w:rFonts w:ascii="Arial" w:hAnsi="Arial" w:cs="Arial"/>
+                <w:b/>
+                <w:bCs/>
+                <w:sz w:val="18"/>
+                <w:szCs w:val="18"/>
+              </w:rPr>
+              <w:t xml:space="preserve">o </w:t>
+            </w:r>
+            <w:r>
+              <w:rPr>
+                <w:rFonts w:ascii="Arial" w:hAnsi="Arial" w:cs="Arial"/>
+                <w:b/>
+                <w:bCs/>
+                <w:sz w:val="18"/>
+                <w:szCs w:val="18"/>
+              </w:rPr>
+              <w:t>r</w:t>
+            </w:r>
+            <w:r>
+              <w:rPr>
+                <w:rFonts w:ascii="Arial" w:hAnsi="Arial" w:cs="Arial"/>
+                <w:b/>
+                <w:bCs/>
+                <w:sz w:val="18"/>
+                <w:szCs w:val="18"/>
+              </w:rPr>
+              <w:t>egularizados</w:t>
             </w:r>
           </w:p>
         </w:tc>
@@ -9918,14 +10581,13 @@
               </w:rPr>
               <w:t>Ad/</w:t>
             </w:r>
-            <w:proofErr w:type="spellStart"/>
             <w:r>
               <w:rPr>
                 <w:rFonts w:ascii="Arial" w:hAnsi="Arial" w:cs="Arial"/>
                 <w:sz w:val="20"/>
                 <w:szCs w:val="20"/>
               </w:rPr>
-              <w:t>v</w:t>
+              <w:t>V</w:t>
             </w:r>
             <w:r>
               <w:rPr>
@@ -9935,7 +10597,6 @@
               </w:rPr>
               <w:t>alorem</w:t>
             </w:r>
-            <w:proofErr w:type="spellEnd"/>
           </w:p>
         </w:tc>
         <w:tc>
@@ -11256,7 +11917,21 @@
           <w:rFonts w:ascii="Arial" w:hAnsi="Arial" w:cs="Arial"/>
           <w:color w:val="000000" w:themeColor="text1"/>
         </w:rPr>
-        <w:t>107-94-EF/10; por lo tanto, corresponde atender las series de la referida DAM solicitadas a regularización toda vez que se encuentran negociadas en el Arancel Común del Convenio Peruano - Colombiano con una tasa Ad/Valorem – Libre; asimismo, se debe tener en cuenta lo opinado en el informe n.º 50-2008-SUNAT/2B4000, ratificado mediante Informe n.º 11-2017-SUNAT/340000, donde dice que: “la devolución de los tributos pagados a cuenta, como regularización del despacho de mercancía acogidas estrictamente a los beneficios arancelarios otorgados por el PECO, comprende únicamente los derechos Ad/Valorem cancelados de las mercancías liberadas total o parcialmente por acogimiento del PECO; determinándose que el monto a regularizar en el marco del Decreto Supremo n.º 015-94-EF es de S/ {</w:t>
+        <w:t xml:space="preserve">107-94-EF/10; por lo tanto, corresponde atender las series de la referida DAM solicitadas a regularización toda vez que se encuentran negociadas en el Arancel Común del Convenio Peruano - Colombiano con una tasa Ad/Valorem – Libre; asimismo, se debe tener en cuenta lo opinado en el informe n.º 50-2008-SUNAT/2B4000, ratificado mediante </w:t>
+      </w:r>
+      <w:r>
+        <w:rPr>
+          <w:rFonts w:ascii="Arial" w:hAnsi="Arial" w:cs="Arial"/>
+          <w:color w:val="000000" w:themeColor="text1"/>
+        </w:rPr>
+        <w:t>i</w:t>
+      </w:r>
+      <w:r>
+        <w:rPr>
+          <w:rFonts w:ascii="Arial" w:hAnsi="Arial" w:cs="Arial"/>
+          <w:color w:val="000000" w:themeColor="text1"/>
+        </w:rPr>
+        <w:t>nforme n.º 11-2017-SUNAT/340000, donde dice que: “la devolución de los tributos pagados a cuenta, como regularización del despacho de mercancía acogidas estrictamente a los beneficios arancelarios otorgados por el PECO, comprende únicamente los derechos Ad/Valorem cancelados de las mercancías liberadas total o parcialmente por acogimiento del PECO; determinándose que el monto a regularizar en el marco del Decreto Supremo n.º 015-94-EF es de S/ {</w:t>
       </w:r>
       <w:proofErr w:type="spellStart"/>
       <w:r>
@@ -11528,7 +12203,43 @@
           <w:sz w:val="22"/>
           <w:szCs w:val="22"/>
         </w:rPr>
-        <w:t>107-94-EF/10; por lo tanto, corresponde atender las series de la referida DAM solicitadas a regularización toda vez que se encuentran negociadas en el Arancel Común del Convenio Peruano - Colombiano con una tasa Ad/Valorem – Libre; asimismo, se debe tener en cuenta lo opinado en el informe n.º 50-2008-SUNAT/2B4000, ratificado mediante Informe n.º 11-2017-SUNAT/340000, donde dice que: “la devolución de los tributos pagados a cuenta, como regularización del despacho de mercancía acogidas estrictamente a los beneficios arancelarios otorgados por el PECO, comprende únicamente los derechos Ad/Valorem cancelados de las mercancías liberadas total o parcialmente por acogimiento del PECO; determinándose que el monto a regularizar en el marco del Decreto Supremo n.º 015-94-EF es de S/ {</w:t>
+        <w:t xml:space="preserve">107-94-EF/10; por lo tanto, corresponde atender las series de la referida DAM solicitadas a regularización toda vez que se encuentran negociadas en el Arancel Común del Convenio Peruano - Colombiano con una tasa Ad/Valorem – Libre; asimismo, se debe tener en cuenta lo opinado en el </w:t>
+      </w:r>
+      <w:r>
+        <w:rPr>
+          <w:rFonts w:ascii="Arial" w:hAnsi="Arial" w:cs="Arial"/>
+          <w:color w:val="000000" w:themeColor="text1"/>
+          <w:sz w:val="22"/>
+          <w:szCs w:val="22"/>
+        </w:rPr>
+        <w:t>i</w:t>
+      </w:r>
+      <w:r>
+        <w:rPr>
+          <w:rFonts w:ascii="Arial" w:hAnsi="Arial" w:cs="Arial"/>
+          <w:color w:val="000000" w:themeColor="text1"/>
+          <w:sz w:val="22"/>
+          <w:szCs w:val="22"/>
+        </w:rPr>
+        <w:t xml:space="preserve">nforme n.º 50-2008-SUNAT/2B4000, ratificado mediante </w:t>
+      </w:r>
+      <w:r>
+        <w:rPr>
+          <w:rFonts w:ascii="Arial" w:hAnsi="Arial" w:cs="Arial"/>
+          <w:color w:val="000000" w:themeColor="text1"/>
+          <w:sz w:val="22"/>
+          <w:szCs w:val="22"/>
+        </w:rPr>
+        <w:t>i</w:t>
+      </w:r>
+      <w:r>
+        <w:rPr>
+          <w:rFonts w:ascii="Arial" w:hAnsi="Arial" w:cs="Arial"/>
+          <w:color w:val="000000" w:themeColor="text1"/>
+          <w:sz w:val="22"/>
+          <w:szCs w:val="22"/>
+        </w:rPr>
+        <w:t>nforme n.º 11-2017-SUNAT/340000, donde dice que: “la devolución de los tributos pagados a cuenta, como regularización del despacho de mercancía acogidas estrictamente a los beneficios arancelarios otorgados por el PECO, comprende únicamente los derechos Ad/Valorem cancelados de las mercancías liberadas total o parcialmente por acogimiento del PECO; determinándose que el monto a regularizar en el marco del Decreto Supremo n.º 015-94-EF es de S/ {</w:t>
       </w:r>
       <w:proofErr w:type="spellStart"/>
       <w:r>
@@ -11626,14 +12337,22 @@
           <w:rFonts w:ascii="Arial" w:hAnsi="Arial"/>
           <w:color w:val="000000" w:themeColor="text1"/>
         </w:rPr>
-        <w:t>datosFactura-numeroReqFac</w:t>
-      </w:r>
-      <w:proofErr w:type="spellEnd"/>
+        <w:t>datosFactura-</w:t>
+      </w:r>
+      <w:proofErr w:type="gramStart"/>
       <w:r>
         <w:rPr>
           <w:rFonts w:ascii="Arial" w:hAnsi="Arial"/>
           <w:color w:val="000000" w:themeColor="text1"/>
         </w:rPr>
+        <w:t>numeroReqFac</w:t>
+      </w:r>
+      <w:proofErr w:type="spellEnd"/>
+      <w:r>
+        <w:rPr>
+          <w:rFonts w:ascii="Arial" w:hAnsi="Arial"/>
+          <w:color w:val="000000" w:themeColor="text1"/>
+        </w:rPr>
         <w:t>}</w:t>
       </w:r>
       <w:r>
@@ -11646,6 +12365,7 @@
         <w:t>{</w:t>
       </w:r>
       <w:proofErr w:type="spellStart"/>
+      <w:proofErr w:type="gramEnd"/>
       <w:r>
         <w:rPr>
           <w:rFonts w:ascii="Arial" w:hAnsi="Arial"/>
@@ -12142,14 +12862,22 @@
           <w:rFonts w:ascii="Arial" w:hAnsi="Arial"/>
           <w:color w:val="000000" w:themeColor="text1"/>
         </w:rPr>
-        <w:t>datosFactura-numeroReqFac</w:t>
-      </w:r>
-      <w:proofErr w:type="spellEnd"/>
+        <w:t>datosFactura-</w:t>
+      </w:r>
+      <w:proofErr w:type="gramStart"/>
       <w:r>
         <w:rPr>
           <w:rFonts w:ascii="Arial" w:hAnsi="Arial"/>
           <w:color w:val="000000" w:themeColor="text1"/>
         </w:rPr>
+        <w:t>numeroReqFac</w:t>
+      </w:r>
+      <w:proofErr w:type="spellEnd"/>
+      <w:r>
+        <w:rPr>
+          <w:rFonts w:ascii="Arial" w:hAnsi="Arial"/>
+          <w:color w:val="000000" w:themeColor="text1"/>
+        </w:rPr>
         <w:t>}</w:t>
       </w:r>
       <w:r>
@@ -12162,6 +12890,7 @@
         <w:t>{</w:t>
       </w:r>
       <w:proofErr w:type="spellStart"/>
+      <w:proofErr w:type="gramEnd"/>
       <w:r>
         <w:rPr>
           <w:rFonts w:ascii="Arial" w:hAnsi="Arial"/>
@@ -12700,6 +13429,13 @@
           <w:color w:val="000000" w:themeColor="text1"/>
         </w:rPr>
         <w:t>.º 28194 “Ley para la Lucha contra la Evasión y para la Formalización de la Economía” establece en su artículo 3-A la obligatoriedad del uso de medios de pago en la compraventa internacional de mercancías, en tal sentido, se procedió a evaluar la factura remitida por el administrado y los medios de pago adjuntados, por lo cual sí acreditó los medios de pago correspondiente</w:t>
+      </w:r>
+      <w:r>
+        <w:rPr>
+          <w:rFonts w:ascii="Arial" w:hAnsi="Arial"/>
+          <w:color w:val="000000" w:themeColor="text1"/>
+        </w:rPr>
+        <w:t>s</w:t>
       </w:r>
       <w:r>
         <w:rPr>
@@ -13838,25 +14574,7 @@
           <w:sz w:val="22"/>
           <w:szCs w:val="22"/>
         </w:rPr>
-        <w:t>Autorizar la devolución por el importe de S/ {</w:t>
-      </w:r>
-      <w:proofErr w:type="spellStart"/>
-      <w:r>
-        <w:rPr>
-          <w:rFonts w:ascii="Arial" w:hAnsi="Arial" w:cs="Arial"/>
-          <w:sz w:val="22"/>
-          <w:szCs w:val="22"/>
-        </w:rPr>
-        <w:t>textoTotReguPECO</w:t>
-      </w:r>
-      <w:proofErr w:type="spellEnd"/>
-      <w:r>
-        <w:rPr>
-          <w:rFonts w:ascii="Arial" w:hAnsi="Arial" w:cs="Arial"/>
-          <w:sz w:val="22"/>
-          <w:szCs w:val="22"/>
-        </w:rPr>
-        <w:t>} en el marco del Decreto Supremo n.º 015-94-EF y normas conexas, a favor de {</w:t>
+        <w:t>Autorizar la devolución por el importe de S/ {textoTotRegu27} en el marco del Decreto Supremo n.º 015-94-EF y normas conexas, a favor de {</w:t>
       </w:r>
       <w:proofErr w:type="spellStart"/>
       <w:r>
@@ -14005,7 +14723,7 @@
 </file>
 
 <file path=word/numbering.xml><?xml version="1.0" encoding="utf-8"?>
-<w:numbering xmlns:wpc="http://schemas.microsoft.com/office/word/2010/wordprocessingCanvas" xmlns:cx="http://schemas.microsoft.com/office/drawing/2014/chartex" xmlns:cx1="http://schemas.microsoft.com/office/drawing/2015/9/8/chartex" xmlns:cx2="http://schemas.microsoft.com/office/drawing/2015/10/21/chartex" xmlns:cx3="http://schemas.microsoft.com/office/drawing/2016/5/9/chartex" xmlns:cx4="http://schemas.microsoft.com/office/drawing/2016/5/10/chartex" xmlns:cx5="http://schemas.microsoft.com/office/drawing/2016/5/11/chartex" xmlns:cx6="http://schemas.microsoft.com/office/drawing/2016/5/12/chartex" xmlns:cx7="http://schemas.microsoft.com/office/drawing/2016/5/13/chartex" xmlns:cx8="http://schemas.microsoft.com/office/drawing/2016/5/14/chartex" xmlns:mc="http://schemas.openxmlformats.org/markup-compatibility/2006" xmlns:aink="http://schemas.microsoft.com/office/drawing/2016/ink" xmlns:am3d="http://schemas.microsoft.com/office/drawing/2017/model3d" xmlns:o="urn:schemas-microsoft-com:office:office" xmlns:oel="http://schemas.microsoft.com/office/2019/extlst" xmlns:r="http://schemas.openxmlformats.org/officeDocument/2006/relationships" xmlns:m="http://schemas.openxmlformats.org/officeDocument/2006/math" xmlns:v="urn:schemas-microsoft-com:vml" xmlns:wp14="http://schemas.microsoft.com/office/word/2010/wordprocessingDrawing" xmlns:wp="http://schemas.openxmlformats.org/drawingml/2006/wordprocessingDrawing" xmlns:w10="urn:schemas-microsoft-com:office:word" xmlns:w="http://schemas.openxmlformats.org/wordprocessingml/2006/main" xmlns:w14="http://schemas.microsoft.com/office/word/2010/wordml" xmlns:w15="http://schemas.microsoft.com/office/word/2012/wordml" xmlns:w16cex="http://schemas.microsoft.com/office/word/2018/wordml/cex" xmlns:w16cid="http://schemas.microsoft.com/office/word/2016/wordml/cid" xmlns:w16="http://schemas.microsoft.com/office/word/2018/wordml" xmlns:w16sdtdh="http://schemas.microsoft.com/office/word/2020/wordml/sdtdatahash" xmlns:w16se="http://schemas.microsoft.com/office/word/2015/wordml/symex" xmlns:wpg="http://schemas.microsoft.com/office/word/2010/wordprocessingGroup" xmlns:wpi="http://schemas.microsoft.com/office/word/2010/wordprocessingInk" xmlns:wne="http://schemas.microsoft.com/office/word/2006/wordml" xmlns:wps="http://schemas.microsoft.com/office/word/2010/wordprocessingShape" mc:Ignorable="w14 w15 w16se w16cid w16 w16cex w16sdtdh wp14">
+<w:numbering xmlns:wpc="http://schemas.microsoft.com/office/word/2010/wordprocessingCanvas" xmlns:cx="http://schemas.microsoft.com/office/drawing/2014/chartex" xmlns:cx1="http://schemas.microsoft.com/office/drawing/2015/9/8/chartex" xmlns:cx2="http://schemas.microsoft.com/office/drawing/2015/10/21/chartex" xmlns:cx3="http://schemas.microsoft.com/office/drawing/2016/5/9/chartex" xmlns:cx4="http://schemas.microsoft.com/office/drawing/2016/5/10/chartex" xmlns:cx5="http://schemas.microsoft.com/office/drawing/2016/5/11/chartex" xmlns:cx6="http://schemas.microsoft.com/office/drawing/2016/5/12/chartex" xmlns:cx7="http://schemas.microsoft.com/office/drawing/2016/5/13/chartex" xmlns:cx8="http://schemas.microsoft.com/office/drawing/2016/5/14/chartex" xmlns:mc="http://schemas.openxmlformats.org/markup-compatibility/2006" xmlns:aink="http://schemas.microsoft.com/office/drawing/2016/ink" xmlns:am3d="http://schemas.microsoft.com/office/drawing/2017/model3d" xmlns:o="urn:schemas-microsoft-com:office:office" xmlns:oel="http://schemas.microsoft.com/office/2019/extlst" xmlns:r="http://schemas.openxmlformats.org/officeDocument/2006/relationships" xmlns:m="http://schemas.openxmlformats.org/officeDocument/2006/math" xmlns:v="urn:schemas-microsoft-com:vml" xmlns:wp14="http://schemas.microsoft.com/office/word/2010/wordprocessingDrawing" xmlns:wp="http://schemas.openxmlformats.org/drawingml/2006/wordprocessingDrawing" xmlns:w10="urn:schemas-microsoft-com:office:word" xmlns:w="http://schemas.openxmlformats.org/wordprocessingml/2006/main" xmlns:w14="http://schemas.microsoft.com/office/word/2010/wordml" xmlns:w15="http://schemas.microsoft.com/office/word/2012/wordml" xmlns:w16cex="http://schemas.microsoft.com/office/word/2018/wordml/cex" xmlns:w16cid="http://schemas.microsoft.com/office/word/2016/wordml/cid" xmlns:w16="http://schemas.microsoft.com/office/word/2018/wordml" xmlns:w16du="http://schemas.microsoft.com/office/word/2023/wordml/word16du" xmlns:w16sdtdh="http://schemas.microsoft.com/office/word/2020/wordml/sdtdatahash" xmlns:w16se="http://schemas.microsoft.com/office/word/2015/wordml/symex" xmlns:wpg="http://schemas.microsoft.com/office/word/2010/wordprocessingGroup" xmlns:wpi="http://schemas.microsoft.com/office/word/2010/wordprocessingInk" xmlns:wne="http://schemas.microsoft.com/office/word/2006/wordml" xmlns:wps="http://schemas.microsoft.com/office/word/2010/wordprocessingShape" mc:Ignorable="w14 w15 w16se w16cid w16 w16cex w16sdtdh w16du wp14">
   <w:abstractNum w:abstractNumId="0" w15:restartNumberingAfterBreak="0">
     <w:nsid w:val="0F643300"/>
     <w:multiLevelType w:val="hybridMultilevel"/>
@@ -16256,7 +16974,7 @@
 </file>
 
 <file path=word/styles.xml><?xml version="1.0" encoding="utf-8"?>
-<w:styles xmlns:mc="http://schemas.openxmlformats.org/markup-compatibility/2006" xmlns:r="http://schemas.openxmlformats.org/officeDocument/2006/relationships" xmlns:w="http://schemas.openxmlformats.org/wordprocessingml/2006/main" xmlns:w14="http://schemas.microsoft.com/office/word/2010/wordml" xmlns:w15="http://schemas.microsoft.com/office/word/2012/wordml" xmlns:w16cex="http://schemas.microsoft.com/office/word/2018/wordml/cex" xmlns:w16cid="http://schemas.microsoft.com/office/word/2016/wordml/cid" xmlns:w16="http://schemas.microsoft.com/office/word/2018/wordml" xmlns:w16sdtdh="http://schemas.microsoft.com/office/word/2020/wordml/sdtdatahash" xmlns:w16se="http://schemas.microsoft.com/office/word/2015/wordml/symex" mc:Ignorable="w14 w15 w16se w16cid w16 w16cex w16sdtdh">
+<w:styles xmlns:mc="http://schemas.openxmlformats.org/markup-compatibility/2006" xmlns:r="http://schemas.openxmlformats.org/officeDocument/2006/relationships" xmlns:w="http://schemas.openxmlformats.org/wordprocessingml/2006/main" xmlns:w14="http://schemas.microsoft.com/office/word/2010/wordml" xmlns:w15="http://schemas.microsoft.com/office/word/2012/wordml" xmlns:w16cex="http://schemas.microsoft.com/office/word/2018/wordml/cex" xmlns:w16cid="http://schemas.microsoft.com/office/word/2016/wordml/cid" xmlns:w16="http://schemas.microsoft.com/office/word/2018/wordml" xmlns:w16du="http://schemas.microsoft.com/office/word/2023/wordml/word16du" xmlns:w16sdtdh="http://schemas.microsoft.com/office/word/2020/wordml/sdtdatahash" xmlns:w16se="http://schemas.microsoft.com/office/word/2015/wordml/symex" mc:Ignorable="w14 w15 w16se w16cid w16 w16cex w16sdtdh w16du">
   <w:docDefaults>
     <w:rPrDefault>
       <w:rPr>

</xml_diff>

<commit_message>
corregido formatos informe part
</commit_message>
<xml_diff>
--- a/recursos/words/semiPlantillaFinalInformeV2NUEVO.docx
+++ b/recursos/words/semiPlantillaFinalInformeV2NUEVO.docx
@@ -1,6 +1,6 @@
 
 <file path=word/document.xml><?xml version="1.0" encoding="utf-8"?>
-<w:document xmlns:wpc="http://schemas.microsoft.com/office/word/2010/wordprocessingCanvas" xmlns:cx="http://schemas.microsoft.com/office/drawing/2014/chartex" xmlns:cx1="http://schemas.microsoft.com/office/drawing/2015/9/8/chartex" xmlns:cx2="http://schemas.microsoft.com/office/drawing/2015/10/21/chartex" xmlns:cx3="http://schemas.microsoft.com/office/drawing/2016/5/9/chartex" xmlns:cx4="http://schemas.microsoft.com/office/drawing/2016/5/10/chartex" xmlns:cx5="http://schemas.microsoft.com/office/drawing/2016/5/11/chartex" xmlns:cx6="http://schemas.microsoft.com/office/drawing/2016/5/12/chartex" xmlns:cx7="http://schemas.microsoft.com/office/drawing/2016/5/13/chartex" xmlns:cx8="http://schemas.microsoft.com/office/drawing/2016/5/14/chartex" xmlns:mc="http://schemas.openxmlformats.org/markup-compatibility/2006" xmlns:aink="http://schemas.microsoft.com/office/drawing/2016/ink" xmlns:am3d="http://schemas.microsoft.com/office/drawing/2017/model3d" xmlns:o="urn:schemas-microsoft-com:office:office" xmlns:oel="http://schemas.microsoft.com/office/2019/extlst" xmlns:r="http://schemas.openxmlformats.org/officeDocument/2006/relationships" xmlns:m="http://schemas.openxmlformats.org/officeDocument/2006/math" xmlns:v="urn:schemas-microsoft-com:vml" xmlns:wp14="http://schemas.microsoft.com/office/word/2010/wordprocessingDrawing" xmlns:wp="http://schemas.openxmlformats.org/drawingml/2006/wordprocessingDrawing" xmlns:w10="urn:schemas-microsoft-com:office:word" xmlns:w="http://schemas.openxmlformats.org/wordprocessingml/2006/main" xmlns:w14="http://schemas.microsoft.com/office/word/2010/wordml" xmlns:w15="http://schemas.microsoft.com/office/word/2012/wordml" xmlns:w16cex="http://schemas.microsoft.com/office/word/2018/wordml/cex" xmlns:w16cid="http://schemas.microsoft.com/office/word/2016/wordml/cid" xmlns:w16="http://schemas.microsoft.com/office/word/2018/wordml" xmlns:w16du="http://schemas.microsoft.com/office/word/2023/wordml/word16du" xmlns:w16sdtdh="http://schemas.microsoft.com/office/word/2020/wordml/sdtdatahash" xmlns:w16se="http://schemas.microsoft.com/office/word/2015/wordml/symex" xmlns:wpg="http://schemas.microsoft.com/office/word/2010/wordprocessingGroup" xmlns:wpi="http://schemas.microsoft.com/office/word/2010/wordprocessingInk" xmlns:wne="http://schemas.microsoft.com/office/word/2006/wordml" xmlns:wps="http://schemas.microsoft.com/office/word/2010/wordprocessingShape" mc:Ignorable="w14 w15 w16se w16cid w16 w16cex w16sdtdh w16du wp14">
+<w:document xmlns:wpc="http://schemas.microsoft.com/office/word/2010/wordprocessingCanvas" xmlns:cx="http://schemas.microsoft.com/office/drawing/2014/chartex" xmlns:cx1="http://schemas.microsoft.com/office/drawing/2015/9/8/chartex" xmlns:cx2="http://schemas.microsoft.com/office/drawing/2015/10/21/chartex" xmlns:cx3="http://schemas.microsoft.com/office/drawing/2016/5/9/chartex" xmlns:cx4="http://schemas.microsoft.com/office/drawing/2016/5/10/chartex" xmlns:cx5="http://schemas.microsoft.com/office/drawing/2016/5/11/chartex" xmlns:cx6="http://schemas.microsoft.com/office/drawing/2016/5/12/chartex" xmlns:cx7="http://schemas.microsoft.com/office/drawing/2016/5/13/chartex" xmlns:cx8="http://schemas.microsoft.com/office/drawing/2016/5/14/chartex" xmlns:mc="http://schemas.openxmlformats.org/markup-compatibility/2006" xmlns:aink="http://schemas.microsoft.com/office/drawing/2016/ink" xmlns:am3d="http://schemas.microsoft.com/office/drawing/2017/model3d" xmlns:o="urn:schemas-microsoft-com:office:office" xmlns:oel="http://schemas.microsoft.com/office/2019/extlst" xmlns:r="http://schemas.openxmlformats.org/officeDocument/2006/relationships" xmlns:m="http://schemas.openxmlformats.org/officeDocument/2006/math" xmlns:v="urn:schemas-microsoft-com:vml" xmlns:wp14="http://schemas.microsoft.com/office/word/2010/wordprocessingDrawing" xmlns:wp="http://schemas.openxmlformats.org/drawingml/2006/wordprocessingDrawing" xmlns:w10="urn:schemas-microsoft-com:office:word" xmlns:w="http://schemas.openxmlformats.org/wordprocessingml/2006/main" xmlns:w14="http://schemas.microsoft.com/office/word/2010/wordml" xmlns:w15="http://schemas.microsoft.com/office/word/2012/wordml" xmlns:w16cex="http://schemas.microsoft.com/office/word/2018/wordml/cex" xmlns:w16cid="http://schemas.microsoft.com/office/word/2016/wordml/cid" xmlns:w16="http://schemas.microsoft.com/office/word/2018/wordml" xmlns:w16sdtdh="http://schemas.microsoft.com/office/word/2020/wordml/sdtdatahash" xmlns:w16se="http://schemas.microsoft.com/office/word/2015/wordml/symex" xmlns:wpg="http://schemas.microsoft.com/office/word/2010/wordprocessingGroup" xmlns:wpi="http://schemas.microsoft.com/office/word/2010/wordprocessingInk" xmlns:wne="http://schemas.microsoft.com/office/word/2006/wordml" xmlns:wps="http://schemas.microsoft.com/office/word/2010/wordprocessingShape" mc:Ignorable="w14 w15 w16se w16cid w16 w16cex w16sdtdh wp14">
   <w:body>
     <w:p>
       <w:pPr>
@@ -406,7 +406,6 @@
           <w:rFonts w:ascii="Arial" w:hAnsi="Arial" w:cs="Arial"/>
           <w:sz w:val="22"/>
           <w:szCs w:val="22"/>
-          <w:shd w:val="clear" w:color="auto" w:fill="FAF9F8"/>
         </w:rPr>
         <w:t>R</w:t>
       </w:r>
@@ -415,17 +414,8 @@
           <w:rFonts w:ascii="Arial" w:hAnsi="Arial" w:cs="Arial"/>
           <w:sz w:val="22"/>
           <w:szCs w:val="22"/>
-          <w:shd w:val="clear" w:color="auto" w:fill="FAF9F8"/>
-        </w:rPr>
-        <w:t xml:space="preserve">egularización de DAM n.º </w:t>
-      </w:r>
-      <w:r>
-        <w:rPr>
-          <w:rFonts w:ascii="Arial" w:hAnsi="Arial" w:cs="Arial"/>
-          <w:sz w:val="22"/>
-          <w:szCs w:val="22"/>
-        </w:rPr>
-        <w:t>{</w:t>
+        </w:rPr>
+        <w:t>egularización de DAM n.º {</w:t>
       </w:r>
       <w:proofErr w:type="spellStart"/>
       <w:r>
@@ -503,7 +493,6 @@
           <w:rFonts w:ascii="Arial" w:hAnsi="Arial" w:cs="Arial"/>
           <w:sz w:val="22"/>
           <w:szCs w:val="22"/>
-          <w:shd w:val="clear" w:color="auto" w:fill="FAF9F8"/>
         </w:rPr>
         <w:t>{</w:t>
       </w:r>
@@ -513,7 +502,6 @@
           <w:rFonts w:ascii="Arial" w:hAnsi="Arial" w:cs="Arial"/>
           <w:sz w:val="22"/>
           <w:szCs w:val="22"/>
-          <w:shd w:val="clear" w:color="auto" w:fill="FAF9F8"/>
         </w:rPr>
         <w:t>textoVisto</w:t>
       </w:r>
@@ -523,18 +511,8 @@
           <w:rFonts w:ascii="Arial" w:hAnsi="Arial" w:cs="Arial"/>
           <w:sz w:val="22"/>
           <w:szCs w:val="22"/>
-          <w:shd w:val="clear" w:color="auto" w:fill="FAF9F8"/>
-        </w:rPr>
-        <w:t>}</w:t>
-      </w:r>
-      <w:r>
-        <w:rPr>
-          <w:rFonts w:ascii="Arial" w:hAnsi="Arial" w:cs="Arial"/>
-          <w:sz w:val="22"/>
-          <w:szCs w:val="22"/>
-          <w:shd w:val="clear" w:color="auto" w:fill="FAF9F8"/>
-        </w:rPr>
-        <w:t>.</w:t>
+        </w:rPr>
+        <w:t>}.</w:t>
       </w:r>
     </w:p>
     <w:p>
@@ -640,15 +618,13 @@
           <w:rFonts w:ascii="Arial" w:hAnsi="Arial" w:cs="Arial"/>
           <w:sz w:val="22"/>
           <w:szCs w:val="22"/>
-          <w:shd w:val="clear" w:color="auto" w:fill="FAF9F8"/>
-        </w:rPr>
-      </w:pPr>
-      <w:r>
-        <w:rPr>
-          <w:rFonts w:ascii="Arial" w:hAnsi="Arial" w:cs="Arial"/>
-          <w:sz w:val="22"/>
-          <w:szCs w:val="22"/>
-          <w:shd w:val="clear" w:color="auto" w:fill="FAF9F8"/>
+        </w:rPr>
+      </w:pPr>
+      <w:r>
+        <w:rPr>
+          <w:rFonts w:ascii="Arial" w:hAnsi="Arial" w:cs="Arial"/>
+          <w:sz w:val="22"/>
+          <w:szCs w:val="22"/>
         </w:rPr>
         <w:t>Ley General de Aduanas, Decreto Legislativo </w:t>
       </w:r>
@@ -658,7 +634,6 @@
           <w:rFonts w:ascii="Arial" w:hAnsi="Arial" w:cs="Arial"/>
           <w:sz w:val="22"/>
           <w:szCs w:val="22"/>
-          <w:shd w:val="clear" w:color="auto" w:fill="FAF9F8"/>
         </w:rPr>
         <w:t>n</w:t>
       </w:r>
@@ -667,7 +642,6 @@
           <w:rFonts w:ascii="Arial" w:hAnsi="Arial" w:cs="Arial"/>
           <w:sz w:val="22"/>
           <w:szCs w:val="22"/>
-          <w:shd w:val="clear" w:color="auto" w:fill="FAF9F8"/>
         </w:rPr>
         <w:t>.</w:t>
       </w:r>
@@ -676,7 +650,6 @@
           <w:rFonts w:ascii="Arial" w:hAnsi="Arial" w:cs="Arial"/>
           <w:sz w:val="22"/>
           <w:szCs w:val="22"/>
-          <w:shd w:val="clear" w:color="auto" w:fill="FAF9F8"/>
         </w:rPr>
         <w:t>°</w:t>
       </w:r>
@@ -686,7 +659,6 @@
           <w:rFonts w:ascii="Arial" w:hAnsi="Arial" w:cs="Arial"/>
           <w:sz w:val="22"/>
           <w:szCs w:val="22"/>
-          <w:shd w:val="clear" w:color="auto" w:fill="FAF9F8"/>
         </w:rPr>
         <w:t> 1053, publicado el 27.6.2008, y modificatorias. </w:t>
       </w:r>
@@ -707,15 +679,13 @@
           <w:rFonts w:ascii="Arial" w:hAnsi="Arial" w:cs="Arial"/>
           <w:sz w:val="22"/>
           <w:szCs w:val="22"/>
-          <w:shd w:val="clear" w:color="auto" w:fill="FAF9F8"/>
-        </w:rPr>
-      </w:pPr>
-      <w:r>
-        <w:rPr>
-          <w:rFonts w:ascii="Arial" w:hAnsi="Arial" w:cs="Arial"/>
-          <w:sz w:val="22"/>
-          <w:szCs w:val="22"/>
-          <w:shd w:val="clear" w:color="auto" w:fill="FAF9F8"/>
+        </w:rPr>
+      </w:pPr>
+      <w:r>
+        <w:rPr>
+          <w:rFonts w:ascii="Arial" w:hAnsi="Arial" w:cs="Arial"/>
+          <w:sz w:val="22"/>
+          <w:szCs w:val="22"/>
         </w:rPr>
         <w:t>Ley </w:t>
       </w:r>
@@ -725,7 +695,6 @@
           <w:rFonts w:ascii="Arial" w:hAnsi="Arial" w:cs="Arial"/>
           <w:sz w:val="22"/>
           <w:szCs w:val="22"/>
-          <w:shd w:val="clear" w:color="auto" w:fill="FAF9F8"/>
         </w:rPr>
         <w:t>n</w:t>
       </w:r>
@@ -734,7 +703,6 @@
           <w:rFonts w:ascii="Arial" w:hAnsi="Arial" w:cs="Arial"/>
           <w:sz w:val="22"/>
           <w:szCs w:val="22"/>
-          <w:shd w:val="clear" w:color="auto" w:fill="FAF9F8"/>
         </w:rPr>
         <w:t>.</w:t>
       </w:r>
@@ -743,7 +711,6 @@
           <w:rFonts w:ascii="Arial" w:hAnsi="Arial" w:cs="Arial"/>
           <w:sz w:val="22"/>
           <w:szCs w:val="22"/>
-          <w:shd w:val="clear" w:color="auto" w:fill="FAF9F8"/>
         </w:rPr>
         <w:t>°</w:t>
       </w:r>
@@ -753,7 +720,6 @@
           <w:rFonts w:ascii="Arial" w:hAnsi="Arial" w:cs="Arial"/>
           <w:sz w:val="22"/>
           <w:szCs w:val="22"/>
-          <w:shd w:val="clear" w:color="auto" w:fill="FAF9F8"/>
         </w:rPr>
         <w:t xml:space="preserve"> 27037, Ley de </w:t>
       </w:r>
@@ -762,7 +728,6 @@
           <w:rFonts w:ascii="Arial" w:hAnsi="Arial" w:cs="Arial"/>
           <w:sz w:val="22"/>
           <w:szCs w:val="22"/>
-          <w:shd w:val="clear" w:color="auto" w:fill="FAF9F8"/>
         </w:rPr>
         <w:t>P</w:t>
       </w:r>
@@ -771,7 +736,6 @@
           <w:rFonts w:ascii="Arial" w:hAnsi="Arial" w:cs="Arial"/>
           <w:sz w:val="22"/>
           <w:szCs w:val="22"/>
-          <w:shd w:val="clear" w:color="auto" w:fill="FAF9F8"/>
         </w:rPr>
         <w:t xml:space="preserve">romoción de la </w:t>
       </w:r>
@@ -780,7 +744,6 @@
           <w:rFonts w:ascii="Arial" w:hAnsi="Arial" w:cs="Arial"/>
           <w:sz w:val="22"/>
           <w:szCs w:val="22"/>
-          <w:shd w:val="clear" w:color="auto" w:fill="FAF9F8"/>
         </w:rPr>
         <w:t>I</w:t>
       </w:r>
@@ -789,7 +752,6 @@
           <w:rFonts w:ascii="Arial" w:hAnsi="Arial" w:cs="Arial"/>
           <w:sz w:val="22"/>
           <w:szCs w:val="22"/>
-          <w:shd w:val="clear" w:color="auto" w:fill="FAF9F8"/>
         </w:rPr>
         <w:t xml:space="preserve">nversión en la </w:t>
       </w:r>
@@ -798,7 +760,6 @@
           <w:rFonts w:ascii="Arial" w:hAnsi="Arial" w:cs="Arial"/>
           <w:sz w:val="22"/>
           <w:szCs w:val="22"/>
-          <w:shd w:val="clear" w:color="auto" w:fill="FAF9F8"/>
         </w:rPr>
         <w:t>A</w:t>
       </w:r>
@@ -807,7 +768,6 @@
           <w:rFonts w:ascii="Arial" w:hAnsi="Arial" w:cs="Arial"/>
           <w:sz w:val="22"/>
           <w:szCs w:val="22"/>
-          <w:shd w:val="clear" w:color="auto" w:fill="FAF9F8"/>
         </w:rPr>
         <w:t>mazonia. </w:t>
       </w:r>
@@ -828,15 +788,13 @@
           <w:rFonts w:ascii="Arial" w:hAnsi="Arial" w:cs="Arial"/>
           <w:sz w:val="22"/>
           <w:szCs w:val="22"/>
-          <w:shd w:val="clear" w:color="auto" w:fill="FAF9F8"/>
-        </w:rPr>
-      </w:pPr>
-      <w:r>
-        <w:rPr>
-          <w:rFonts w:ascii="Arial" w:hAnsi="Arial" w:cs="Arial"/>
-          <w:sz w:val="22"/>
-          <w:szCs w:val="22"/>
-          <w:shd w:val="clear" w:color="auto" w:fill="FAF9F8"/>
+        </w:rPr>
+      </w:pPr>
+      <w:r>
+        <w:rPr>
+          <w:rFonts w:ascii="Arial" w:hAnsi="Arial" w:cs="Arial"/>
+          <w:sz w:val="22"/>
+          <w:szCs w:val="22"/>
         </w:rPr>
         <w:t>Decreto Supremo </w:t>
       </w:r>
@@ -846,7 +804,6 @@
           <w:rFonts w:ascii="Arial" w:hAnsi="Arial" w:cs="Arial"/>
           <w:sz w:val="22"/>
           <w:szCs w:val="22"/>
-          <w:shd w:val="clear" w:color="auto" w:fill="FAF9F8"/>
         </w:rPr>
         <w:t>n</w:t>
       </w:r>
@@ -855,7 +812,6 @@
           <w:rFonts w:ascii="Arial" w:hAnsi="Arial" w:cs="Arial"/>
           <w:sz w:val="22"/>
           <w:szCs w:val="22"/>
-          <w:shd w:val="clear" w:color="auto" w:fill="FAF9F8"/>
         </w:rPr>
         <w:t>.</w:t>
       </w:r>
@@ -864,7 +820,6 @@
           <w:rFonts w:ascii="Arial" w:hAnsi="Arial" w:cs="Arial"/>
           <w:sz w:val="22"/>
           <w:szCs w:val="22"/>
-          <w:shd w:val="clear" w:color="auto" w:fill="FAF9F8"/>
         </w:rPr>
         <w:t>°</w:t>
       </w:r>
@@ -874,7 +829,6 @@
           <w:rFonts w:ascii="Arial" w:hAnsi="Arial" w:cs="Arial"/>
           <w:sz w:val="22"/>
           <w:szCs w:val="22"/>
-          <w:shd w:val="clear" w:color="auto" w:fill="FAF9F8"/>
         </w:rPr>
         <w:t> 103-99-EF, aprueban el Reglamento de las Disposiciones Tributarias contenidas en la Ley de Promoción de la Inversión en la Amazonia. </w:t>
       </w:r>
@@ -895,15 +849,13 @@
           <w:rFonts w:ascii="Arial" w:hAnsi="Arial" w:cs="Arial"/>
           <w:sz w:val="22"/>
           <w:szCs w:val="22"/>
-          <w:shd w:val="clear" w:color="auto" w:fill="FAF9F8"/>
-        </w:rPr>
-      </w:pPr>
-      <w:r>
-        <w:rPr>
-          <w:rFonts w:ascii="Arial" w:hAnsi="Arial" w:cs="Arial"/>
-          <w:sz w:val="22"/>
-          <w:szCs w:val="22"/>
-          <w:shd w:val="clear" w:color="auto" w:fill="FAF9F8"/>
+        </w:rPr>
+      </w:pPr>
+      <w:r>
+        <w:rPr>
+          <w:rFonts w:ascii="Arial" w:hAnsi="Arial" w:cs="Arial"/>
+          <w:sz w:val="22"/>
+          <w:szCs w:val="22"/>
         </w:rPr>
         <w:t>Arancel Común Anexo al Protocolo Modificatorio del Convenio de Cooperación Aduanera Peruano-</w:t>
       </w:r>
@@ -913,7 +865,6 @@
           <w:rFonts w:ascii="Arial" w:hAnsi="Arial" w:cs="Arial"/>
           <w:sz w:val="22"/>
           <w:szCs w:val="22"/>
-          <w:shd w:val="clear" w:color="auto" w:fill="FAF9F8"/>
         </w:rPr>
         <w:t>Colombiano</w:t>
       </w:r>
@@ -923,7 +874,6 @@
           <w:rFonts w:ascii="Arial" w:hAnsi="Arial" w:cs="Arial"/>
           <w:sz w:val="22"/>
           <w:szCs w:val="22"/>
-          <w:shd w:val="clear" w:color="auto" w:fill="FAF9F8"/>
         </w:rPr>
         <w:t> de 1938, puesto en vigencia por el Decreto Supremo </w:t>
       </w:r>
@@ -933,7 +883,6 @@
           <w:rFonts w:ascii="Arial" w:hAnsi="Arial" w:cs="Arial"/>
           <w:sz w:val="22"/>
           <w:szCs w:val="22"/>
-          <w:shd w:val="clear" w:color="auto" w:fill="FAF9F8"/>
         </w:rPr>
         <w:t>n</w:t>
       </w:r>
@@ -942,7 +891,6 @@
           <w:rFonts w:ascii="Arial" w:hAnsi="Arial" w:cs="Arial"/>
           <w:sz w:val="22"/>
           <w:szCs w:val="22"/>
-          <w:shd w:val="clear" w:color="auto" w:fill="FAF9F8"/>
         </w:rPr>
         <w:t>.</w:t>
       </w:r>
@@ -951,7 +899,6 @@
           <w:rFonts w:ascii="Arial" w:hAnsi="Arial" w:cs="Arial"/>
           <w:sz w:val="22"/>
           <w:szCs w:val="22"/>
-          <w:shd w:val="clear" w:color="auto" w:fill="FAF9F8"/>
         </w:rPr>
         <w:t>°</w:t>
       </w:r>
@@ -961,7 +908,6 @@
           <w:rFonts w:ascii="Arial" w:hAnsi="Arial" w:cs="Arial"/>
           <w:sz w:val="22"/>
           <w:szCs w:val="22"/>
-          <w:shd w:val="clear" w:color="auto" w:fill="FAF9F8"/>
         </w:rPr>
         <w:t> 069-82-EFC, publicado el 04.03.1982, y modificatorias.  </w:t>
       </w:r>
@@ -982,15 +928,13 @@
           <w:rFonts w:ascii="Arial" w:hAnsi="Arial" w:cs="Arial"/>
           <w:sz w:val="22"/>
           <w:szCs w:val="22"/>
-          <w:shd w:val="clear" w:color="auto" w:fill="FAF9F8"/>
-        </w:rPr>
-      </w:pPr>
-      <w:r>
-        <w:rPr>
-          <w:rFonts w:ascii="Arial" w:hAnsi="Arial" w:cs="Arial"/>
-          <w:sz w:val="22"/>
-          <w:szCs w:val="22"/>
-          <w:shd w:val="clear" w:color="auto" w:fill="FAF9F8"/>
+        </w:rPr>
+      </w:pPr>
+      <w:r>
+        <w:rPr>
+          <w:rFonts w:ascii="Arial" w:hAnsi="Arial" w:cs="Arial"/>
+          <w:sz w:val="22"/>
+          <w:szCs w:val="22"/>
         </w:rPr>
         <w:t>Resolución de Superintendencia </w:t>
       </w:r>
@@ -1000,7 +944,6 @@
           <w:rFonts w:ascii="Arial" w:hAnsi="Arial" w:cs="Arial"/>
           <w:sz w:val="22"/>
           <w:szCs w:val="22"/>
-          <w:shd w:val="clear" w:color="auto" w:fill="FAF9F8"/>
         </w:rPr>
         <w:t>n</w:t>
       </w:r>
@@ -1009,7 +952,6 @@
           <w:rFonts w:ascii="Arial" w:hAnsi="Arial" w:cs="Arial"/>
           <w:sz w:val="22"/>
           <w:szCs w:val="22"/>
-          <w:shd w:val="clear" w:color="auto" w:fill="FAF9F8"/>
         </w:rPr>
         <w:t>.</w:t>
       </w:r>
@@ -1018,7 +960,6 @@
           <w:rFonts w:ascii="Arial" w:hAnsi="Arial" w:cs="Arial"/>
           <w:sz w:val="22"/>
           <w:szCs w:val="22"/>
-          <w:shd w:val="clear" w:color="auto" w:fill="FAF9F8"/>
         </w:rPr>
         <w:t>°</w:t>
       </w:r>
@@ -1028,7 +969,6 @@
           <w:rFonts w:ascii="Arial" w:hAnsi="Arial" w:cs="Arial"/>
           <w:sz w:val="22"/>
           <w:szCs w:val="22"/>
-          <w:shd w:val="clear" w:color="auto" w:fill="FAF9F8"/>
         </w:rPr>
         <w:t> 247-2025/SUNAT - Procedimiento Especifico DESPA-PE.01.15 (versión 3) Exoneración del IGV e IPM a la Importación de bienes para el consumo en la Amazonía - Ley </w:t>
       </w:r>
@@ -1038,7 +978,6 @@
           <w:rFonts w:ascii="Arial" w:hAnsi="Arial" w:cs="Arial"/>
           <w:sz w:val="22"/>
           <w:szCs w:val="22"/>
-          <w:shd w:val="clear" w:color="auto" w:fill="FAF9F8"/>
         </w:rPr>
         <w:t>n</w:t>
       </w:r>
@@ -1047,7 +986,6 @@
           <w:rFonts w:ascii="Arial" w:hAnsi="Arial" w:cs="Arial"/>
           <w:sz w:val="22"/>
           <w:szCs w:val="22"/>
-          <w:shd w:val="clear" w:color="auto" w:fill="FAF9F8"/>
         </w:rPr>
         <w:t>.</w:t>
       </w:r>
@@ -1056,7 +994,6 @@
           <w:rFonts w:ascii="Arial" w:hAnsi="Arial" w:cs="Arial"/>
           <w:sz w:val="22"/>
           <w:szCs w:val="22"/>
-          <w:shd w:val="clear" w:color="auto" w:fill="FAF9F8"/>
         </w:rPr>
         <w:t>°</w:t>
       </w:r>
@@ -1066,7 +1003,6 @@
           <w:rFonts w:ascii="Arial" w:hAnsi="Arial" w:cs="Arial"/>
           <w:sz w:val="22"/>
           <w:szCs w:val="22"/>
-          <w:shd w:val="clear" w:color="auto" w:fill="FAF9F8"/>
         </w:rPr>
         <w:t> 27037.  </w:t>
       </w:r>
@@ -1170,15 +1106,13 @@
           <w:rFonts w:ascii="Arial" w:hAnsi="Arial" w:cs="Arial"/>
           <w:sz w:val="22"/>
           <w:szCs w:val="22"/>
-          <w:shd w:val="clear" w:color="auto" w:fill="FAF9F8"/>
-        </w:rPr>
-      </w:pPr>
-      <w:r>
-        <w:rPr>
-          <w:rFonts w:ascii="Arial" w:hAnsi="Arial" w:cs="Arial"/>
-          <w:sz w:val="22"/>
-          <w:szCs w:val="22"/>
-          <w:shd w:val="clear" w:color="auto" w:fill="FAF9F8"/>
+        </w:rPr>
+      </w:pPr>
+      <w:r>
+        <w:rPr>
+          <w:rFonts w:ascii="Arial" w:hAnsi="Arial" w:cs="Arial"/>
+          <w:sz w:val="22"/>
+          <w:szCs w:val="22"/>
         </w:rPr>
         <w:t>Ley General de Aduanas, Decreto Legislativo </w:t>
       </w:r>
@@ -1188,7 +1122,6 @@
           <w:rFonts w:ascii="Arial" w:hAnsi="Arial" w:cs="Arial"/>
           <w:sz w:val="22"/>
           <w:szCs w:val="22"/>
-          <w:shd w:val="clear" w:color="auto" w:fill="FAF9F8"/>
         </w:rPr>
         <w:t>n</w:t>
       </w:r>
@@ -1197,7 +1130,6 @@
           <w:rFonts w:ascii="Arial" w:hAnsi="Arial" w:cs="Arial"/>
           <w:sz w:val="22"/>
           <w:szCs w:val="22"/>
-          <w:shd w:val="clear" w:color="auto" w:fill="FAF9F8"/>
         </w:rPr>
         <w:t>.</w:t>
       </w:r>
@@ -1206,7 +1138,6 @@
           <w:rFonts w:ascii="Arial" w:hAnsi="Arial" w:cs="Arial"/>
           <w:sz w:val="22"/>
           <w:szCs w:val="22"/>
-          <w:shd w:val="clear" w:color="auto" w:fill="FAF9F8"/>
         </w:rPr>
         <w:t>°</w:t>
       </w:r>
@@ -1216,7 +1147,6 @@
           <w:rFonts w:ascii="Arial" w:hAnsi="Arial" w:cs="Arial"/>
           <w:sz w:val="22"/>
           <w:szCs w:val="22"/>
-          <w:shd w:val="clear" w:color="auto" w:fill="FAF9F8"/>
         </w:rPr>
         <w:t> 1053, publicado el 27.6.2008, y modificatorias. </w:t>
       </w:r>
@@ -1237,15 +1167,13 @@
           <w:rFonts w:ascii="Arial" w:hAnsi="Arial" w:cs="Arial"/>
           <w:sz w:val="22"/>
           <w:szCs w:val="22"/>
-          <w:shd w:val="clear" w:color="auto" w:fill="FAF9F8"/>
-        </w:rPr>
-      </w:pPr>
-      <w:r>
-        <w:rPr>
-          <w:rFonts w:ascii="Arial" w:hAnsi="Arial" w:cs="Arial"/>
-          <w:sz w:val="22"/>
-          <w:szCs w:val="22"/>
-          <w:shd w:val="clear" w:color="auto" w:fill="FAF9F8"/>
+        </w:rPr>
+      </w:pPr>
+      <w:r>
+        <w:rPr>
+          <w:rFonts w:ascii="Arial" w:hAnsi="Arial" w:cs="Arial"/>
+          <w:sz w:val="22"/>
+          <w:szCs w:val="22"/>
         </w:rPr>
         <w:t>Ley </w:t>
       </w:r>
@@ -1255,7 +1183,6 @@
           <w:rFonts w:ascii="Arial" w:hAnsi="Arial" w:cs="Arial"/>
           <w:sz w:val="22"/>
           <w:szCs w:val="22"/>
-          <w:shd w:val="clear" w:color="auto" w:fill="FAF9F8"/>
         </w:rPr>
         <w:t>n</w:t>
       </w:r>
@@ -1264,7 +1191,6 @@
           <w:rFonts w:ascii="Arial" w:hAnsi="Arial" w:cs="Arial"/>
           <w:sz w:val="22"/>
           <w:szCs w:val="22"/>
-          <w:shd w:val="clear" w:color="auto" w:fill="FAF9F8"/>
         </w:rPr>
         <w:t>.</w:t>
       </w:r>
@@ -1273,7 +1199,6 @@
           <w:rFonts w:ascii="Arial" w:hAnsi="Arial" w:cs="Arial"/>
           <w:sz w:val="22"/>
           <w:szCs w:val="22"/>
-          <w:shd w:val="clear" w:color="auto" w:fill="FAF9F8"/>
         </w:rPr>
         <w:t>°</w:t>
       </w:r>
@@ -1283,7 +1208,6 @@
           <w:rFonts w:ascii="Arial" w:hAnsi="Arial" w:cs="Arial"/>
           <w:sz w:val="22"/>
           <w:szCs w:val="22"/>
-          <w:shd w:val="clear" w:color="auto" w:fill="FAF9F8"/>
         </w:rPr>
         <w:t xml:space="preserve"> 27037, Ley de promoción de la </w:t>
       </w:r>
@@ -1292,43 +1216,14 @@
           <w:rFonts w:ascii="Arial" w:hAnsi="Arial" w:cs="Arial"/>
           <w:sz w:val="22"/>
           <w:szCs w:val="22"/>
-          <w:shd w:val="clear" w:color="auto" w:fill="FAF9F8"/>
-        </w:rPr>
-        <w:t>I</w:t>
-      </w:r>
-      <w:r>
-        <w:rPr>
-          <w:rFonts w:ascii="Arial" w:hAnsi="Arial" w:cs="Arial"/>
-          <w:sz w:val="22"/>
-          <w:szCs w:val="22"/>
-          <w:shd w:val="clear" w:color="auto" w:fill="FAF9F8"/>
-        </w:rPr>
-        <w:t xml:space="preserve">nversión en la </w:t>
-      </w:r>
-      <w:r>
-        <w:rPr>
-          <w:rFonts w:ascii="Arial" w:hAnsi="Arial" w:cs="Arial"/>
-          <w:sz w:val="22"/>
-          <w:szCs w:val="22"/>
-          <w:shd w:val="clear" w:color="auto" w:fill="FAF9F8"/>
-        </w:rPr>
-        <w:t>A</w:t>
-      </w:r>
-      <w:r>
-        <w:rPr>
-          <w:rFonts w:ascii="Arial" w:hAnsi="Arial" w:cs="Arial"/>
-          <w:sz w:val="22"/>
-          <w:szCs w:val="22"/>
-          <w:shd w:val="clear" w:color="auto" w:fill="FAF9F8"/>
-        </w:rPr>
-        <w:t>mazonia</w:t>
-      </w:r>
-      <w:r>
-        <w:rPr>
-          <w:rFonts w:ascii="Arial" w:hAnsi="Arial" w:cs="Arial"/>
-          <w:sz w:val="22"/>
-          <w:szCs w:val="22"/>
-          <w:shd w:val="clear" w:color="auto" w:fill="FAF9F8"/>
+        </w:rPr>
+        <w:t>Inversión en la Amazonia</w:t>
+      </w:r>
+      <w:r>
+        <w:rPr>
+          <w:rFonts w:ascii="Arial" w:hAnsi="Arial" w:cs="Arial"/>
+          <w:sz w:val="22"/>
+          <w:szCs w:val="22"/>
         </w:rPr>
         <w:t>. </w:t>
       </w:r>
@@ -1349,15 +1244,13 @@
           <w:rFonts w:ascii="Arial" w:hAnsi="Arial" w:cs="Arial"/>
           <w:sz w:val="22"/>
           <w:szCs w:val="22"/>
-          <w:shd w:val="clear" w:color="auto" w:fill="FAF9F8"/>
-        </w:rPr>
-      </w:pPr>
-      <w:r>
-        <w:rPr>
-          <w:rFonts w:ascii="Arial" w:hAnsi="Arial" w:cs="Arial"/>
-          <w:sz w:val="22"/>
-          <w:szCs w:val="22"/>
-          <w:shd w:val="clear" w:color="auto" w:fill="FAF9F8"/>
+        </w:rPr>
+      </w:pPr>
+      <w:r>
+        <w:rPr>
+          <w:rFonts w:ascii="Arial" w:hAnsi="Arial" w:cs="Arial"/>
+          <w:sz w:val="22"/>
+          <w:szCs w:val="22"/>
         </w:rPr>
         <w:t>Decreto Supremo </w:t>
       </w:r>
@@ -1367,7 +1260,6 @@
           <w:rFonts w:ascii="Arial" w:hAnsi="Arial" w:cs="Arial"/>
           <w:sz w:val="22"/>
           <w:szCs w:val="22"/>
-          <w:shd w:val="clear" w:color="auto" w:fill="FAF9F8"/>
         </w:rPr>
         <w:t>n</w:t>
       </w:r>
@@ -1376,7 +1268,6 @@
           <w:rFonts w:ascii="Arial" w:hAnsi="Arial" w:cs="Arial"/>
           <w:sz w:val="22"/>
           <w:szCs w:val="22"/>
-          <w:shd w:val="clear" w:color="auto" w:fill="FAF9F8"/>
         </w:rPr>
         <w:t>.</w:t>
       </w:r>
@@ -1385,7 +1276,6 @@
           <w:rFonts w:ascii="Arial" w:hAnsi="Arial" w:cs="Arial"/>
           <w:sz w:val="22"/>
           <w:szCs w:val="22"/>
-          <w:shd w:val="clear" w:color="auto" w:fill="FAF9F8"/>
         </w:rPr>
         <w:t>°</w:t>
       </w:r>
@@ -1395,7 +1285,6 @@
           <w:rFonts w:ascii="Arial" w:hAnsi="Arial" w:cs="Arial"/>
           <w:sz w:val="22"/>
           <w:szCs w:val="22"/>
-          <w:shd w:val="clear" w:color="auto" w:fill="FAF9F8"/>
         </w:rPr>
         <w:t> 103-99-EF, aprueban el Reglamento de las Disposiciones Tributarias contenidas en la Ley de Promoción de la Inversión en la Amazonia. </w:t>
       </w:r>
@@ -1416,15 +1305,13 @@
           <w:rFonts w:ascii="Arial" w:hAnsi="Arial" w:cs="Arial"/>
           <w:sz w:val="22"/>
           <w:szCs w:val="22"/>
-          <w:shd w:val="clear" w:color="auto" w:fill="FAF9F8"/>
-        </w:rPr>
-      </w:pPr>
-      <w:r>
-        <w:rPr>
-          <w:rFonts w:ascii="Arial" w:hAnsi="Arial" w:cs="Arial"/>
-          <w:sz w:val="22"/>
-          <w:szCs w:val="22"/>
-          <w:shd w:val="clear" w:color="auto" w:fill="FAF9F8"/>
+        </w:rPr>
+      </w:pPr>
+      <w:r>
+        <w:rPr>
+          <w:rFonts w:ascii="Arial" w:hAnsi="Arial" w:cs="Arial"/>
+          <w:sz w:val="22"/>
+          <w:szCs w:val="22"/>
         </w:rPr>
         <w:lastRenderedPageBreak/>
         <w:t>Convenio de Cooperación Aduanera Peruano-</w:t>
@@ -1435,7 +1322,6 @@
           <w:rFonts w:ascii="Arial" w:hAnsi="Arial" w:cs="Arial"/>
           <w:sz w:val="22"/>
           <w:szCs w:val="22"/>
-          <w:shd w:val="clear" w:color="auto" w:fill="FAF9F8"/>
         </w:rPr>
         <w:t>Colombiano</w:t>
       </w:r>
@@ -1445,7 +1331,6 @@
           <w:rFonts w:ascii="Arial" w:hAnsi="Arial" w:cs="Arial"/>
           <w:sz w:val="22"/>
           <w:szCs w:val="22"/>
-          <w:shd w:val="clear" w:color="auto" w:fill="FAF9F8"/>
         </w:rPr>
         <w:t> de 1938 y su Protocolo Modificatorio, aprobado por Resolución Legislativa </w:t>
       </w:r>
@@ -1455,7 +1340,6 @@
           <w:rFonts w:ascii="Arial" w:hAnsi="Arial" w:cs="Arial"/>
           <w:sz w:val="22"/>
           <w:szCs w:val="22"/>
-          <w:shd w:val="clear" w:color="auto" w:fill="FAF9F8"/>
         </w:rPr>
         <w:t>n</w:t>
       </w:r>
@@ -1464,7 +1348,6 @@
           <w:rFonts w:ascii="Arial" w:hAnsi="Arial" w:cs="Arial"/>
           <w:sz w:val="22"/>
           <w:szCs w:val="22"/>
-          <w:shd w:val="clear" w:color="auto" w:fill="FAF9F8"/>
         </w:rPr>
         <w:t>.°</w:t>
       </w:r>
@@ -1474,7 +1357,6 @@
           <w:rFonts w:ascii="Arial" w:hAnsi="Arial" w:cs="Arial"/>
           <w:sz w:val="22"/>
           <w:szCs w:val="22"/>
-          <w:shd w:val="clear" w:color="auto" w:fill="FAF9F8"/>
         </w:rPr>
         <w:t> 23254, publicada el 22.05.1981. </w:t>
       </w:r>
@@ -1495,15 +1377,13 @@
           <w:rFonts w:ascii="Arial" w:hAnsi="Arial" w:cs="Arial"/>
           <w:sz w:val="22"/>
           <w:szCs w:val="22"/>
-          <w:shd w:val="clear" w:color="auto" w:fill="FAF9F8"/>
-        </w:rPr>
-      </w:pPr>
-      <w:r>
-        <w:rPr>
-          <w:rFonts w:ascii="Arial" w:hAnsi="Arial" w:cs="Arial"/>
-          <w:sz w:val="22"/>
-          <w:szCs w:val="22"/>
-          <w:shd w:val="clear" w:color="auto" w:fill="FAF9F8"/>
+        </w:rPr>
+      </w:pPr>
+      <w:r>
+        <w:rPr>
+          <w:rFonts w:ascii="Arial" w:hAnsi="Arial" w:cs="Arial"/>
+          <w:sz w:val="22"/>
+          <w:szCs w:val="22"/>
         </w:rPr>
         <w:t>Medidas a fin de garantizar el cumplimiento de las obligaciones asumidas por nuestro país en el Convenio de Cooperación Aduanera con Colombia, dictada por Decreto Supremo </w:t>
       </w:r>
@@ -1513,7 +1393,6 @@
           <w:rFonts w:ascii="Arial" w:hAnsi="Arial" w:cs="Arial"/>
           <w:sz w:val="22"/>
           <w:szCs w:val="22"/>
-          <w:shd w:val="clear" w:color="auto" w:fill="FAF9F8"/>
         </w:rPr>
         <w:t>n</w:t>
       </w:r>
@@ -1522,7 +1401,6 @@
           <w:rFonts w:ascii="Arial" w:hAnsi="Arial" w:cs="Arial"/>
           <w:sz w:val="22"/>
           <w:szCs w:val="22"/>
-          <w:shd w:val="clear" w:color="auto" w:fill="FAF9F8"/>
         </w:rPr>
         <w:t>.°</w:t>
       </w:r>
@@ -1532,7 +1410,6 @@
           <w:rFonts w:ascii="Arial" w:hAnsi="Arial" w:cs="Arial"/>
           <w:sz w:val="22"/>
           <w:szCs w:val="22"/>
-          <w:shd w:val="clear" w:color="auto" w:fill="FAF9F8"/>
         </w:rPr>
         <w:t> 15-94-EF, publicado el 09.02.1994, y modificatorias. </w:t>
       </w:r>
@@ -1553,15 +1430,13 @@
           <w:rFonts w:ascii="Arial" w:hAnsi="Arial" w:cs="Arial"/>
           <w:sz w:val="22"/>
           <w:szCs w:val="22"/>
-          <w:shd w:val="clear" w:color="auto" w:fill="FAF9F8"/>
-        </w:rPr>
-      </w:pPr>
-      <w:r>
-        <w:rPr>
-          <w:rFonts w:ascii="Arial" w:hAnsi="Arial" w:cs="Arial"/>
-          <w:sz w:val="22"/>
-          <w:szCs w:val="22"/>
-          <w:shd w:val="clear" w:color="auto" w:fill="FAF9F8"/>
+        </w:rPr>
+      </w:pPr>
+      <w:r>
+        <w:rPr>
+          <w:rFonts w:ascii="Arial" w:hAnsi="Arial" w:cs="Arial"/>
+          <w:sz w:val="22"/>
+          <w:szCs w:val="22"/>
         </w:rPr>
         <w:t>Arancel Común Anexo al Protocolo Modificatorio del Convenio de Cooperación Aduanera Peruano-</w:t>
       </w:r>
@@ -1571,7 +1446,6 @@
           <w:rFonts w:ascii="Arial" w:hAnsi="Arial" w:cs="Arial"/>
           <w:sz w:val="22"/>
           <w:szCs w:val="22"/>
-          <w:shd w:val="clear" w:color="auto" w:fill="FAF9F8"/>
         </w:rPr>
         <w:t>Colombiano</w:t>
       </w:r>
@@ -1581,7 +1455,6 @@
           <w:rFonts w:ascii="Arial" w:hAnsi="Arial" w:cs="Arial"/>
           <w:sz w:val="22"/>
           <w:szCs w:val="22"/>
-          <w:shd w:val="clear" w:color="auto" w:fill="FAF9F8"/>
         </w:rPr>
         <w:t> de 1938, puesto en vigencia por el Decreto Supremo </w:t>
       </w:r>
@@ -1591,7 +1464,6 @@
           <w:rFonts w:ascii="Arial" w:hAnsi="Arial" w:cs="Arial"/>
           <w:sz w:val="22"/>
           <w:szCs w:val="22"/>
-          <w:shd w:val="clear" w:color="auto" w:fill="FAF9F8"/>
         </w:rPr>
         <w:t>n</w:t>
       </w:r>
@@ -1600,7 +1472,6 @@
           <w:rFonts w:ascii="Arial" w:hAnsi="Arial" w:cs="Arial"/>
           <w:sz w:val="22"/>
           <w:szCs w:val="22"/>
-          <w:shd w:val="clear" w:color="auto" w:fill="FAF9F8"/>
         </w:rPr>
         <w:t>.</w:t>
       </w:r>
@@ -1609,7 +1480,6 @@
           <w:rFonts w:ascii="Arial" w:hAnsi="Arial" w:cs="Arial"/>
           <w:sz w:val="22"/>
           <w:szCs w:val="22"/>
-          <w:shd w:val="clear" w:color="auto" w:fill="FAF9F8"/>
         </w:rPr>
         <w:t>°</w:t>
       </w:r>
@@ -1619,7 +1489,6 @@
           <w:rFonts w:ascii="Arial" w:hAnsi="Arial" w:cs="Arial"/>
           <w:sz w:val="22"/>
           <w:szCs w:val="22"/>
-          <w:shd w:val="clear" w:color="auto" w:fill="FAF9F8"/>
         </w:rPr>
         <w:t> 069-82-EFC, publicado el 04.03.1982, y modificatorias.  </w:t>
       </w:r>
@@ -1640,15 +1509,13 @@
           <w:rFonts w:ascii="Arial" w:hAnsi="Arial" w:cs="Arial"/>
           <w:sz w:val="22"/>
           <w:szCs w:val="22"/>
-          <w:shd w:val="clear" w:color="auto" w:fill="FAF9F8"/>
-        </w:rPr>
-      </w:pPr>
-      <w:r>
-        <w:rPr>
-          <w:rFonts w:ascii="Arial" w:hAnsi="Arial" w:cs="Arial"/>
-          <w:sz w:val="22"/>
-          <w:szCs w:val="22"/>
-          <w:shd w:val="clear" w:color="auto" w:fill="FAF9F8"/>
+        </w:rPr>
+      </w:pPr>
+      <w:r>
+        <w:rPr>
+          <w:rFonts w:ascii="Arial" w:hAnsi="Arial" w:cs="Arial"/>
+          <w:sz w:val="22"/>
+          <w:szCs w:val="22"/>
         </w:rPr>
         <w:t>Resolución de Superintendencia </w:t>
       </w:r>
@@ -1658,7 +1525,6 @@
           <w:rFonts w:ascii="Arial" w:hAnsi="Arial" w:cs="Arial"/>
           <w:sz w:val="22"/>
           <w:szCs w:val="22"/>
-          <w:shd w:val="clear" w:color="auto" w:fill="FAF9F8"/>
         </w:rPr>
         <w:t>n</w:t>
       </w:r>
@@ -1667,7 +1533,6 @@
           <w:rFonts w:ascii="Arial" w:hAnsi="Arial" w:cs="Arial"/>
           <w:sz w:val="22"/>
           <w:szCs w:val="22"/>
-          <w:shd w:val="clear" w:color="auto" w:fill="FAF9F8"/>
         </w:rPr>
         <w:t>.</w:t>
       </w:r>
@@ -1676,7 +1541,6 @@
           <w:rFonts w:ascii="Arial" w:hAnsi="Arial" w:cs="Arial"/>
           <w:sz w:val="22"/>
           <w:szCs w:val="22"/>
-          <w:shd w:val="clear" w:color="auto" w:fill="FAF9F8"/>
         </w:rPr>
         <w:t>°</w:t>
       </w:r>
@@ -1686,7 +1550,6 @@
           <w:rFonts w:ascii="Arial" w:hAnsi="Arial" w:cs="Arial"/>
           <w:sz w:val="22"/>
           <w:szCs w:val="22"/>
-          <w:shd w:val="clear" w:color="auto" w:fill="FAF9F8"/>
         </w:rPr>
         <w:t> 247-2025/SUNAT - Procedimiento Especifico DESPA-PE.01.15 (versión 3) Exoneración del IGV e IPM a la Importación de bienes para el consumo en la Amazonía - Ley </w:t>
       </w:r>
@@ -1696,7 +1559,6 @@
           <w:rFonts w:ascii="Arial" w:hAnsi="Arial" w:cs="Arial"/>
           <w:sz w:val="22"/>
           <w:szCs w:val="22"/>
-          <w:shd w:val="clear" w:color="auto" w:fill="FAF9F8"/>
         </w:rPr>
         <w:t>n</w:t>
       </w:r>
@@ -1705,7 +1567,6 @@
           <w:rFonts w:ascii="Arial" w:hAnsi="Arial" w:cs="Arial"/>
           <w:sz w:val="22"/>
           <w:szCs w:val="22"/>
-          <w:shd w:val="clear" w:color="auto" w:fill="FAF9F8"/>
         </w:rPr>
         <w:t>.</w:t>
       </w:r>
@@ -1714,7 +1575,6 @@
           <w:rFonts w:ascii="Arial" w:hAnsi="Arial" w:cs="Arial"/>
           <w:sz w:val="22"/>
           <w:szCs w:val="22"/>
-          <w:shd w:val="clear" w:color="auto" w:fill="FAF9F8"/>
         </w:rPr>
         <w:t>°</w:t>
       </w:r>
@@ -1724,7 +1584,6 @@
           <w:rFonts w:ascii="Arial" w:hAnsi="Arial" w:cs="Arial"/>
           <w:sz w:val="22"/>
           <w:szCs w:val="22"/>
-          <w:shd w:val="clear" w:color="auto" w:fill="FAF9F8"/>
         </w:rPr>
         <w:t> 27037.  </w:t>
       </w:r>
@@ -1745,15 +1604,13 @@
           <w:rFonts w:ascii="Arial" w:hAnsi="Arial" w:cs="Arial"/>
           <w:sz w:val="22"/>
           <w:szCs w:val="22"/>
-          <w:shd w:val="clear" w:color="auto" w:fill="FAF9F8"/>
-        </w:rPr>
-      </w:pPr>
-      <w:r>
-        <w:rPr>
-          <w:rFonts w:ascii="Arial" w:hAnsi="Arial" w:cs="Arial"/>
-          <w:sz w:val="22"/>
-          <w:szCs w:val="22"/>
-          <w:shd w:val="clear" w:color="auto" w:fill="FAF9F8"/>
+        </w:rPr>
+      </w:pPr>
+      <w:r>
+        <w:rPr>
+          <w:rFonts w:ascii="Arial" w:hAnsi="Arial" w:cs="Arial"/>
+          <w:sz w:val="22"/>
+          <w:szCs w:val="22"/>
         </w:rPr>
         <w:t>Resolución de Superintendencia </w:t>
       </w:r>
@@ -1763,7 +1620,6 @@
           <w:rFonts w:ascii="Arial" w:hAnsi="Arial" w:cs="Arial"/>
           <w:sz w:val="22"/>
           <w:szCs w:val="22"/>
-          <w:shd w:val="clear" w:color="auto" w:fill="FAF9F8"/>
         </w:rPr>
         <w:t>n</w:t>
       </w:r>
@@ -1772,7 +1628,6 @@
           <w:rFonts w:ascii="Arial" w:hAnsi="Arial" w:cs="Arial"/>
           <w:sz w:val="22"/>
           <w:szCs w:val="22"/>
-          <w:shd w:val="clear" w:color="auto" w:fill="FAF9F8"/>
         </w:rPr>
         <w:t>.</w:t>
       </w:r>
@@ -1781,7 +1636,6 @@
           <w:rFonts w:ascii="Arial" w:hAnsi="Arial" w:cs="Arial"/>
           <w:sz w:val="22"/>
           <w:szCs w:val="22"/>
-          <w:shd w:val="clear" w:color="auto" w:fill="FAF9F8"/>
         </w:rPr>
         <w:t>°</w:t>
       </w:r>
@@ -1791,7 +1645,6 @@
           <w:rFonts w:ascii="Arial" w:hAnsi="Arial" w:cs="Arial"/>
           <w:sz w:val="22"/>
           <w:szCs w:val="22"/>
-          <w:shd w:val="clear" w:color="auto" w:fill="FAF9F8"/>
         </w:rPr>
         <w:t> 248-2025/SUNAT - Procedimiento Especifico DESPA-PE.01.13 (versión 3) Importación De Mercancías Sujetas Al Protocolo Modificatorio Del Convenio De Cooperación Aduanera Peruano-</w:t>
       </w:r>
@@ -1801,7 +1654,6 @@
           <w:rFonts w:ascii="Arial" w:hAnsi="Arial" w:cs="Arial"/>
           <w:sz w:val="22"/>
           <w:szCs w:val="22"/>
-          <w:shd w:val="clear" w:color="auto" w:fill="FAF9F8"/>
         </w:rPr>
         <w:t>Colombiano</w:t>
       </w:r>
@@ -1811,7 +1663,6 @@
           <w:rFonts w:ascii="Arial" w:hAnsi="Arial" w:cs="Arial"/>
           <w:sz w:val="22"/>
           <w:szCs w:val="22"/>
-          <w:shd w:val="clear" w:color="auto" w:fill="FAF9F8"/>
         </w:rPr>
         <w:t>. </w:t>
       </w:r>
@@ -1904,8 +1755,8 @@
     <w:p>
       <w:pPr>
         <w:numPr>
-          <w:ilvl w:val="1"/>
-          <w:numId w:val="21"/>
+          <w:ilvl w:val="0"/>
+          <w:numId w:val="17"/>
         </w:numPr>
         <w:autoSpaceDE w:val="0"/>
         <w:autoSpaceDN w:val="0"/>
@@ -1917,15 +1768,13 @@
           <w:rFonts w:ascii="Arial" w:hAnsi="Arial" w:cs="Arial"/>
           <w:sz w:val="22"/>
           <w:szCs w:val="22"/>
-          <w:shd w:val="clear" w:color="auto" w:fill="FAF9F8"/>
-        </w:rPr>
-      </w:pPr>
-      <w:r>
-        <w:rPr>
-          <w:rFonts w:ascii="Arial" w:hAnsi="Arial" w:cs="Arial"/>
-          <w:sz w:val="22"/>
-          <w:szCs w:val="22"/>
-          <w:shd w:val="clear" w:color="auto" w:fill="FAF9F8"/>
+        </w:rPr>
+      </w:pPr>
+      <w:r>
+        <w:rPr>
+          <w:rFonts w:ascii="Arial" w:hAnsi="Arial" w:cs="Arial"/>
+          <w:sz w:val="22"/>
+          <w:szCs w:val="22"/>
         </w:rPr>
         <w:t xml:space="preserve">Ley General de Aduanas, Decreto Legislativo </w:t>
       </w:r>
@@ -1935,7 +1784,6 @@
           <w:rFonts w:ascii="Arial" w:hAnsi="Arial" w:cs="Arial"/>
           <w:sz w:val="22"/>
           <w:szCs w:val="22"/>
-          <w:shd w:val="clear" w:color="auto" w:fill="FAF9F8"/>
         </w:rPr>
         <w:t>n</w:t>
       </w:r>
@@ -1944,7 +1792,6 @@
           <w:rFonts w:ascii="Arial" w:hAnsi="Arial" w:cs="Arial"/>
           <w:sz w:val="22"/>
           <w:szCs w:val="22"/>
-          <w:shd w:val="clear" w:color="auto" w:fill="FAF9F8"/>
         </w:rPr>
         <w:t>.</w:t>
       </w:r>
@@ -1953,7 +1800,6 @@
           <w:rFonts w:ascii="Arial" w:hAnsi="Arial" w:cs="Arial"/>
           <w:sz w:val="22"/>
           <w:szCs w:val="22"/>
-          <w:shd w:val="clear" w:color="auto" w:fill="FAF9F8"/>
         </w:rPr>
         <w:t>°</w:t>
       </w:r>
@@ -1963,7 +1809,6 @@
           <w:rFonts w:ascii="Arial" w:hAnsi="Arial" w:cs="Arial"/>
           <w:sz w:val="22"/>
           <w:szCs w:val="22"/>
-          <w:shd w:val="clear" w:color="auto" w:fill="FAF9F8"/>
         </w:rPr>
         <w:t xml:space="preserve"> 1053, publicado el 27.6.2008, y modificatorias.</w:t>
       </w:r>
@@ -1971,8 +1816,8 @@
     <w:p>
       <w:pPr>
         <w:numPr>
-          <w:ilvl w:val="1"/>
-          <w:numId w:val="21"/>
+          <w:ilvl w:val="0"/>
+          <w:numId w:val="17"/>
         </w:numPr>
         <w:autoSpaceDE w:val="0"/>
         <w:autoSpaceDN w:val="0"/>
@@ -1984,35 +1829,15 @@
           <w:rFonts w:ascii="Arial" w:hAnsi="Arial" w:cs="Arial"/>
           <w:sz w:val="22"/>
           <w:szCs w:val="22"/>
-          <w:shd w:val="clear" w:color="auto" w:fill="FAF9F8"/>
-        </w:rPr>
-      </w:pPr>
-      <w:r>
-        <w:rPr>
-          <w:rFonts w:ascii="Arial" w:hAnsi="Arial" w:cs="Arial"/>
-          <w:sz w:val="22"/>
-          <w:szCs w:val="22"/>
-          <w:shd w:val="clear" w:color="auto" w:fill="FAF9F8"/>
-        </w:rPr>
-        <w:t>Convenio</w:t>
-      </w:r>
-      <w:r>
-        <w:rPr>
-          <w:rFonts w:ascii="Arial" w:hAnsi="Arial" w:cs="Arial"/>
-          <w:sz w:val="22"/>
-          <w:szCs w:val="22"/>
-          <w:shd w:val="clear" w:color="auto" w:fill="FAF9F8"/>
-        </w:rPr>
-        <w:t xml:space="preserve"> </w:t>
-      </w:r>
-      <w:r>
-        <w:rPr>
-          <w:rFonts w:ascii="Arial" w:hAnsi="Arial" w:cs="Arial"/>
-          <w:sz w:val="22"/>
-          <w:szCs w:val="22"/>
-          <w:shd w:val="clear" w:color="auto" w:fill="FAF9F8"/>
-        </w:rPr>
-        <w:t>de Cooperación Aduanera Peruano-</w:t>
+        </w:rPr>
+      </w:pPr>
+      <w:r>
+        <w:rPr>
+          <w:rFonts w:ascii="Arial" w:hAnsi="Arial" w:cs="Arial"/>
+          <w:sz w:val="22"/>
+          <w:szCs w:val="22"/>
+        </w:rPr>
+        <w:t>Convenio de Cooperación Aduanera Peruano-</w:t>
       </w:r>
       <w:proofErr w:type="gramStart"/>
       <w:r>
@@ -2020,7 +1845,6 @@
           <w:rFonts w:ascii="Arial" w:hAnsi="Arial" w:cs="Arial"/>
           <w:sz w:val="22"/>
           <w:szCs w:val="22"/>
-          <w:shd w:val="clear" w:color="auto" w:fill="FAF9F8"/>
         </w:rPr>
         <w:t>Colombiano</w:t>
       </w:r>
@@ -2030,7 +1854,6 @@
           <w:rFonts w:ascii="Arial" w:hAnsi="Arial" w:cs="Arial"/>
           <w:sz w:val="22"/>
           <w:szCs w:val="22"/>
-          <w:shd w:val="clear" w:color="auto" w:fill="FAF9F8"/>
         </w:rPr>
         <w:t xml:space="preserve"> de 1938 y su Protocolo Modificatorio, aprobado por Resolución Legislativa </w:t>
       </w:r>
@@ -2040,7 +1863,6 @@
           <w:rFonts w:ascii="Arial" w:hAnsi="Arial" w:cs="Arial"/>
           <w:sz w:val="22"/>
           <w:szCs w:val="22"/>
-          <w:shd w:val="clear" w:color="auto" w:fill="FAF9F8"/>
         </w:rPr>
         <w:t>n</w:t>
       </w:r>
@@ -2049,7 +1871,6 @@
           <w:rFonts w:ascii="Arial" w:hAnsi="Arial" w:cs="Arial"/>
           <w:sz w:val="22"/>
           <w:szCs w:val="22"/>
-          <w:shd w:val="clear" w:color="auto" w:fill="FAF9F8"/>
         </w:rPr>
         <w:t>.°</w:t>
       </w:r>
@@ -2059,25 +1880,15 @@
           <w:rFonts w:ascii="Arial" w:hAnsi="Arial" w:cs="Arial"/>
           <w:sz w:val="22"/>
           <w:szCs w:val="22"/>
-          <w:shd w:val="clear" w:color="auto" w:fill="FAF9F8"/>
-        </w:rPr>
-        <w:t xml:space="preserve"> 23254, publicada el 22.05.1981</w:t>
-      </w:r>
-      <w:r>
-        <w:rPr>
-          <w:rFonts w:ascii="Arial" w:hAnsi="Arial" w:cs="Arial"/>
-          <w:sz w:val="22"/>
-          <w:szCs w:val="22"/>
-          <w:shd w:val="clear" w:color="auto" w:fill="FAF9F8"/>
-        </w:rPr>
-        <w:t>.</w:t>
+        </w:rPr>
+        <w:t xml:space="preserve"> 23254, publicada el 22.05.1981.</w:t>
       </w:r>
     </w:p>
     <w:p>
       <w:pPr>
         <w:numPr>
-          <w:ilvl w:val="1"/>
-          <w:numId w:val="21"/>
+          <w:ilvl w:val="0"/>
+          <w:numId w:val="17"/>
         </w:numPr>
         <w:autoSpaceDE w:val="0"/>
         <w:autoSpaceDN w:val="0"/>
@@ -2089,35 +1900,15 @@
           <w:rFonts w:ascii="Arial" w:hAnsi="Arial" w:cs="Arial"/>
           <w:sz w:val="22"/>
           <w:szCs w:val="22"/>
-          <w:shd w:val="clear" w:color="auto" w:fill="FAF9F8"/>
-        </w:rPr>
-      </w:pPr>
-      <w:r>
-        <w:rPr>
-          <w:rFonts w:ascii="Arial" w:hAnsi="Arial" w:cs="Arial"/>
-          <w:sz w:val="22"/>
-          <w:szCs w:val="22"/>
-          <w:shd w:val="clear" w:color="auto" w:fill="FAF9F8"/>
-        </w:rPr>
-        <w:t>Medidas</w:t>
-      </w:r>
-      <w:r>
-        <w:rPr>
-          <w:rFonts w:ascii="Arial" w:hAnsi="Arial" w:cs="Arial"/>
-          <w:sz w:val="22"/>
-          <w:szCs w:val="22"/>
-          <w:shd w:val="clear" w:color="auto" w:fill="FAF9F8"/>
-        </w:rPr>
-        <w:t xml:space="preserve"> </w:t>
-      </w:r>
-      <w:r>
-        <w:rPr>
-          <w:rFonts w:ascii="Arial" w:hAnsi="Arial" w:cs="Arial"/>
-          <w:sz w:val="22"/>
-          <w:szCs w:val="22"/>
-          <w:shd w:val="clear" w:color="auto" w:fill="FAF9F8"/>
-        </w:rPr>
-        <w:t xml:space="preserve">a fin de garantizar el cumplimiento de las obligaciones asumidas por nuestro país en el Convenio de Cooperación Aduanera con Colombia, dictada por Decreto Supremo </w:t>
+        </w:rPr>
+      </w:pPr>
+      <w:r>
+        <w:rPr>
+          <w:rFonts w:ascii="Arial" w:hAnsi="Arial" w:cs="Arial"/>
+          <w:sz w:val="22"/>
+          <w:szCs w:val="22"/>
+        </w:rPr>
+        <w:t xml:space="preserve">Medidas a fin de garantizar el cumplimiento de las obligaciones asumidas por nuestro país en el Convenio de Cooperación Aduanera con Colombia, dictada por Decreto Supremo </w:t>
       </w:r>
       <w:proofErr w:type="spellStart"/>
       <w:r>
@@ -2125,7 +1916,6 @@
           <w:rFonts w:ascii="Arial" w:hAnsi="Arial" w:cs="Arial"/>
           <w:sz w:val="22"/>
           <w:szCs w:val="22"/>
-          <w:shd w:val="clear" w:color="auto" w:fill="FAF9F8"/>
         </w:rPr>
         <w:t>n</w:t>
       </w:r>
@@ -2134,7 +1924,6 @@
           <w:rFonts w:ascii="Arial" w:hAnsi="Arial" w:cs="Arial"/>
           <w:sz w:val="22"/>
           <w:szCs w:val="22"/>
-          <w:shd w:val="clear" w:color="auto" w:fill="FAF9F8"/>
         </w:rPr>
         <w:t>.°</w:t>
       </w:r>
@@ -2144,7 +1933,6 @@
           <w:rFonts w:ascii="Arial" w:hAnsi="Arial" w:cs="Arial"/>
           <w:sz w:val="22"/>
           <w:szCs w:val="22"/>
-          <w:shd w:val="clear" w:color="auto" w:fill="FAF9F8"/>
         </w:rPr>
         <w:t xml:space="preserve"> 15-94-EF, publicado el 09.02.1994, y modificatorias.</w:t>
       </w:r>
@@ -2152,8 +1940,8 @@
     <w:p>
       <w:pPr>
         <w:numPr>
-          <w:ilvl w:val="1"/>
-          <w:numId w:val="21"/>
+          <w:ilvl w:val="0"/>
+          <w:numId w:val="17"/>
         </w:numPr>
         <w:autoSpaceDE w:val="0"/>
         <w:autoSpaceDN w:val="0"/>
@@ -2165,26 +1953,15 @@
           <w:rFonts w:ascii="Arial" w:hAnsi="Arial" w:cs="Arial"/>
           <w:sz w:val="22"/>
           <w:szCs w:val="22"/>
-          <w:shd w:val="clear" w:color="auto" w:fill="FAF9F8"/>
-        </w:rPr>
-      </w:pPr>
-      <w:r>
-        <w:rPr>
-          <w:rFonts w:ascii="Arial" w:hAnsi="Arial" w:cs="Arial"/>
-          <w:sz w:val="22"/>
-          <w:szCs w:val="22"/>
-          <w:shd w:val="clear" w:color="auto" w:fill="FAF9F8"/>
-        </w:rPr>
-        <w:t xml:space="preserve">Arancel </w:t>
-      </w:r>
-      <w:r>
-        <w:rPr>
-          <w:rFonts w:ascii="Arial" w:hAnsi="Arial" w:cs="Arial"/>
-          <w:sz w:val="22"/>
-          <w:szCs w:val="22"/>
-          <w:shd w:val="clear" w:color="auto" w:fill="FAF9F8"/>
-        </w:rPr>
-        <w:t>Común Anexo al Protocolo Modificatorio del Convenio de Cooperación Aduanera Peruano-</w:t>
+        </w:rPr>
+      </w:pPr>
+      <w:r>
+        <w:rPr>
+          <w:rFonts w:ascii="Arial" w:hAnsi="Arial" w:cs="Arial"/>
+          <w:sz w:val="22"/>
+          <w:szCs w:val="22"/>
+        </w:rPr>
+        <w:t>Arancel Común Anexo al Protocolo Modificatorio del Convenio de Cooperación Aduanera Peruano-</w:t>
       </w:r>
       <w:proofErr w:type="gramStart"/>
       <w:r>
@@ -2192,7 +1969,6 @@
           <w:rFonts w:ascii="Arial" w:hAnsi="Arial" w:cs="Arial"/>
           <w:sz w:val="22"/>
           <w:szCs w:val="22"/>
-          <w:shd w:val="clear" w:color="auto" w:fill="FAF9F8"/>
         </w:rPr>
         <w:t>Colombiano</w:t>
       </w:r>
@@ -2202,7 +1978,6 @@
           <w:rFonts w:ascii="Arial" w:hAnsi="Arial" w:cs="Arial"/>
           <w:sz w:val="22"/>
           <w:szCs w:val="22"/>
-          <w:shd w:val="clear" w:color="auto" w:fill="FAF9F8"/>
         </w:rPr>
         <w:t xml:space="preserve"> de 1938, puesto en vigencia por el Decreto Supremo </w:t>
       </w:r>
@@ -2212,7 +1987,6 @@
           <w:rFonts w:ascii="Arial" w:hAnsi="Arial" w:cs="Arial"/>
           <w:sz w:val="22"/>
           <w:szCs w:val="22"/>
-          <w:shd w:val="clear" w:color="auto" w:fill="FAF9F8"/>
         </w:rPr>
         <w:t>n</w:t>
       </w:r>
@@ -2221,7 +1995,6 @@
           <w:rFonts w:ascii="Arial" w:hAnsi="Arial" w:cs="Arial"/>
           <w:sz w:val="22"/>
           <w:szCs w:val="22"/>
-          <w:shd w:val="clear" w:color="auto" w:fill="FAF9F8"/>
         </w:rPr>
         <w:t>.</w:t>
       </w:r>
@@ -2230,7 +2003,6 @@
           <w:rFonts w:ascii="Arial" w:hAnsi="Arial" w:cs="Arial"/>
           <w:sz w:val="22"/>
           <w:szCs w:val="22"/>
-          <w:shd w:val="clear" w:color="auto" w:fill="FAF9F8"/>
         </w:rPr>
         <w:t>°</w:t>
       </w:r>
@@ -2240,7 +2012,6 @@
           <w:rFonts w:ascii="Arial" w:hAnsi="Arial" w:cs="Arial"/>
           <w:sz w:val="22"/>
           <w:szCs w:val="22"/>
-          <w:shd w:val="clear" w:color="auto" w:fill="FAF9F8"/>
         </w:rPr>
         <w:t xml:space="preserve"> 069-82-EFC, publicado el 04.03.1982, y modificatorias</w:t>
       </w:r>
@@ -2248,8 +2019,8 @@
     <w:p>
       <w:pPr>
         <w:numPr>
-          <w:ilvl w:val="1"/>
-          <w:numId w:val="21"/>
+          <w:ilvl w:val="0"/>
+          <w:numId w:val="17"/>
         </w:numPr>
         <w:autoSpaceDE w:val="0"/>
         <w:autoSpaceDN w:val="0"/>
@@ -2269,7 +2040,6 @@
           <w:rFonts w:ascii="Arial" w:hAnsi="Arial" w:cs="Arial"/>
           <w:sz w:val="22"/>
           <w:szCs w:val="22"/>
-          <w:shd w:val="clear" w:color="auto" w:fill="FAF9F8"/>
         </w:rPr>
         <w:t xml:space="preserve">Resolución Superintendencia </w:t>
       </w:r>
@@ -2279,7 +2049,6 @@
           <w:rFonts w:ascii="Arial" w:hAnsi="Arial" w:cs="Arial"/>
           <w:sz w:val="22"/>
           <w:szCs w:val="22"/>
-          <w:shd w:val="clear" w:color="auto" w:fill="FAF9F8"/>
         </w:rPr>
         <w:t>n</w:t>
       </w:r>
@@ -2288,7 +2057,6 @@
           <w:rFonts w:ascii="Arial" w:hAnsi="Arial" w:cs="Arial"/>
           <w:sz w:val="22"/>
           <w:szCs w:val="22"/>
-          <w:shd w:val="clear" w:color="auto" w:fill="FAF9F8"/>
         </w:rPr>
         <w:t>.</w:t>
       </w:r>
@@ -2297,7 +2065,6 @@
           <w:rFonts w:ascii="Arial" w:hAnsi="Arial" w:cs="Arial"/>
           <w:sz w:val="22"/>
           <w:szCs w:val="22"/>
-          <w:shd w:val="clear" w:color="auto" w:fill="FAF9F8"/>
         </w:rPr>
         <w:t>°</w:t>
       </w:r>
@@ -2307,7 +2074,6 @@
           <w:rFonts w:ascii="Arial" w:hAnsi="Arial" w:cs="Arial"/>
           <w:sz w:val="22"/>
           <w:szCs w:val="22"/>
-          <w:shd w:val="clear" w:color="auto" w:fill="FAF9F8"/>
         </w:rPr>
         <w:t xml:space="preserve"> 248-2025/SUNAT - Procedimiento Especifico DESPA-PE.01.13 (versión 3) Importación De Mercancías Sujetas Al Protocolo Modificatorio Del Convenio De Cooperación Aduanera Peruano-</w:t>
       </w:r>
@@ -2317,7 +2083,6 @@
           <w:rFonts w:ascii="Arial" w:hAnsi="Arial" w:cs="Arial"/>
           <w:sz w:val="22"/>
           <w:szCs w:val="22"/>
-          <w:shd w:val="clear" w:color="auto" w:fill="FAF9F8"/>
         </w:rPr>
         <w:t>Colombiano</w:t>
       </w:r>
@@ -3273,7 +3038,6 @@
           <w:rFonts w:ascii="Arial" w:hAnsi="Arial" w:cs="Arial"/>
           <w:sz w:val="22"/>
           <w:szCs w:val="22"/>
-          <w:shd w:val="clear" w:color="auto" w:fill="FAF9F8"/>
         </w:rPr>
         <w:t>El</w:t>
       </w:r>
@@ -3283,7 +3047,6 @@
           <w:rFonts w:ascii="Arial" w:hAnsi="Arial" w:cs="Arial"/>
           <w:sz w:val="22"/>
           <w:szCs w:val="22"/>
-          <w:shd w:val="clear" w:color="auto" w:fill="FAF9F8"/>
         </w:rPr>
         <w:t xml:space="preserve"> </w:t>
       </w:r>
@@ -3590,7 +3353,6 @@
           <w:rFonts w:ascii="Arial" w:hAnsi="Arial" w:cs="Arial"/>
           <w:sz w:val="22"/>
           <w:szCs w:val="22"/>
-          <w:shd w:val="clear" w:color="auto" w:fill="FAF9F8"/>
         </w:rPr>
         <w:t>El</w:t>
       </w:r>
@@ -3600,7 +3362,6 @@
           <w:rFonts w:ascii="Arial" w:hAnsi="Arial" w:cs="Arial"/>
           <w:sz w:val="22"/>
           <w:szCs w:val="22"/>
-          <w:shd w:val="clear" w:color="auto" w:fill="FAF9F8"/>
         </w:rPr>
         <w:t xml:space="preserve"> </w:t>
       </w:r>
@@ -4148,7 +3909,6 @@
           <w:rFonts w:ascii="Arial" w:hAnsi="Arial" w:cs="Arial"/>
           <w:sz w:val="22"/>
           <w:szCs w:val="22"/>
-          <w:shd w:val="clear" w:color="auto" w:fill="FAF9F8"/>
         </w:rPr>
         <w:t xml:space="preserve">Con </w:t>
       </w:r>
@@ -6138,7 +5898,6 @@
           <w:szCs w:val="22"/>
         </w:rPr>
       </w:pPr>
-      <w:proofErr w:type="gramStart"/>
       <w:r>
         <w:rPr>
           <w:rFonts w:ascii="Arial" w:hAnsi="Arial" w:cs="Arial"/>
@@ -6146,16 +5905,7 @@
           <w:szCs w:val="22"/>
         </w:rPr>
         <w:lastRenderedPageBreak/>
-        <w:t>De acuerdo a</w:t>
-      </w:r>
-      <w:proofErr w:type="gramEnd"/>
-      <w:r>
-        <w:rPr>
-          <w:rFonts w:ascii="Arial" w:hAnsi="Arial" w:cs="Arial"/>
-          <w:sz w:val="22"/>
-          <w:szCs w:val="22"/>
-        </w:rPr>
-        <w:t xml:space="preserve"> lo requerido por la empresa importadora, se determina lo siguiente:</w:t>
+        <w:t>De acuerdo a lo requerido por la empresa importadora, se determina lo siguiente:</w:t>
       </w:r>
     </w:p>
     <w:p>
@@ -14723,7 +14473,7 @@
 </file>
 
 <file path=word/numbering.xml><?xml version="1.0" encoding="utf-8"?>
-<w:numbering xmlns:wpc="http://schemas.microsoft.com/office/word/2010/wordprocessingCanvas" xmlns:cx="http://schemas.microsoft.com/office/drawing/2014/chartex" xmlns:cx1="http://schemas.microsoft.com/office/drawing/2015/9/8/chartex" xmlns:cx2="http://schemas.microsoft.com/office/drawing/2015/10/21/chartex" xmlns:cx3="http://schemas.microsoft.com/office/drawing/2016/5/9/chartex" xmlns:cx4="http://schemas.microsoft.com/office/drawing/2016/5/10/chartex" xmlns:cx5="http://schemas.microsoft.com/office/drawing/2016/5/11/chartex" xmlns:cx6="http://schemas.microsoft.com/office/drawing/2016/5/12/chartex" xmlns:cx7="http://schemas.microsoft.com/office/drawing/2016/5/13/chartex" xmlns:cx8="http://schemas.microsoft.com/office/drawing/2016/5/14/chartex" xmlns:mc="http://schemas.openxmlformats.org/markup-compatibility/2006" xmlns:aink="http://schemas.microsoft.com/office/drawing/2016/ink" xmlns:am3d="http://schemas.microsoft.com/office/drawing/2017/model3d" xmlns:o="urn:schemas-microsoft-com:office:office" xmlns:oel="http://schemas.microsoft.com/office/2019/extlst" xmlns:r="http://schemas.openxmlformats.org/officeDocument/2006/relationships" xmlns:m="http://schemas.openxmlformats.org/officeDocument/2006/math" xmlns:v="urn:schemas-microsoft-com:vml" xmlns:wp14="http://schemas.microsoft.com/office/word/2010/wordprocessingDrawing" xmlns:wp="http://schemas.openxmlformats.org/drawingml/2006/wordprocessingDrawing" xmlns:w10="urn:schemas-microsoft-com:office:word" xmlns:w="http://schemas.openxmlformats.org/wordprocessingml/2006/main" xmlns:w14="http://schemas.microsoft.com/office/word/2010/wordml" xmlns:w15="http://schemas.microsoft.com/office/word/2012/wordml" xmlns:w16cex="http://schemas.microsoft.com/office/word/2018/wordml/cex" xmlns:w16cid="http://schemas.microsoft.com/office/word/2016/wordml/cid" xmlns:w16="http://schemas.microsoft.com/office/word/2018/wordml" xmlns:w16du="http://schemas.microsoft.com/office/word/2023/wordml/word16du" xmlns:w16sdtdh="http://schemas.microsoft.com/office/word/2020/wordml/sdtdatahash" xmlns:w16se="http://schemas.microsoft.com/office/word/2015/wordml/symex" xmlns:wpg="http://schemas.microsoft.com/office/word/2010/wordprocessingGroup" xmlns:wpi="http://schemas.microsoft.com/office/word/2010/wordprocessingInk" xmlns:wne="http://schemas.microsoft.com/office/word/2006/wordml" xmlns:wps="http://schemas.microsoft.com/office/word/2010/wordprocessingShape" mc:Ignorable="w14 w15 w16se w16cid w16 w16cex w16sdtdh w16du wp14">
+<w:numbering xmlns:wpc="http://schemas.microsoft.com/office/word/2010/wordprocessingCanvas" xmlns:cx="http://schemas.microsoft.com/office/drawing/2014/chartex" xmlns:cx1="http://schemas.microsoft.com/office/drawing/2015/9/8/chartex" xmlns:cx2="http://schemas.microsoft.com/office/drawing/2015/10/21/chartex" xmlns:cx3="http://schemas.microsoft.com/office/drawing/2016/5/9/chartex" xmlns:cx4="http://schemas.microsoft.com/office/drawing/2016/5/10/chartex" xmlns:cx5="http://schemas.microsoft.com/office/drawing/2016/5/11/chartex" xmlns:cx6="http://schemas.microsoft.com/office/drawing/2016/5/12/chartex" xmlns:cx7="http://schemas.microsoft.com/office/drawing/2016/5/13/chartex" xmlns:cx8="http://schemas.microsoft.com/office/drawing/2016/5/14/chartex" xmlns:mc="http://schemas.openxmlformats.org/markup-compatibility/2006" xmlns:aink="http://schemas.microsoft.com/office/drawing/2016/ink" xmlns:am3d="http://schemas.microsoft.com/office/drawing/2017/model3d" xmlns:o="urn:schemas-microsoft-com:office:office" xmlns:oel="http://schemas.microsoft.com/office/2019/extlst" xmlns:r="http://schemas.openxmlformats.org/officeDocument/2006/relationships" xmlns:m="http://schemas.openxmlformats.org/officeDocument/2006/math" xmlns:v="urn:schemas-microsoft-com:vml" xmlns:wp14="http://schemas.microsoft.com/office/word/2010/wordprocessingDrawing" xmlns:wp="http://schemas.openxmlformats.org/drawingml/2006/wordprocessingDrawing" xmlns:w10="urn:schemas-microsoft-com:office:word" xmlns:w="http://schemas.openxmlformats.org/wordprocessingml/2006/main" xmlns:w14="http://schemas.microsoft.com/office/word/2010/wordml" xmlns:w15="http://schemas.microsoft.com/office/word/2012/wordml" xmlns:w16cex="http://schemas.microsoft.com/office/word/2018/wordml/cex" xmlns:w16cid="http://schemas.microsoft.com/office/word/2016/wordml/cid" xmlns:w16="http://schemas.microsoft.com/office/word/2018/wordml" xmlns:w16sdtdh="http://schemas.microsoft.com/office/word/2020/wordml/sdtdatahash" xmlns:w16se="http://schemas.microsoft.com/office/word/2015/wordml/symex" xmlns:wpg="http://schemas.microsoft.com/office/word/2010/wordprocessingGroup" xmlns:wpi="http://schemas.microsoft.com/office/word/2010/wordprocessingInk" xmlns:wne="http://schemas.microsoft.com/office/word/2006/wordml" xmlns:wps="http://schemas.microsoft.com/office/word/2010/wordprocessingShape" mc:Ignorable="w14 w15 w16se w16cid w16 w16cex w16sdtdh wp14">
   <w:abstractNum w:abstractNumId="0" w15:restartNumberingAfterBreak="0">
     <w:nsid w:val="0F643300"/>
     <w:multiLevelType w:val="hybridMultilevel"/>
@@ -16974,7 +16724,7 @@
 </file>
 
 <file path=word/styles.xml><?xml version="1.0" encoding="utf-8"?>
-<w:styles xmlns:mc="http://schemas.openxmlformats.org/markup-compatibility/2006" xmlns:r="http://schemas.openxmlformats.org/officeDocument/2006/relationships" xmlns:w="http://schemas.openxmlformats.org/wordprocessingml/2006/main" xmlns:w14="http://schemas.microsoft.com/office/word/2010/wordml" xmlns:w15="http://schemas.microsoft.com/office/word/2012/wordml" xmlns:w16cex="http://schemas.microsoft.com/office/word/2018/wordml/cex" xmlns:w16cid="http://schemas.microsoft.com/office/word/2016/wordml/cid" xmlns:w16="http://schemas.microsoft.com/office/word/2018/wordml" xmlns:w16du="http://schemas.microsoft.com/office/word/2023/wordml/word16du" xmlns:w16sdtdh="http://schemas.microsoft.com/office/word/2020/wordml/sdtdatahash" xmlns:w16se="http://schemas.microsoft.com/office/word/2015/wordml/symex" mc:Ignorable="w14 w15 w16se w16cid w16 w16cex w16sdtdh w16du">
+<w:styles xmlns:mc="http://schemas.openxmlformats.org/markup-compatibility/2006" xmlns:r="http://schemas.openxmlformats.org/officeDocument/2006/relationships" xmlns:w="http://schemas.openxmlformats.org/wordprocessingml/2006/main" xmlns:w14="http://schemas.microsoft.com/office/word/2010/wordml" xmlns:w15="http://schemas.microsoft.com/office/word/2012/wordml" xmlns:w16cex="http://schemas.microsoft.com/office/word/2018/wordml/cex" xmlns:w16cid="http://schemas.microsoft.com/office/word/2016/wordml/cid" xmlns:w16="http://schemas.microsoft.com/office/word/2018/wordml" xmlns:w16sdtdh="http://schemas.microsoft.com/office/word/2020/wordml/sdtdatahash" xmlns:w16se="http://schemas.microsoft.com/office/word/2015/wordml/symex" mc:Ignorable="w14 w15 w16se w16cid w16 w16cex w16sdtdh">
   <w:docDefaults>
     <w:rPrDefault>
       <w:rPr>

</xml_diff>